<commit_message>
Insert advanced RAG sections (Query Rewriting, Graph RAG, Active Retrieval, Dynamic Profiling) into raw Vietnamese document
</commit_message>
<xml_diff>
--- a/bao_cao_nghien_cuu_RAG_hoan_chinh_tieng_viet.docx
+++ b/bao_cao_nghien_cuu_RAG_hoan_chinh_tieng_viet.docx
@@ -11813,6 +11813,32 @@
           <w:sz w:val="20"/>
         </w:rPr>
         <w:t xml:space="preserve"> (Round-Robin) qua 6 API Keys [7].</w:t>
+      </w:r>
+    </w:p>
+    <w:p>
+      <w:r>
+        <w:rPr>
+          <w:b/>
+        </w:rPr>
+        <w:t>2.1.1. Tiền xử lý và Chuẩn hóa Truy vấn Học sinh (Query Refinement)</w:t>
+      </w:r>
+    </w:p>
+    <w:p>
+      <w:r>
+        <w:t>Quy trình xử lý bắt đầu bằng bước chuẩn hóa truy vấn thô của học sinh (User Raw Query). Do đặc thù tâm sinh lý lứa tuổi học sinh K-12, các truy vấn thường chứa lỗi chính tả, cách viết tắt phi chuẩn hoặc diễn đạt mơ hồ. Để giải quyết hạn chế này, chúng tôi tích hợp bộ lọc tinh chỉnh câu hỏi (Query Refiner) sử dụng mô hình ngôn ngữ lớn cục bộ. Mô hình này đóng vai trò một biên dịch viên học thuật, thực hiện sửa lỗi chính tả, bổ sung các ngữ cảnh môn học bị thiếu và viết lại truy vấn dưới dạng câu lệnh tìm kiếm ngữ nghĩa chuẩn hóa (Standardized Semantic Query). Ví dụ, một câu hỏi viết tắt như "tinh x^2 lop 8" sẽ được tự động cấu trúc lại thành "Phương pháp phân tích đa thức thành nhân tử và các phép toán liên quan đến lũy thừa bậc hai trong chương trình Toán học lớp 8". Kỹ thuật này giúp bộ tìm kiếm lai (Hybrid Search) tiếp theo đạt được độ khớp từ khóa và độ tương đồng ngữ nghĩa tối ưu hơn.</w:t>
+      </w:r>
+    </w:p>
+    <w:p>
+      <w:r>
+        <w:rPr>
+          <w:b/>
+        </w:rPr>
+        <w:t>2.1.2. Tích hợp Đồ thị Tri thức Phân cấp Học tập (Graph RAG)</w:t>
+      </w:r>
+    </w:p>
+    <w:p>
+      <w:r>
+        <w:t>Nhằm bảo toàn cấu trúc logic và mối quan hệ ràng buộc giữa các bài học trong chương trình giáo dục K-12, chúng tôi đề xuất tích hợp mô hình đồ thị tri thức phân cấp (Graph RAG). Trái với phương pháp RAG truyền thống vốn chỉ xử lý văn bản dưới dạng các mảnh tách biệt, Graph RAG cấu trúc các chủ đề sách giáo khoa thành các nút (Nodes) và mối quan hệ tiền đề - hệ quả (Prerequisite Edges). Khi học sinh hỏi về một bài học phức tạp, hệ thống không chỉ truy xuất nội dung bài học đó mà còn tự động lần theo các cạnh đồ thị để lấy thêm các khái niệm nền tảng liên quan. Cơ chế này đóng vai trò quan trọng trong việc hỗ trợ phương pháp sư phạm gợi mở (Scaffolding), giúp AI biết cách dẫn dắt học sinh từ những kiến thức căn bản nhất.</w:t>
       </w:r>
     </w:p>
     <w:p>
@@ -18666,6 +18692,11 @@
           <w:sz w:val="20"/>
         </w:rPr>
         <w:t xml:space="preserve"> [8].</w:t>
+      </w:r>
+    </w:p>
+    <w:p>
+      <w:r>
+        <w:t>Bên cạnh đó, để cá nhân hóa hoàn toàn tiến trình hướng dẫn, hệ thống xây dựng hồ sơ năng lực động của học sinh (Dynamic Student Profiling). Một bộ quản lý trạng thái (State Manager) sẽ liên tục ghi nhận lịch sử câu trả lời của từng học sinh. Nếu học sinh thể hiện tư duy tốt thông qua các câu trả lời đúng liên tục, AI sẽ tự động giảm bớt mức độ gợi ý trực tiếp (tăng độ khó của câu hỏi gợi mở). Ngược lại, nếu học sinh gặp bế tắc, hệ thống sẽ điều chỉnh mức độ giàn giáo sư phạm (scaffolding) để đưa ra các gợi ý chi tiết và trực quan hơn, đảm bảo tiến trình học tập luôn nằm trong Vùng phát triển gần nhất (ZPD).</w:t>
       </w:r>
     </w:p>
     <w:p>
@@ -23230,6 +23261,19 @@
           <w:sz w:val="20"/>
         </w:rPr>
         <w:t xml:space="preserve"> [12].</w:t>
+      </w:r>
+    </w:p>
+    <w:p>
+      <w:r>
+        <w:rPr>
+          <w:b/>
+        </w:rPr>
+        <w:t>2.3.3. Cơ chế Truy xuất Chủ động Tuần hoàn (Active &amp; Iterative Retrieval)</w:t>
+      </w:r>
+    </w:p>
+    <w:p>
+      <w:r>
+        <w:t>Để ngăn chặn triệt để hiện tượng phản hồi sai lệch khi sách giáo khoa không chứa trực tiếp câu trả lời của học sinh, hệ thống đề xuất cơ chế truy xuất chủ động tuần hoàn (Active &amp; Iterative Retrieval). Sau bước tái xếp hạng bằng BGE-Reranker-Large, điểm tương đồng ngữ nghĩa (Similarity Score) của các phân đoạn tài liệu sẽ được đánh giá dựa trên một ngưỡng tin cậy tối thiểu (quy định là tau = 0.65). Nếu điểm số của mảnh tài liệu cao nhất không đạt ngưỡng này, hệ thống sẽ từ chối đưa trực tiếp vào LLM. Thay vào đó, một vòng lặp truy xuất phụ sẽ được kích hoạt: hệ thống tự động sinh các từ khóa đồng nghĩa (Synonym Expansion), nới lỏng giới hạn bộ lọc lớp học hoặc mở rộng tìm kiếm sang các chương học liên quan để tìm kiếm lại. Quá trình này lặp lại tối đa 3 chu kỳ cho đến khi tìm được ngữ cảnh đạt ngưỡng tin cậy, giúp nâng cao đáng kể chỉ số Recall của hệ thống.</w:t>
       </w:r>
     </w:p>
     <w:p>

</xml_diff>

<commit_message>
Restructure Section 2.3 into subheadings 2.3.1 (Hybrid Search), 2.3.2 (Reranking), and 2.3.3 (Active Retrieval)
</commit_message>
<xml_diff>
--- a/bao_cao_nghien_cuu_RAG_hoan_chinh_tieng_viet.docx
+++ b/bao_cao_nghien_cuu_RAG_hoan_chinh_tieng_viet.docx
@@ -18853,6 +18853,14 @@
           <w:b/>
         </w:rPr>
         <w:t xml:space="preserve"> (Hybrid Search &amp; Reranking)</w:t>
+      </w:r>
+    </w:p>
+    <w:p>
+      <w:r>
+        <w:rPr>
+          <w:b/>
+        </w:rPr>
+        <w:t>2.3.1. Thuật toán Tìm kiếm kết hợp (Hybrid Search &amp; RRF)</w:t>
       </w:r>
     </w:p>
     <w:p>
@@ -21663,6 +21671,14 @@
           <w:sz w:val="20"/>
         </w:rPr>
         <w:t>) [11].</w:t>
+      </w:r>
+    </w:p>
+    <w:p>
+      <w:r>
+        <w:rPr>
+          <w:b/>
+        </w:rPr>
+        <w:t>2.3.2. Mô hình Tái xếp hạng ngữ cảnh (BGE-Reranker-Large)</w:t>
       </w:r>
     </w:p>
     <w:p>

</xml_diff>

<commit_message>
Extend Section 1 (Introduction) with detailed prior research, K-12 Naive RAG limitations, and core scientific contributions
</commit_message>
<xml_diff>
--- a/bao_cao_nghien_cuu_RAG_hoan_chinh_tieng_viet.docx
+++ b/bao_cao_nghien_cuu_RAG_hoan_chinh_tieng_viet.docx
@@ -5315,1834 +5315,8 @@
       </w:r>
     </w:p>
     <w:p>
-      <w:pPr>
-        <w:spacing w:after="80" w:line="252" w:lineRule="auto"/>
-        <w:jc w:val="both"/>
-      </w:pPr>
-      <w:proofErr w:type="spellStart"/>
-      <w:r>
-        <w:rPr>
-          <w:rFonts w:ascii="Times New Roman" w:hAnsi="Times New Roman"/>
-          <w:sz w:val="20"/>
-        </w:rPr>
-        <w:lastRenderedPageBreak/>
-        <w:t>Mặc</w:t>
-      </w:r>
-      <w:proofErr w:type="spellEnd"/>
-      <w:r>
-        <w:rPr>
-          <w:rFonts w:ascii="Times New Roman" w:hAnsi="Times New Roman"/>
-          <w:sz w:val="20"/>
-        </w:rPr>
-        <w:t xml:space="preserve"> </w:t>
-      </w:r>
-      <w:proofErr w:type="spellStart"/>
-      <w:r>
-        <w:rPr>
-          <w:rFonts w:ascii="Times New Roman" w:hAnsi="Times New Roman"/>
-          <w:sz w:val="20"/>
-        </w:rPr>
-        <w:t>dù</w:t>
-      </w:r>
-      <w:proofErr w:type="spellEnd"/>
-      <w:r>
-        <w:rPr>
-          <w:rFonts w:ascii="Times New Roman" w:hAnsi="Times New Roman"/>
-          <w:sz w:val="20"/>
-        </w:rPr>
-        <w:t xml:space="preserve"> </w:t>
-      </w:r>
-      <w:proofErr w:type="spellStart"/>
-      <w:r>
-        <w:rPr>
-          <w:rFonts w:ascii="Times New Roman" w:hAnsi="Times New Roman"/>
-          <w:sz w:val="20"/>
-        </w:rPr>
-        <w:t>thể</w:t>
-      </w:r>
-      <w:proofErr w:type="spellEnd"/>
-      <w:r>
-        <w:rPr>
-          <w:rFonts w:ascii="Times New Roman" w:hAnsi="Times New Roman"/>
-          <w:sz w:val="20"/>
-        </w:rPr>
-        <w:t xml:space="preserve"> </w:t>
-      </w:r>
-      <w:proofErr w:type="spellStart"/>
-      <w:r>
-        <w:rPr>
-          <w:rFonts w:ascii="Times New Roman" w:hAnsi="Times New Roman"/>
-          <w:sz w:val="20"/>
-        </w:rPr>
-        <w:t>hiện</w:t>
-      </w:r>
-      <w:proofErr w:type="spellEnd"/>
-      <w:r>
-        <w:rPr>
-          <w:rFonts w:ascii="Times New Roman" w:hAnsi="Times New Roman"/>
-          <w:sz w:val="20"/>
-        </w:rPr>
-        <w:t xml:space="preserve"> </w:t>
-      </w:r>
-      <w:proofErr w:type="spellStart"/>
-      <w:r>
-        <w:rPr>
-          <w:rFonts w:ascii="Times New Roman" w:hAnsi="Times New Roman"/>
-          <w:sz w:val="20"/>
-        </w:rPr>
-        <w:t>năng</w:t>
-      </w:r>
-      <w:proofErr w:type="spellEnd"/>
-      <w:r>
-        <w:rPr>
-          <w:rFonts w:ascii="Times New Roman" w:hAnsi="Times New Roman"/>
-          <w:sz w:val="20"/>
-        </w:rPr>
-        <w:t xml:space="preserve"> </w:t>
-      </w:r>
-      <w:proofErr w:type="spellStart"/>
-      <w:r>
-        <w:rPr>
-          <w:rFonts w:ascii="Times New Roman" w:hAnsi="Times New Roman"/>
-          <w:sz w:val="20"/>
-        </w:rPr>
-        <w:t>lực</w:t>
-      </w:r>
-      <w:proofErr w:type="spellEnd"/>
-      <w:r>
-        <w:rPr>
-          <w:rFonts w:ascii="Times New Roman" w:hAnsi="Times New Roman"/>
-          <w:sz w:val="20"/>
-        </w:rPr>
-        <w:t xml:space="preserve"> </w:t>
-      </w:r>
-      <w:proofErr w:type="spellStart"/>
-      <w:r>
-        <w:rPr>
-          <w:rFonts w:ascii="Times New Roman" w:hAnsi="Times New Roman"/>
-          <w:sz w:val="20"/>
-        </w:rPr>
-        <w:t>tạo</w:t>
-      </w:r>
-      <w:proofErr w:type="spellEnd"/>
-      <w:r>
-        <w:rPr>
-          <w:rFonts w:ascii="Times New Roman" w:hAnsi="Times New Roman"/>
-          <w:sz w:val="20"/>
-        </w:rPr>
-        <w:t xml:space="preserve"> </w:t>
-      </w:r>
-      <w:proofErr w:type="spellStart"/>
-      <w:r>
-        <w:rPr>
-          <w:rFonts w:ascii="Times New Roman" w:hAnsi="Times New Roman"/>
-          <w:sz w:val="20"/>
-        </w:rPr>
-        <w:t>sinh</w:t>
-      </w:r>
-      <w:proofErr w:type="spellEnd"/>
-      <w:r>
-        <w:rPr>
-          <w:rFonts w:ascii="Times New Roman" w:hAnsi="Times New Roman"/>
-          <w:sz w:val="20"/>
-        </w:rPr>
-        <w:t xml:space="preserve"> </w:t>
-      </w:r>
-      <w:proofErr w:type="spellStart"/>
-      <w:r>
-        <w:rPr>
-          <w:rFonts w:ascii="Times New Roman" w:hAnsi="Times New Roman"/>
-          <w:sz w:val="20"/>
-        </w:rPr>
-        <w:t>ngôn</w:t>
-      </w:r>
-      <w:proofErr w:type="spellEnd"/>
-      <w:r>
-        <w:rPr>
-          <w:rFonts w:ascii="Times New Roman" w:hAnsi="Times New Roman"/>
-          <w:sz w:val="20"/>
-        </w:rPr>
-        <w:t xml:space="preserve"> </w:t>
-      </w:r>
-      <w:proofErr w:type="spellStart"/>
-      <w:r>
-        <w:rPr>
-          <w:rFonts w:ascii="Times New Roman" w:hAnsi="Times New Roman"/>
-          <w:sz w:val="20"/>
-        </w:rPr>
-        <w:t>ngữ</w:t>
-      </w:r>
-      <w:proofErr w:type="spellEnd"/>
-      <w:r>
-        <w:rPr>
-          <w:rFonts w:ascii="Times New Roman" w:hAnsi="Times New Roman"/>
-          <w:sz w:val="20"/>
-        </w:rPr>
-        <w:t xml:space="preserve"> </w:t>
-      </w:r>
-      <w:proofErr w:type="spellStart"/>
-      <w:r>
-        <w:rPr>
-          <w:rFonts w:ascii="Times New Roman" w:hAnsi="Times New Roman"/>
-          <w:sz w:val="20"/>
-        </w:rPr>
-        <w:t>vượt</w:t>
-      </w:r>
-      <w:proofErr w:type="spellEnd"/>
-      <w:r>
-        <w:rPr>
-          <w:rFonts w:ascii="Times New Roman" w:hAnsi="Times New Roman"/>
-          <w:sz w:val="20"/>
-        </w:rPr>
-        <w:t xml:space="preserve"> </w:t>
-      </w:r>
-      <w:proofErr w:type="spellStart"/>
-      <w:r>
-        <w:rPr>
-          <w:rFonts w:ascii="Times New Roman" w:hAnsi="Times New Roman"/>
-          <w:sz w:val="20"/>
-        </w:rPr>
-        <w:t>trội</w:t>
-      </w:r>
-      <w:proofErr w:type="spellEnd"/>
-      <w:r>
-        <w:rPr>
-          <w:rFonts w:ascii="Times New Roman" w:hAnsi="Times New Roman"/>
-          <w:sz w:val="20"/>
-        </w:rPr>
-        <w:t xml:space="preserve">, </w:t>
-      </w:r>
-      <w:proofErr w:type="spellStart"/>
-      <w:r>
-        <w:rPr>
-          <w:rFonts w:ascii="Times New Roman" w:hAnsi="Times New Roman"/>
-          <w:sz w:val="20"/>
-        </w:rPr>
-        <w:t>các</w:t>
-      </w:r>
-      <w:proofErr w:type="spellEnd"/>
-      <w:r>
-        <w:rPr>
-          <w:rFonts w:ascii="Times New Roman" w:hAnsi="Times New Roman"/>
-          <w:sz w:val="20"/>
-        </w:rPr>
-        <w:t xml:space="preserve"> LLM </w:t>
-      </w:r>
-      <w:proofErr w:type="spellStart"/>
-      <w:r>
-        <w:rPr>
-          <w:rFonts w:ascii="Times New Roman" w:hAnsi="Times New Roman"/>
-          <w:sz w:val="20"/>
-        </w:rPr>
-        <w:t>vẫn</w:t>
-      </w:r>
-      <w:proofErr w:type="spellEnd"/>
-      <w:r>
-        <w:rPr>
-          <w:rFonts w:ascii="Times New Roman" w:hAnsi="Times New Roman"/>
-          <w:sz w:val="20"/>
-        </w:rPr>
-        <w:t xml:space="preserve"> </w:t>
-      </w:r>
-      <w:proofErr w:type="spellStart"/>
-      <w:r>
-        <w:rPr>
-          <w:rFonts w:ascii="Times New Roman" w:hAnsi="Times New Roman"/>
-          <w:sz w:val="20"/>
-        </w:rPr>
-        <w:t>tồn</w:t>
-      </w:r>
-      <w:proofErr w:type="spellEnd"/>
-      <w:r>
-        <w:rPr>
-          <w:rFonts w:ascii="Times New Roman" w:hAnsi="Times New Roman"/>
-          <w:sz w:val="20"/>
-        </w:rPr>
-        <w:t xml:space="preserve"> </w:t>
-      </w:r>
-      <w:proofErr w:type="spellStart"/>
-      <w:r>
-        <w:rPr>
-          <w:rFonts w:ascii="Times New Roman" w:hAnsi="Times New Roman"/>
-          <w:sz w:val="20"/>
-        </w:rPr>
-        <w:t>tại</w:t>
-      </w:r>
-      <w:proofErr w:type="spellEnd"/>
-      <w:r>
-        <w:rPr>
-          <w:rFonts w:ascii="Times New Roman" w:hAnsi="Times New Roman"/>
-          <w:sz w:val="20"/>
-        </w:rPr>
-        <w:t xml:space="preserve"> </w:t>
-      </w:r>
-      <w:proofErr w:type="spellStart"/>
-      <w:r>
-        <w:rPr>
-          <w:rFonts w:ascii="Times New Roman" w:hAnsi="Times New Roman"/>
-          <w:sz w:val="20"/>
-        </w:rPr>
-        <w:t>điểm</w:t>
-      </w:r>
-      <w:proofErr w:type="spellEnd"/>
-      <w:r>
-        <w:rPr>
-          <w:rFonts w:ascii="Times New Roman" w:hAnsi="Times New Roman"/>
-          <w:sz w:val="20"/>
-        </w:rPr>
-        <w:t xml:space="preserve"> </w:t>
-      </w:r>
-      <w:proofErr w:type="spellStart"/>
-      <w:r>
-        <w:rPr>
-          <w:rFonts w:ascii="Times New Roman" w:hAnsi="Times New Roman"/>
-          <w:sz w:val="20"/>
-        </w:rPr>
-        <w:t>yếu</w:t>
-      </w:r>
-      <w:proofErr w:type="spellEnd"/>
-      <w:r>
-        <w:rPr>
-          <w:rFonts w:ascii="Times New Roman" w:hAnsi="Times New Roman"/>
-          <w:sz w:val="20"/>
-        </w:rPr>
-        <w:t xml:space="preserve"> </w:t>
-      </w:r>
-      <w:proofErr w:type="spellStart"/>
-      <w:r>
-        <w:rPr>
-          <w:rFonts w:ascii="Times New Roman" w:hAnsi="Times New Roman"/>
-          <w:sz w:val="20"/>
-        </w:rPr>
-        <w:t>cốt</w:t>
-      </w:r>
-      <w:proofErr w:type="spellEnd"/>
-      <w:r>
-        <w:rPr>
-          <w:rFonts w:ascii="Times New Roman" w:hAnsi="Times New Roman"/>
-          <w:sz w:val="20"/>
-        </w:rPr>
-        <w:t xml:space="preserve"> </w:t>
-      </w:r>
-      <w:proofErr w:type="spellStart"/>
-      <w:r>
-        <w:rPr>
-          <w:rFonts w:ascii="Times New Roman" w:hAnsi="Times New Roman"/>
-          <w:sz w:val="20"/>
-        </w:rPr>
-        <w:t>lõi</w:t>
-      </w:r>
-      <w:proofErr w:type="spellEnd"/>
-      <w:r>
-        <w:rPr>
-          <w:rFonts w:ascii="Times New Roman" w:hAnsi="Times New Roman"/>
-          <w:sz w:val="20"/>
-        </w:rPr>
-        <w:t xml:space="preserve"> </w:t>
-      </w:r>
-      <w:proofErr w:type="spellStart"/>
-      <w:r>
-        <w:rPr>
-          <w:rFonts w:ascii="Times New Roman" w:hAnsi="Times New Roman"/>
-          <w:sz w:val="20"/>
-        </w:rPr>
-        <w:t>là</w:t>
-      </w:r>
-      <w:proofErr w:type="spellEnd"/>
-      <w:r>
-        <w:rPr>
-          <w:rFonts w:ascii="Times New Roman" w:hAnsi="Times New Roman"/>
-          <w:sz w:val="20"/>
-        </w:rPr>
-        <w:t xml:space="preserve"> </w:t>
-      </w:r>
-      <w:proofErr w:type="spellStart"/>
-      <w:r>
-        <w:rPr>
-          <w:rFonts w:ascii="Times New Roman" w:hAnsi="Times New Roman"/>
-          <w:sz w:val="20"/>
-        </w:rPr>
-        <w:t>hiện</w:t>
-      </w:r>
-      <w:proofErr w:type="spellEnd"/>
-      <w:r>
-        <w:rPr>
-          <w:rFonts w:ascii="Times New Roman" w:hAnsi="Times New Roman"/>
-          <w:sz w:val="20"/>
-        </w:rPr>
-        <w:t xml:space="preserve"> </w:t>
-      </w:r>
-      <w:proofErr w:type="spellStart"/>
-      <w:r>
-        <w:rPr>
-          <w:rFonts w:ascii="Times New Roman" w:hAnsi="Times New Roman"/>
-          <w:sz w:val="20"/>
-        </w:rPr>
-        <w:t>tượng</w:t>
-      </w:r>
-      <w:proofErr w:type="spellEnd"/>
-      <w:r>
-        <w:rPr>
-          <w:rFonts w:ascii="Times New Roman" w:hAnsi="Times New Roman"/>
-          <w:sz w:val="20"/>
-        </w:rPr>
-        <w:t xml:space="preserve"> </w:t>
-      </w:r>
-      <w:proofErr w:type="spellStart"/>
-      <w:r>
-        <w:rPr>
-          <w:rFonts w:ascii="Times New Roman" w:hAnsi="Times New Roman"/>
-          <w:sz w:val="20"/>
-        </w:rPr>
-        <w:t>ảo</w:t>
-      </w:r>
-      <w:proofErr w:type="spellEnd"/>
-      <w:r>
-        <w:rPr>
-          <w:rFonts w:ascii="Times New Roman" w:hAnsi="Times New Roman"/>
-          <w:sz w:val="20"/>
-        </w:rPr>
-        <w:t xml:space="preserve"> </w:t>
-      </w:r>
-      <w:proofErr w:type="spellStart"/>
-      <w:r>
-        <w:rPr>
-          <w:rFonts w:ascii="Times New Roman" w:hAnsi="Times New Roman"/>
-          <w:sz w:val="20"/>
-        </w:rPr>
-        <w:t>tưởng</w:t>
-      </w:r>
-      <w:proofErr w:type="spellEnd"/>
-      <w:r>
-        <w:rPr>
-          <w:rFonts w:ascii="Times New Roman" w:hAnsi="Times New Roman"/>
-          <w:sz w:val="20"/>
-        </w:rPr>
-        <w:t xml:space="preserve"> tri </w:t>
-      </w:r>
-      <w:proofErr w:type="spellStart"/>
-      <w:r>
-        <w:rPr>
-          <w:rFonts w:ascii="Times New Roman" w:hAnsi="Times New Roman"/>
-          <w:sz w:val="20"/>
-        </w:rPr>
-        <w:t>thức</w:t>
-      </w:r>
-      <w:proofErr w:type="spellEnd"/>
-      <w:r>
-        <w:rPr>
-          <w:rFonts w:ascii="Times New Roman" w:hAnsi="Times New Roman"/>
-          <w:sz w:val="20"/>
-        </w:rPr>
-        <w:t xml:space="preserve"> (hallucination), </w:t>
-      </w:r>
-      <w:proofErr w:type="spellStart"/>
-      <w:r>
-        <w:rPr>
-          <w:rFonts w:ascii="Times New Roman" w:hAnsi="Times New Roman"/>
-          <w:sz w:val="20"/>
-        </w:rPr>
-        <w:t>dẫn</w:t>
-      </w:r>
-      <w:proofErr w:type="spellEnd"/>
-      <w:r>
-        <w:rPr>
-          <w:rFonts w:ascii="Times New Roman" w:hAnsi="Times New Roman"/>
-          <w:sz w:val="20"/>
-        </w:rPr>
-        <w:t xml:space="preserve"> </w:t>
-      </w:r>
-      <w:proofErr w:type="spellStart"/>
-      <w:r>
-        <w:rPr>
-          <w:rFonts w:ascii="Times New Roman" w:hAnsi="Times New Roman"/>
-          <w:sz w:val="20"/>
-        </w:rPr>
-        <w:t>đến</w:t>
-      </w:r>
-      <w:proofErr w:type="spellEnd"/>
-      <w:r>
-        <w:rPr>
-          <w:rFonts w:ascii="Times New Roman" w:hAnsi="Times New Roman"/>
-          <w:sz w:val="20"/>
-        </w:rPr>
-        <w:t xml:space="preserve"> </w:t>
-      </w:r>
-      <w:proofErr w:type="spellStart"/>
-      <w:r>
-        <w:rPr>
-          <w:rFonts w:ascii="Times New Roman" w:hAnsi="Times New Roman"/>
-          <w:sz w:val="20"/>
-        </w:rPr>
-        <w:t>việc</w:t>
-      </w:r>
-      <w:proofErr w:type="spellEnd"/>
-      <w:r>
-        <w:rPr>
-          <w:rFonts w:ascii="Times New Roman" w:hAnsi="Times New Roman"/>
-          <w:sz w:val="20"/>
-        </w:rPr>
-        <w:t xml:space="preserve"> </w:t>
-      </w:r>
-      <w:proofErr w:type="spellStart"/>
-      <w:r>
-        <w:rPr>
-          <w:rFonts w:ascii="Times New Roman" w:hAnsi="Times New Roman"/>
-          <w:sz w:val="20"/>
-        </w:rPr>
-        <w:t>sinh</w:t>
-      </w:r>
-      <w:proofErr w:type="spellEnd"/>
-      <w:r>
-        <w:rPr>
-          <w:rFonts w:ascii="Times New Roman" w:hAnsi="Times New Roman"/>
-          <w:sz w:val="20"/>
-        </w:rPr>
-        <w:t xml:space="preserve"> </w:t>
-      </w:r>
-      <w:proofErr w:type="spellStart"/>
-      <w:r>
-        <w:rPr>
-          <w:rFonts w:ascii="Times New Roman" w:hAnsi="Times New Roman"/>
-          <w:sz w:val="20"/>
-        </w:rPr>
-        <w:t>các</w:t>
-      </w:r>
-      <w:proofErr w:type="spellEnd"/>
-      <w:r>
-        <w:rPr>
-          <w:rFonts w:ascii="Times New Roman" w:hAnsi="Times New Roman"/>
-          <w:sz w:val="20"/>
-        </w:rPr>
-        <w:t xml:space="preserve"> </w:t>
-      </w:r>
-      <w:proofErr w:type="spellStart"/>
-      <w:r>
-        <w:rPr>
-          <w:rFonts w:ascii="Times New Roman" w:hAnsi="Times New Roman"/>
-          <w:sz w:val="20"/>
-        </w:rPr>
-        <w:t>thông</w:t>
-      </w:r>
-      <w:proofErr w:type="spellEnd"/>
-      <w:r>
-        <w:rPr>
-          <w:rFonts w:ascii="Times New Roman" w:hAnsi="Times New Roman"/>
-          <w:sz w:val="20"/>
-        </w:rPr>
-        <w:t xml:space="preserve"> tin phi </w:t>
-      </w:r>
-      <w:proofErr w:type="spellStart"/>
-      <w:r>
-        <w:rPr>
-          <w:rFonts w:ascii="Times New Roman" w:hAnsi="Times New Roman"/>
-          <w:sz w:val="20"/>
-        </w:rPr>
-        <w:t>thực</w:t>
-      </w:r>
-      <w:proofErr w:type="spellEnd"/>
-      <w:r>
-        <w:rPr>
-          <w:rFonts w:ascii="Times New Roman" w:hAnsi="Times New Roman"/>
-          <w:sz w:val="20"/>
-        </w:rPr>
-        <w:t xml:space="preserve"> </w:t>
-      </w:r>
-      <w:proofErr w:type="spellStart"/>
-      <w:r>
-        <w:rPr>
-          <w:rFonts w:ascii="Times New Roman" w:hAnsi="Times New Roman"/>
-          <w:sz w:val="20"/>
-        </w:rPr>
-        <w:t>tế</w:t>
-      </w:r>
-      <w:proofErr w:type="spellEnd"/>
-      <w:r>
-        <w:rPr>
-          <w:rFonts w:ascii="Times New Roman" w:hAnsi="Times New Roman"/>
-          <w:sz w:val="20"/>
-        </w:rPr>
-        <w:t xml:space="preserve"> </w:t>
-      </w:r>
-      <w:proofErr w:type="spellStart"/>
-      <w:r>
-        <w:rPr>
-          <w:rFonts w:ascii="Times New Roman" w:hAnsi="Times New Roman"/>
-          <w:sz w:val="20"/>
-        </w:rPr>
-        <w:t>hoặc</w:t>
-      </w:r>
-      <w:proofErr w:type="spellEnd"/>
-      <w:r>
-        <w:rPr>
-          <w:rFonts w:ascii="Times New Roman" w:hAnsi="Times New Roman"/>
-          <w:sz w:val="20"/>
-        </w:rPr>
-        <w:t xml:space="preserve"> </w:t>
-      </w:r>
-      <w:proofErr w:type="spellStart"/>
-      <w:r>
-        <w:rPr>
-          <w:rFonts w:ascii="Times New Roman" w:hAnsi="Times New Roman"/>
-          <w:sz w:val="20"/>
-        </w:rPr>
-        <w:t>sai</w:t>
-      </w:r>
-      <w:proofErr w:type="spellEnd"/>
-      <w:r>
-        <w:rPr>
-          <w:rFonts w:ascii="Times New Roman" w:hAnsi="Times New Roman"/>
-          <w:sz w:val="20"/>
-        </w:rPr>
-        <w:t xml:space="preserve"> </w:t>
-      </w:r>
-      <w:proofErr w:type="spellStart"/>
-      <w:r>
-        <w:rPr>
-          <w:rFonts w:ascii="Times New Roman" w:hAnsi="Times New Roman"/>
-          <w:sz w:val="20"/>
-        </w:rPr>
-        <w:t>lệch</w:t>
-      </w:r>
-      <w:proofErr w:type="spellEnd"/>
-      <w:r>
-        <w:rPr>
-          <w:rFonts w:ascii="Times New Roman" w:hAnsi="Times New Roman"/>
-          <w:sz w:val="20"/>
-        </w:rPr>
-        <w:t xml:space="preserve"> </w:t>
-      </w:r>
-      <w:proofErr w:type="spellStart"/>
-      <w:r>
-        <w:rPr>
-          <w:rFonts w:ascii="Times New Roman" w:hAnsi="Times New Roman"/>
-          <w:sz w:val="20"/>
-        </w:rPr>
-        <w:t>kiến</w:t>
-      </w:r>
-      <w:proofErr w:type="spellEnd"/>
-      <w:r>
-        <w:rPr>
-          <w:rFonts w:ascii="Times New Roman" w:hAnsi="Times New Roman"/>
-          <w:sz w:val="20"/>
-        </w:rPr>
-        <w:t xml:space="preserve"> </w:t>
-      </w:r>
-      <w:proofErr w:type="spellStart"/>
-      <w:r>
-        <w:rPr>
-          <w:rFonts w:ascii="Times New Roman" w:hAnsi="Times New Roman"/>
-          <w:sz w:val="20"/>
-        </w:rPr>
-        <w:t>thức</w:t>
-      </w:r>
-      <w:proofErr w:type="spellEnd"/>
-      <w:r>
-        <w:rPr>
-          <w:rFonts w:ascii="Times New Roman" w:hAnsi="Times New Roman"/>
-          <w:sz w:val="20"/>
-        </w:rPr>
-        <w:t xml:space="preserve"> khoa </w:t>
-      </w:r>
-      <w:proofErr w:type="spellStart"/>
-      <w:r>
-        <w:rPr>
-          <w:rFonts w:ascii="Times New Roman" w:hAnsi="Times New Roman"/>
-          <w:sz w:val="20"/>
-        </w:rPr>
-        <w:t>học</w:t>
-      </w:r>
-      <w:proofErr w:type="spellEnd"/>
-      <w:r>
-        <w:rPr>
-          <w:rFonts w:ascii="Times New Roman" w:hAnsi="Times New Roman"/>
-          <w:sz w:val="20"/>
-        </w:rPr>
-        <w:t xml:space="preserve"> </w:t>
-      </w:r>
-      <w:proofErr w:type="spellStart"/>
-      <w:r>
-        <w:rPr>
-          <w:rFonts w:ascii="Times New Roman" w:hAnsi="Times New Roman"/>
-          <w:sz w:val="20"/>
-        </w:rPr>
-        <w:t>chuẩn</w:t>
-      </w:r>
-      <w:proofErr w:type="spellEnd"/>
-      <w:r>
-        <w:rPr>
-          <w:rFonts w:ascii="Times New Roman" w:hAnsi="Times New Roman"/>
-          <w:sz w:val="20"/>
-        </w:rPr>
-        <w:t xml:space="preserve"> </w:t>
-      </w:r>
-      <w:proofErr w:type="spellStart"/>
-      <w:r>
-        <w:rPr>
-          <w:rFonts w:ascii="Times New Roman" w:hAnsi="Times New Roman"/>
-          <w:sz w:val="20"/>
-        </w:rPr>
-        <w:t>tắc</w:t>
-      </w:r>
-      <w:proofErr w:type="spellEnd"/>
-      <w:r>
-        <w:rPr>
-          <w:rFonts w:ascii="Times New Roman" w:hAnsi="Times New Roman"/>
-          <w:sz w:val="20"/>
-        </w:rPr>
-        <w:t xml:space="preserve"> [2, 5]. </w:t>
-      </w:r>
-      <w:proofErr w:type="spellStart"/>
-      <w:r>
-        <w:rPr>
-          <w:rFonts w:ascii="Times New Roman" w:hAnsi="Times New Roman"/>
-          <w:sz w:val="20"/>
-        </w:rPr>
-        <w:t>Để</w:t>
-      </w:r>
-      <w:proofErr w:type="spellEnd"/>
-      <w:r>
-        <w:rPr>
-          <w:rFonts w:ascii="Times New Roman" w:hAnsi="Times New Roman"/>
-          <w:sz w:val="20"/>
-        </w:rPr>
-        <w:t xml:space="preserve"> </w:t>
-      </w:r>
-      <w:proofErr w:type="spellStart"/>
-      <w:r>
-        <w:rPr>
-          <w:rFonts w:ascii="Times New Roman" w:hAnsi="Times New Roman"/>
-          <w:sz w:val="20"/>
-        </w:rPr>
-        <w:t>giải</w:t>
-      </w:r>
-      <w:proofErr w:type="spellEnd"/>
-      <w:r>
-        <w:rPr>
-          <w:rFonts w:ascii="Times New Roman" w:hAnsi="Times New Roman"/>
-          <w:sz w:val="20"/>
-        </w:rPr>
-        <w:t xml:space="preserve"> </w:t>
-      </w:r>
-      <w:proofErr w:type="spellStart"/>
-      <w:r>
-        <w:rPr>
-          <w:rFonts w:ascii="Times New Roman" w:hAnsi="Times New Roman"/>
-          <w:sz w:val="20"/>
-        </w:rPr>
-        <w:t>quyết</w:t>
-      </w:r>
-      <w:proofErr w:type="spellEnd"/>
-      <w:r>
-        <w:rPr>
-          <w:rFonts w:ascii="Times New Roman" w:hAnsi="Times New Roman"/>
-          <w:sz w:val="20"/>
-        </w:rPr>
-        <w:t xml:space="preserve"> </w:t>
-      </w:r>
-      <w:proofErr w:type="spellStart"/>
-      <w:r>
-        <w:rPr>
-          <w:rFonts w:ascii="Times New Roman" w:hAnsi="Times New Roman"/>
-          <w:sz w:val="20"/>
-        </w:rPr>
-        <w:t>hạn</w:t>
-      </w:r>
-      <w:proofErr w:type="spellEnd"/>
-      <w:r>
-        <w:rPr>
-          <w:rFonts w:ascii="Times New Roman" w:hAnsi="Times New Roman"/>
-          <w:sz w:val="20"/>
-        </w:rPr>
-        <w:t xml:space="preserve"> </w:t>
-      </w:r>
-      <w:proofErr w:type="spellStart"/>
-      <w:r>
-        <w:rPr>
-          <w:rFonts w:ascii="Times New Roman" w:hAnsi="Times New Roman"/>
-          <w:sz w:val="20"/>
-        </w:rPr>
-        <w:t>chế</w:t>
-      </w:r>
-      <w:proofErr w:type="spellEnd"/>
-      <w:r>
-        <w:rPr>
-          <w:rFonts w:ascii="Times New Roman" w:hAnsi="Times New Roman"/>
-          <w:sz w:val="20"/>
-        </w:rPr>
-        <w:t xml:space="preserve"> </w:t>
-      </w:r>
-      <w:proofErr w:type="spellStart"/>
-      <w:r>
-        <w:rPr>
-          <w:rFonts w:ascii="Times New Roman" w:hAnsi="Times New Roman"/>
-          <w:sz w:val="20"/>
-        </w:rPr>
-        <w:t>này</w:t>
-      </w:r>
-      <w:proofErr w:type="spellEnd"/>
-      <w:r>
-        <w:rPr>
-          <w:rFonts w:ascii="Times New Roman" w:hAnsi="Times New Roman"/>
-          <w:sz w:val="20"/>
-        </w:rPr>
-        <w:t xml:space="preserve">, </w:t>
-      </w:r>
-      <w:proofErr w:type="spellStart"/>
-      <w:r>
-        <w:rPr>
-          <w:rFonts w:ascii="Times New Roman" w:hAnsi="Times New Roman"/>
-          <w:sz w:val="20"/>
-        </w:rPr>
-        <w:t>kỹ</w:t>
-      </w:r>
-      <w:proofErr w:type="spellEnd"/>
-      <w:r>
-        <w:rPr>
-          <w:rFonts w:ascii="Times New Roman" w:hAnsi="Times New Roman"/>
-          <w:sz w:val="20"/>
-        </w:rPr>
-        <w:t xml:space="preserve"> </w:t>
-      </w:r>
-      <w:proofErr w:type="spellStart"/>
-      <w:r>
-        <w:rPr>
-          <w:rFonts w:ascii="Times New Roman" w:hAnsi="Times New Roman"/>
-          <w:sz w:val="20"/>
-        </w:rPr>
-        <w:t>thuật</w:t>
-      </w:r>
-      <w:proofErr w:type="spellEnd"/>
-      <w:r>
-        <w:rPr>
-          <w:rFonts w:ascii="Times New Roman" w:hAnsi="Times New Roman"/>
-          <w:sz w:val="20"/>
-        </w:rPr>
-        <w:t xml:space="preserve"> </w:t>
-      </w:r>
-      <w:proofErr w:type="spellStart"/>
-      <w:r>
-        <w:rPr>
-          <w:rFonts w:ascii="Times New Roman" w:hAnsi="Times New Roman"/>
-          <w:sz w:val="20"/>
-        </w:rPr>
-        <w:t>truy</w:t>
-      </w:r>
-      <w:proofErr w:type="spellEnd"/>
-      <w:r>
-        <w:rPr>
-          <w:rFonts w:ascii="Times New Roman" w:hAnsi="Times New Roman"/>
-          <w:sz w:val="20"/>
-        </w:rPr>
-        <w:t xml:space="preserve"> </w:t>
-      </w:r>
-      <w:proofErr w:type="spellStart"/>
-      <w:r>
-        <w:rPr>
-          <w:rFonts w:ascii="Times New Roman" w:hAnsi="Times New Roman"/>
-          <w:sz w:val="20"/>
-        </w:rPr>
-        <w:t>xuất</w:t>
-      </w:r>
-      <w:proofErr w:type="spellEnd"/>
-      <w:r>
-        <w:rPr>
-          <w:rFonts w:ascii="Times New Roman" w:hAnsi="Times New Roman"/>
-          <w:sz w:val="20"/>
-        </w:rPr>
-        <w:t xml:space="preserve"> </w:t>
-      </w:r>
-      <w:proofErr w:type="spellStart"/>
-      <w:r>
-        <w:rPr>
-          <w:rFonts w:ascii="Times New Roman" w:hAnsi="Times New Roman"/>
-          <w:sz w:val="20"/>
-        </w:rPr>
-        <w:t>tăng</w:t>
-      </w:r>
-      <w:proofErr w:type="spellEnd"/>
-      <w:r>
-        <w:rPr>
-          <w:rFonts w:ascii="Times New Roman" w:hAnsi="Times New Roman"/>
-          <w:sz w:val="20"/>
-        </w:rPr>
-        <w:t xml:space="preserve"> </w:t>
-      </w:r>
-      <w:proofErr w:type="spellStart"/>
-      <w:r>
-        <w:rPr>
-          <w:rFonts w:ascii="Times New Roman" w:hAnsi="Times New Roman"/>
-          <w:sz w:val="20"/>
-        </w:rPr>
-        <w:t>cường</w:t>
-      </w:r>
-      <w:proofErr w:type="spellEnd"/>
-      <w:r>
-        <w:rPr>
-          <w:rFonts w:ascii="Times New Roman" w:hAnsi="Times New Roman"/>
-          <w:sz w:val="20"/>
-        </w:rPr>
-        <w:t xml:space="preserve"> (RAG) </w:t>
-      </w:r>
-      <w:proofErr w:type="spellStart"/>
-      <w:r>
-        <w:rPr>
-          <w:rFonts w:ascii="Times New Roman" w:hAnsi="Times New Roman"/>
-          <w:sz w:val="20"/>
-        </w:rPr>
-        <w:t>thường</w:t>
-      </w:r>
-      <w:proofErr w:type="spellEnd"/>
-      <w:r>
-        <w:rPr>
-          <w:rFonts w:ascii="Times New Roman" w:hAnsi="Times New Roman"/>
-          <w:sz w:val="20"/>
-        </w:rPr>
-        <w:t xml:space="preserve"> </w:t>
-      </w:r>
-      <w:proofErr w:type="spellStart"/>
-      <w:r>
-        <w:rPr>
-          <w:rFonts w:ascii="Times New Roman" w:hAnsi="Times New Roman"/>
-          <w:sz w:val="20"/>
-        </w:rPr>
-        <w:t>được</w:t>
-      </w:r>
-      <w:proofErr w:type="spellEnd"/>
-      <w:r>
-        <w:rPr>
-          <w:rFonts w:ascii="Times New Roman" w:hAnsi="Times New Roman"/>
-          <w:sz w:val="20"/>
-        </w:rPr>
-        <w:t xml:space="preserve"> </w:t>
-      </w:r>
-      <w:proofErr w:type="spellStart"/>
-      <w:r>
-        <w:rPr>
-          <w:rFonts w:ascii="Times New Roman" w:hAnsi="Times New Roman"/>
-          <w:sz w:val="20"/>
-        </w:rPr>
-        <w:t>tích</w:t>
-      </w:r>
-      <w:proofErr w:type="spellEnd"/>
-      <w:r>
-        <w:rPr>
-          <w:rFonts w:ascii="Times New Roman" w:hAnsi="Times New Roman"/>
-          <w:sz w:val="20"/>
-        </w:rPr>
-        <w:t xml:space="preserve"> </w:t>
-      </w:r>
-      <w:proofErr w:type="spellStart"/>
-      <w:r>
-        <w:rPr>
-          <w:rFonts w:ascii="Times New Roman" w:hAnsi="Times New Roman"/>
-          <w:sz w:val="20"/>
-        </w:rPr>
-        <w:t>hợp</w:t>
-      </w:r>
-      <w:proofErr w:type="spellEnd"/>
-      <w:r>
-        <w:rPr>
-          <w:rFonts w:ascii="Times New Roman" w:hAnsi="Times New Roman"/>
-          <w:sz w:val="20"/>
-        </w:rPr>
-        <w:t xml:space="preserve"> </w:t>
-      </w:r>
-      <w:proofErr w:type="spellStart"/>
-      <w:r>
-        <w:rPr>
-          <w:rFonts w:ascii="Times New Roman" w:hAnsi="Times New Roman"/>
-          <w:sz w:val="20"/>
-        </w:rPr>
-        <w:t>nhằm</w:t>
-      </w:r>
-      <w:proofErr w:type="spellEnd"/>
-      <w:r>
-        <w:rPr>
-          <w:rFonts w:ascii="Times New Roman" w:hAnsi="Times New Roman"/>
-          <w:sz w:val="20"/>
-        </w:rPr>
-        <w:t xml:space="preserve"> neo </w:t>
-      </w:r>
-      <w:proofErr w:type="spellStart"/>
-      <w:r>
-        <w:rPr>
-          <w:rFonts w:ascii="Times New Roman" w:hAnsi="Times New Roman"/>
-          <w:sz w:val="20"/>
-        </w:rPr>
-        <w:t>câu</w:t>
-      </w:r>
-      <w:proofErr w:type="spellEnd"/>
-      <w:r>
-        <w:rPr>
-          <w:rFonts w:ascii="Times New Roman" w:hAnsi="Times New Roman"/>
-          <w:sz w:val="20"/>
-        </w:rPr>
-        <w:t xml:space="preserve"> </w:t>
-      </w:r>
-      <w:proofErr w:type="spellStart"/>
-      <w:r>
-        <w:rPr>
-          <w:rFonts w:ascii="Times New Roman" w:hAnsi="Times New Roman"/>
-          <w:sz w:val="20"/>
-        </w:rPr>
-        <w:t>trả</w:t>
-      </w:r>
-      <w:proofErr w:type="spellEnd"/>
-      <w:r>
-        <w:rPr>
-          <w:rFonts w:ascii="Times New Roman" w:hAnsi="Times New Roman"/>
-          <w:sz w:val="20"/>
-        </w:rPr>
-        <w:t xml:space="preserve"> </w:t>
-      </w:r>
-      <w:proofErr w:type="spellStart"/>
-      <w:r>
-        <w:rPr>
-          <w:rFonts w:ascii="Times New Roman" w:hAnsi="Times New Roman"/>
-          <w:sz w:val="20"/>
-        </w:rPr>
-        <w:t>lời</w:t>
-      </w:r>
-      <w:proofErr w:type="spellEnd"/>
-      <w:r>
-        <w:rPr>
-          <w:rFonts w:ascii="Times New Roman" w:hAnsi="Times New Roman"/>
-          <w:sz w:val="20"/>
-        </w:rPr>
-        <w:t xml:space="preserve"> </w:t>
-      </w:r>
-      <w:proofErr w:type="spellStart"/>
-      <w:r>
-        <w:rPr>
-          <w:rFonts w:ascii="Times New Roman" w:hAnsi="Times New Roman"/>
-          <w:sz w:val="20"/>
-        </w:rPr>
-        <w:t>của</w:t>
-      </w:r>
-      <w:proofErr w:type="spellEnd"/>
-      <w:r>
-        <w:rPr>
-          <w:rFonts w:ascii="Times New Roman" w:hAnsi="Times New Roman"/>
-          <w:sz w:val="20"/>
-        </w:rPr>
-        <w:t xml:space="preserve"> </w:t>
-      </w:r>
-      <w:proofErr w:type="spellStart"/>
-      <w:r>
-        <w:rPr>
-          <w:rFonts w:ascii="Times New Roman" w:hAnsi="Times New Roman"/>
-          <w:sz w:val="20"/>
-        </w:rPr>
-        <w:t>mô</w:t>
-      </w:r>
-      <w:proofErr w:type="spellEnd"/>
-      <w:r>
-        <w:rPr>
-          <w:rFonts w:ascii="Times New Roman" w:hAnsi="Times New Roman"/>
-          <w:sz w:val="20"/>
-        </w:rPr>
-        <w:t xml:space="preserve"> </w:t>
-      </w:r>
-      <w:proofErr w:type="spellStart"/>
-      <w:r>
-        <w:rPr>
-          <w:rFonts w:ascii="Times New Roman" w:hAnsi="Times New Roman"/>
-          <w:sz w:val="20"/>
-        </w:rPr>
-        <w:t>hình</w:t>
-      </w:r>
-      <w:proofErr w:type="spellEnd"/>
-      <w:r>
-        <w:rPr>
-          <w:rFonts w:ascii="Times New Roman" w:hAnsi="Times New Roman"/>
-          <w:sz w:val="20"/>
-        </w:rPr>
-        <w:t xml:space="preserve"> </w:t>
-      </w:r>
-      <w:proofErr w:type="spellStart"/>
-      <w:r>
-        <w:rPr>
-          <w:rFonts w:ascii="Times New Roman" w:hAnsi="Times New Roman"/>
-          <w:sz w:val="20"/>
-        </w:rPr>
-        <w:t>vào</w:t>
-      </w:r>
-      <w:proofErr w:type="spellEnd"/>
-      <w:r>
-        <w:rPr>
-          <w:rFonts w:ascii="Times New Roman" w:hAnsi="Times New Roman"/>
-          <w:sz w:val="20"/>
-        </w:rPr>
-        <w:t xml:space="preserve"> </w:t>
-      </w:r>
-      <w:proofErr w:type="spellStart"/>
-      <w:r>
-        <w:rPr>
-          <w:rFonts w:ascii="Times New Roman" w:hAnsi="Times New Roman"/>
-          <w:sz w:val="20"/>
-        </w:rPr>
-        <w:t>các</w:t>
-      </w:r>
-      <w:proofErr w:type="spellEnd"/>
-      <w:r>
-        <w:rPr>
-          <w:rFonts w:ascii="Times New Roman" w:hAnsi="Times New Roman"/>
-          <w:sz w:val="20"/>
-        </w:rPr>
-        <w:t xml:space="preserve"> </w:t>
-      </w:r>
-      <w:proofErr w:type="spellStart"/>
-      <w:r>
-        <w:rPr>
-          <w:rFonts w:ascii="Times New Roman" w:hAnsi="Times New Roman"/>
-          <w:sz w:val="20"/>
-        </w:rPr>
-        <w:t>nguồn</w:t>
-      </w:r>
-      <w:proofErr w:type="spellEnd"/>
-      <w:r>
-        <w:rPr>
-          <w:rFonts w:ascii="Times New Roman" w:hAnsi="Times New Roman"/>
-          <w:sz w:val="20"/>
-        </w:rPr>
-        <w:t xml:space="preserve"> tri </w:t>
-      </w:r>
-      <w:proofErr w:type="spellStart"/>
-      <w:r>
-        <w:rPr>
-          <w:rFonts w:ascii="Times New Roman" w:hAnsi="Times New Roman"/>
-          <w:sz w:val="20"/>
-        </w:rPr>
-        <w:t>thức</w:t>
-      </w:r>
-      <w:proofErr w:type="spellEnd"/>
-      <w:r>
-        <w:rPr>
-          <w:rFonts w:ascii="Times New Roman" w:hAnsi="Times New Roman"/>
-          <w:sz w:val="20"/>
-        </w:rPr>
-        <w:t xml:space="preserve"> </w:t>
-      </w:r>
-      <w:proofErr w:type="spellStart"/>
-      <w:r>
-        <w:rPr>
-          <w:rFonts w:ascii="Times New Roman" w:hAnsi="Times New Roman"/>
-          <w:sz w:val="20"/>
-        </w:rPr>
-        <w:t>chính</w:t>
-      </w:r>
-      <w:proofErr w:type="spellEnd"/>
-      <w:r>
-        <w:rPr>
-          <w:rFonts w:ascii="Times New Roman" w:hAnsi="Times New Roman"/>
-          <w:sz w:val="20"/>
-        </w:rPr>
-        <w:t xml:space="preserve"> </w:t>
-      </w:r>
-      <w:proofErr w:type="spellStart"/>
-      <w:r>
-        <w:rPr>
-          <w:rFonts w:ascii="Times New Roman" w:hAnsi="Times New Roman"/>
-          <w:sz w:val="20"/>
-        </w:rPr>
-        <w:t>thống</w:t>
-      </w:r>
-      <w:proofErr w:type="spellEnd"/>
-      <w:r>
-        <w:rPr>
-          <w:rFonts w:ascii="Times New Roman" w:hAnsi="Times New Roman"/>
-          <w:sz w:val="20"/>
-        </w:rPr>
-        <w:t xml:space="preserve"> </w:t>
-      </w:r>
-      <w:proofErr w:type="spellStart"/>
-      <w:r>
-        <w:rPr>
-          <w:rFonts w:ascii="Times New Roman" w:hAnsi="Times New Roman"/>
-          <w:sz w:val="20"/>
-        </w:rPr>
-        <w:t>đáng</w:t>
-      </w:r>
-      <w:proofErr w:type="spellEnd"/>
-      <w:r>
-        <w:rPr>
-          <w:rFonts w:ascii="Times New Roman" w:hAnsi="Times New Roman"/>
-          <w:sz w:val="20"/>
-        </w:rPr>
-        <w:t xml:space="preserve"> tin </w:t>
-      </w:r>
-      <w:proofErr w:type="spellStart"/>
-      <w:r>
-        <w:rPr>
-          <w:rFonts w:ascii="Times New Roman" w:hAnsi="Times New Roman"/>
-          <w:sz w:val="20"/>
-        </w:rPr>
-        <w:t>cậy</w:t>
-      </w:r>
-      <w:proofErr w:type="spellEnd"/>
-      <w:r>
-        <w:rPr>
-          <w:rFonts w:ascii="Times New Roman" w:hAnsi="Times New Roman"/>
-          <w:sz w:val="20"/>
-        </w:rPr>
-        <w:t xml:space="preserve"> [1, 2]. Tuy </w:t>
-      </w:r>
-      <w:proofErr w:type="spellStart"/>
-      <w:r>
-        <w:rPr>
-          <w:rFonts w:ascii="Times New Roman" w:hAnsi="Times New Roman"/>
-          <w:sz w:val="20"/>
-        </w:rPr>
-        <w:t>nhiên</w:t>
-      </w:r>
-      <w:proofErr w:type="spellEnd"/>
-      <w:r>
-        <w:rPr>
-          <w:rFonts w:ascii="Times New Roman" w:hAnsi="Times New Roman"/>
-          <w:sz w:val="20"/>
-        </w:rPr>
-        <w:t xml:space="preserve">, </w:t>
-      </w:r>
-      <w:proofErr w:type="spellStart"/>
-      <w:r>
-        <w:rPr>
-          <w:rFonts w:ascii="Times New Roman" w:hAnsi="Times New Roman"/>
-          <w:sz w:val="20"/>
-        </w:rPr>
-        <w:t>việc</w:t>
-      </w:r>
-      <w:proofErr w:type="spellEnd"/>
-      <w:r>
-        <w:rPr>
-          <w:rFonts w:ascii="Times New Roman" w:hAnsi="Times New Roman"/>
-          <w:sz w:val="20"/>
-        </w:rPr>
-        <w:t xml:space="preserve"> </w:t>
-      </w:r>
-      <w:proofErr w:type="spellStart"/>
-      <w:r>
-        <w:rPr>
-          <w:rFonts w:ascii="Times New Roman" w:hAnsi="Times New Roman"/>
-          <w:sz w:val="20"/>
-        </w:rPr>
-        <w:t>áp</w:t>
-      </w:r>
-      <w:proofErr w:type="spellEnd"/>
-      <w:r>
-        <w:rPr>
-          <w:rFonts w:ascii="Times New Roman" w:hAnsi="Times New Roman"/>
-          <w:sz w:val="20"/>
-        </w:rPr>
-        <w:t xml:space="preserve"> </w:t>
-      </w:r>
-      <w:proofErr w:type="spellStart"/>
-      <w:r>
-        <w:rPr>
-          <w:rFonts w:ascii="Times New Roman" w:hAnsi="Times New Roman"/>
-          <w:sz w:val="20"/>
-        </w:rPr>
-        <w:t>dụng</w:t>
-      </w:r>
-      <w:proofErr w:type="spellEnd"/>
-      <w:r>
-        <w:rPr>
-          <w:rFonts w:ascii="Times New Roman" w:hAnsi="Times New Roman"/>
-          <w:sz w:val="20"/>
-        </w:rPr>
-        <w:t xml:space="preserve"> </w:t>
-      </w:r>
-      <w:proofErr w:type="spellStart"/>
-      <w:r>
-        <w:rPr>
-          <w:rFonts w:ascii="Times New Roman" w:hAnsi="Times New Roman"/>
-          <w:sz w:val="20"/>
-        </w:rPr>
-        <w:t>mô</w:t>
-      </w:r>
-      <w:proofErr w:type="spellEnd"/>
-      <w:r>
-        <w:rPr>
-          <w:rFonts w:ascii="Times New Roman" w:hAnsi="Times New Roman"/>
-          <w:sz w:val="20"/>
-        </w:rPr>
-        <w:t xml:space="preserve"> </w:t>
-      </w:r>
-      <w:proofErr w:type="spellStart"/>
-      <w:r>
-        <w:rPr>
-          <w:rFonts w:ascii="Times New Roman" w:hAnsi="Times New Roman"/>
-          <w:sz w:val="20"/>
-        </w:rPr>
-        <w:t>hình</w:t>
-      </w:r>
-      <w:proofErr w:type="spellEnd"/>
-      <w:r>
-        <w:rPr>
-          <w:rFonts w:ascii="Times New Roman" w:hAnsi="Times New Roman"/>
-          <w:sz w:val="20"/>
-        </w:rPr>
-        <w:t xml:space="preserve"> RAG </w:t>
-      </w:r>
-      <w:proofErr w:type="spellStart"/>
-      <w:r>
-        <w:rPr>
-          <w:rFonts w:ascii="Times New Roman" w:hAnsi="Times New Roman"/>
-          <w:sz w:val="20"/>
-        </w:rPr>
-        <w:t>phẳng</w:t>
-      </w:r>
-      <w:proofErr w:type="spellEnd"/>
-      <w:r>
-        <w:rPr>
-          <w:rFonts w:ascii="Times New Roman" w:hAnsi="Times New Roman"/>
-          <w:sz w:val="20"/>
-        </w:rPr>
-        <w:t xml:space="preserve"> </w:t>
-      </w:r>
-      <w:proofErr w:type="spellStart"/>
-      <w:r>
-        <w:rPr>
-          <w:rFonts w:ascii="Times New Roman" w:hAnsi="Times New Roman"/>
-          <w:sz w:val="20"/>
-        </w:rPr>
-        <w:t>truyền</w:t>
-      </w:r>
-      <w:proofErr w:type="spellEnd"/>
-      <w:r>
-        <w:rPr>
-          <w:rFonts w:ascii="Times New Roman" w:hAnsi="Times New Roman"/>
-          <w:sz w:val="20"/>
-        </w:rPr>
-        <w:t xml:space="preserve"> </w:t>
-      </w:r>
-      <w:proofErr w:type="spellStart"/>
-      <w:r>
-        <w:rPr>
-          <w:rFonts w:ascii="Times New Roman" w:hAnsi="Times New Roman"/>
-          <w:sz w:val="20"/>
-        </w:rPr>
-        <w:t>thống</w:t>
-      </w:r>
-      <w:proofErr w:type="spellEnd"/>
-      <w:r>
-        <w:rPr>
-          <w:rFonts w:ascii="Times New Roman" w:hAnsi="Times New Roman"/>
-          <w:sz w:val="20"/>
-        </w:rPr>
-        <w:t xml:space="preserve"> (Naive RAG) </w:t>
-      </w:r>
-      <w:proofErr w:type="spellStart"/>
-      <w:r>
-        <w:rPr>
-          <w:rFonts w:ascii="Times New Roman" w:hAnsi="Times New Roman"/>
-          <w:sz w:val="20"/>
-        </w:rPr>
-        <w:t>vào</w:t>
-      </w:r>
-      <w:proofErr w:type="spellEnd"/>
-      <w:r>
-        <w:rPr>
-          <w:rFonts w:ascii="Times New Roman" w:hAnsi="Times New Roman"/>
-          <w:sz w:val="20"/>
-        </w:rPr>
-        <w:t xml:space="preserve"> </w:t>
-      </w:r>
-      <w:proofErr w:type="spellStart"/>
-      <w:r>
-        <w:rPr>
-          <w:rFonts w:ascii="Times New Roman" w:hAnsi="Times New Roman"/>
-          <w:sz w:val="20"/>
-        </w:rPr>
-        <w:t>học</w:t>
-      </w:r>
-      <w:proofErr w:type="spellEnd"/>
-      <w:r>
-        <w:rPr>
-          <w:rFonts w:ascii="Times New Roman" w:hAnsi="Times New Roman"/>
-          <w:sz w:val="20"/>
-        </w:rPr>
-        <w:t xml:space="preserve"> </w:t>
-      </w:r>
-      <w:proofErr w:type="spellStart"/>
-      <w:r>
-        <w:rPr>
-          <w:rFonts w:ascii="Times New Roman" w:hAnsi="Times New Roman"/>
-          <w:sz w:val="20"/>
-        </w:rPr>
-        <w:t>liệu</w:t>
-      </w:r>
-      <w:proofErr w:type="spellEnd"/>
-      <w:r>
-        <w:rPr>
-          <w:rFonts w:ascii="Times New Roman" w:hAnsi="Times New Roman"/>
-          <w:sz w:val="20"/>
-        </w:rPr>
-        <w:t xml:space="preserve"> K-12 </w:t>
-      </w:r>
-      <w:proofErr w:type="spellStart"/>
-      <w:r>
-        <w:rPr>
-          <w:rFonts w:ascii="Times New Roman" w:hAnsi="Times New Roman"/>
-          <w:sz w:val="20"/>
-        </w:rPr>
-        <w:t>thường</w:t>
-      </w:r>
-      <w:proofErr w:type="spellEnd"/>
-      <w:r>
-        <w:rPr>
-          <w:rFonts w:ascii="Times New Roman" w:hAnsi="Times New Roman"/>
-          <w:sz w:val="20"/>
-        </w:rPr>
-        <w:t xml:space="preserve"> </w:t>
-      </w:r>
-      <w:proofErr w:type="spellStart"/>
-      <w:r>
-        <w:rPr>
-          <w:rFonts w:ascii="Times New Roman" w:hAnsi="Times New Roman"/>
-          <w:sz w:val="20"/>
-        </w:rPr>
-        <w:t>gặp</w:t>
-      </w:r>
-      <w:proofErr w:type="spellEnd"/>
-      <w:r>
-        <w:rPr>
-          <w:rFonts w:ascii="Times New Roman" w:hAnsi="Times New Roman"/>
-          <w:sz w:val="20"/>
-        </w:rPr>
-        <w:t xml:space="preserve"> </w:t>
-      </w:r>
-      <w:proofErr w:type="spellStart"/>
-      <w:r>
-        <w:rPr>
-          <w:rFonts w:ascii="Times New Roman" w:hAnsi="Times New Roman"/>
-          <w:sz w:val="20"/>
-        </w:rPr>
-        <w:t>trở</w:t>
-      </w:r>
-      <w:proofErr w:type="spellEnd"/>
-      <w:r>
-        <w:rPr>
-          <w:rFonts w:ascii="Times New Roman" w:hAnsi="Times New Roman"/>
-          <w:sz w:val="20"/>
-        </w:rPr>
-        <w:t xml:space="preserve"> </w:t>
-      </w:r>
-      <w:proofErr w:type="spellStart"/>
-      <w:r>
-        <w:rPr>
-          <w:rFonts w:ascii="Times New Roman" w:hAnsi="Times New Roman"/>
-          <w:sz w:val="20"/>
-        </w:rPr>
-        <w:t>ngại</w:t>
-      </w:r>
-      <w:proofErr w:type="spellEnd"/>
-      <w:r>
-        <w:rPr>
-          <w:rFonts w:ascii="Times New Roman" w:hAnsi="Times New Roman"/>
-          <w:sz w:val="20"/>
-        </w:rPr>
-        <w:t xml:space="preserve"> </w:t>
-      </w:r>
-      <w:proofErr w:type="spellStart"/>
-      <w:r>
-        <w:rPr>
-          <w:rFonts w:ascii="Times New Roman" w:hAnsi="Times New Roman"/>
-          <w:sz w:val="20"/>
-        </w:rPr>
-        <w:t>lớn</w:t>
-      </w:r>
-      <w:proofErr w:type="spellEnd"/>
-      <w:r>
-        <w:rPr>
-          <w:rFonts w:ascii="Times New Roman" w:hAnsi="Times New Roman"/>
-          <w:sz w:val="20"/>
-        </w:rPr>
-        <w:t xml:space="preserve"> do </w:t>
-      </w:r>
-      <w:proofErr w:type="spellStart"/>
-      <w:r>
-        <w:rPr>
-          <w:rFonts w:ascii="Times New Roman" w:hAnsi="Times New Roman"/>
-          <w:sz w:val="20"/>
-        </w:rPr>
-        <w:t>sự</w:t>
-      </w:r>
-      <w:proofErr w:type="spellEnd"/>
-      <w:r>
-        <w:rPr>
-          <w:rFonts w:ascii="Times New Roman" w:hAnsi="Times New Roman"/>
-          <w:sz w:val="20"/>
-        </w:rPr>
-        <w:t xml:space="preserve"> </w:t>
-      </w:r>
-      <w:proofErr w:type="spellStart"/>
-      <w:r>
-        <w:rPr>
-          <w:rFonts w:ascii="Times New Roman" w:hAnsi="Times New Roman"/>
-          <w:sz w:val="20"/>
-        </w:rPr>
-        <w:t>chồng</w:t>
-      </w:r>
-      <w:proofErr w:type="spellEnd"/>
-      <w:r>
-        <w:rPr>
-          <w:rFonts w:ascii="Times New Roman" w:hAnsi="Times New Roman"/>
-          <w:sz w:val="20"/>
-        </w:rPr>
-        <w:t xml:space="preserve"> </w:t>
-      </w:r>
-      <w:proofErr w:type="spellStart"/>
-      <w:r>
-        <w:rPr>
-          <w:rFonts w:ascii="Times New Roman" w:hAnsi="Times New Roman"/>
-          <w:sz w:val="20"/>
-        </w:rPr>
-        <w:t>chéo</w:t>
-      </w:r>
-      <w:proofErr w:type="spellEnd"/>
-      <w:r>
-        <w:rPr>
-          <w:rFonts w:ascii="Times New Roman" w:hAnsi="Times New Roman"/>
-          <w:sz w:val="20"/>
-        </w:rPr>
-        <w:t xml:space="preserve"> </w:t>
-      </w:r>
-      <w:proofErr w:type="spellStart"/>
-      <w:r>
-        <w:rPr>
-          <w:rFonts w:ascii="Times New Roman" w:hAnsi="Times New Roman"/>
-          <w:sz w:val="20"/>
-        </w:rPr>
-        <w:t>kiến</w:t>
-      </w:r>
-      <w:proofErr w:type="spellEnd"/>
-      <w:r>
-        <w:rPr>
-          <w:rFonts w:ascii="Times New Roman" w:hAnsi="Times New Roman"/>
-          <w:sz w:val="20"/>
-        </w:rPr>
-        <w:t xml:space="preserve"> </w:t>
-      </w:r>
-      <w:proofErr w:type="spellStart"/>
-      <w:r>
-        <w:rPr>
-          <w:rFonts w:ascii="Times New Roman" w:hAnsi="Times New Roman"/>
-          <w:sz w:val="20"/>
-        </w:rPr>
-        <w:t>thức</w:t>
-      </w:r>
-      <w:proofErr w:type="spellEnd"/>
-      <w:r>
-        <w:rPr>
-          <w:rFonts w:ascii="Times New Roman" w:hAnsi="Times New Roman"/>
-          <w:sz w:val="20"/>
-        </w:rPr>
-        <w:t xml:space="preserve"> </w:t>
-      </w:r>
-      <w:proofErr w:type="spellStart"/>
-      <w:r>
-        <w:rPr>
-          <w:rFonts w:ascii="Times New Roman" w:hAnsi="Times New Roman"/>
-          <w:sz w:val="20"/>
-        </w:rPr>
-        <w:t>giữa</w:t>
-      </w:r>
-      <w:proofErr w:type="spellEnd"/>
-      <w:r>
-        <w:rPr>
-          <w:rFonts w:ascii="Times New Roman" w:hAnsi="Times New Roman"/>
-          <w:sz w:val="20"/>
-        </w:rPr>
-        <w:t xml:space="preserve"> </w:t>
-      </w:r>
-      <w:proofErr w:type="spellStart"/>
-      <w:r>
-        <w:rPr>
-          <w:rFonts w:ascii="Times New Roman" w:hAnsi="Times New Roman"/>
-          <w:sz w:val="20"/>
-        </w:rPr>
-        <w:t>các</w:t>
-      </w:r>
-      <w:proofErr w:type="spellEnd"/>
-      <w:r>
-        <w:rPr>
-          <w:rFonts w:ascii="Times New Roman" w:hAnsi="Times New Roman"/>
-          <w:sz w:val="20"/>
-        </w:rPr>
-        <w:t xml:space="preserve"> </w:t>
-      </w:r>
-      <w:proofErr w:type="spellStart"/>
-      <w:r>
-        <w:rPr>
-          <w:rFonts w:ascii="Times New Roman" w:hAnsi="Times New Roman"/>
-          <w:sz w:val="20"/>
-        </w:rPr>
-        <w:t>khối</w:t>
-      </w:r>
-      <w:proofErr w:type="spellEnd"/>
-      <w:r>
-        <w:rPr>
-          <w:rFonts w:ascii="Times New Roman" w:hAnsi="Times New Roman"/>
-          <w:sz w:val="20"/>
-        </w:rPr>
-        <w:t xml:space="preserve"> </w:t>
-      </w:r>
-      <w:proofErr w:type="spellStart"/>
-      <w:r>
-        <w:rPr>
-          <w:rFonts w:ascii="Times New Roman" w:hAnsi="Times New Roman"/>
-          <w:sz w:val="20"/>
-        </w:rPr>
-        <w:t>lớp</w:t>
-      </w:r>
-      <w:proofErr w:type="spellEnd"/>
-      <w:r>
-        <w:rPr>
-          <w:rFonts w:ascii="Times New Roman" w:hAnsi="Times New Roman"/>
-          <w:sz w:val="20"/>
-        </w:rPr>
-        <w:t xml:space="preserve"> </w:t>
-      </w:r>
-      <w:proofErr w:type="spellStart"/>
-      <w:r>
-        <w:rPr>
-          <w:rFonts w:ascii="Times New Roman" w:hAnsi="Times New Roman"/>
-          <w:sz w:val="20"/>
-        </w:rPr>
-        <w:t>và</w:t>
-      </w:r>
-      <w:proofErr w:type="spellEnd"/>
-      <w:r>
-        <w:rPr>
-          <w:rFonts w:ascii="Times New Roman" w:hAnsi="Times New Roman"/>
-          <w:sz w:val="20"/>
-        </w:rPr>
-        <w:t xml:space="preserve"> </w:t>
-      </w:r>
-      <w:proofErr w:type="spellStart"/>
-      <w:r>
-        <w:rPr>
-          <w:rFonts w:ascii="Times New Roman" w:hAnsi="Times New Roman"/>
-          <w:sz w:val="20"/>
-        </w:rPr>
-        <w:t>hiện</w:t>
-      </w:r>
-      <w:proofErr w:type="spellEnd"/>
-      <w:r>
-        <w:rPr>
-          <w:rFonts w:ascii="Times New Roman" w:hAnsi="Times New Roman"/>
-          <w:sz w:val="20"/>
-        </w:rPr>
-        <w:t xml:space="preserve"> </w:t>
-      </w:r>
-      <w:proofErr w:type="spellStart"/>
-      <w:r>
-        <w:rPr>
-          <w:rFonts w:ascii="Times New Roman" w:hAnsi="Times New Roman"/>
-          <w:sz w:val="20"/>
-        </w:rPr>
-        <w:t>tượng</w:t>
-      </w:r>
-      <w:proofErr w:type="spellEnd"/>
-      <w:r>
-        <w:rPr>
-          <w:rFonts w:ascii="Times New Roman" w:hAnsi="Times New Roman"/>
-          <w:sz w:val="20"/>
-        </w:rPr>
-        <w:t xml:space="preserve"> </w:t>
-      </w:r>
-      <w:proofErr w:type="spellStart"/>
-      <w:r>
-        <w:rPr>
-          <w:rFonts w:ascii="Times New Roman" w:hAnsi="Times New Roman"/>
-          <w:sz w:val="20"/>
-        </w:rPr>
-        <w:t>pha</w:t>
-      </w:r>
-      <w:proofErr w:type="spellEnd"/>
-      <w:r>
-        <w:rPr>
-          <w:rFonts w:ascii="Times New Roman" w:hAnsi="Times New Roman"/>
-          <w:sz w:val="20"/>
-        </w:rPr>
-        <w:t xml:space="preserve"> </w:t>
-      </w:r>
-      <w:proofErr w:type="spellStart"/>
-      <w:r>
-        <w:rPr>
-          <w:rFonts w:ascii="Times New Roman" w:hAnsi="Times New Roman"/>
-          <w:sz w:val="20"/>
-        </w:rPr>
-        <w:t>loãng</w:t>
-      </w:r>
-      <w:proofErr w:type="spellEnd"/>
-      <w:r>
-        <w:rPr>
-          <w:rFonts w:ascii="Times New Roman" w:hAnsi="Times New Roman"/>
-          <w:sz w:val="20"/>
-        </w:rPr>
-        <w:t xml:space="preserve"> </w:t>
-      </w:r>
-      <w:proofErr w:type="spellStart"/>
-      <w:r>
-        <w:rPr>
-          <w:rFonts w:ascii="Times New Roman" w:hAnsi="Times New Roman"/>
-          <w:sz w:val="20"/>
-        </w:rPr>
-        <w:t>ngữ</w:t>
-      </w:r>
-      <w:proofErr w:type="spellEnd"/>
-      <w:r>
-        <w:rPr>
-          <w:rFonts w:ascii="Times New Roman" w:hAnsi="Times New Roman"/>
-          <w:sz w:val="20"/>
-        </w:rPr>
-        <w:t xml:space="preserve"> </w:t>
-      </w:r>
-      <w:proofErr w:type="spellStart"/>
-      <w:r>
-        <w:rPr>
-          <w:rFonts w:ascii="Times New Roman" w:hAnsi="Times New Roman"/>
-          <w:sz w:val="20"/>
-        </w:rPr>
-        <w:t>cảnh</w:t>
-      </w:r>
-      <w:proofErr w:type="spellEnd"/>
-      <w:r>
-        <w:rPr>
-          <w:rFonts w:ascii="Times New Roman" w:hAnsi="Times New Roman"/>
-          <w:sz w:val="20"/>
-        </w:rPr>
-        <w:t xml:space="preserve">, </w:t>
-      </w:r>
-      <w:proofErr w:type="spellStart"/>
-      <w:r>
-        <w:rPr>
-          <w:rFonts w:ascii="Times New Roman" w:hAnsi="Times New Roman"/>
-          <w:sz w:val="20"/>
-        </w:rPr>
-        <w:t>làm</w:t>
-      </w:r>
-      <w:proofErr w:type="spellEnd"/>
-      <w:r>
-        <w:rPr>
-          <w:rFonts w:ascii="Times New Roman" w:hAnsi="Times New Roman"/>
-          <w:sz w:val="20"/>
-        </w:rPr>
-        <w:t xml:space="preserve"> </w:t>
-      </w:r>
-      <w:proofErr w:type="spellStart"/>
-      <w:r>
-        <w:rPr>
-          <w:rFonts w:ascii="Times New Roman" w:hAnsi="Times New Roman"/>
-          <w:sz w:val="20"/>
-        </w:rPr>
-        <w:t>giảm</w:t>
-      </w:r>
-      <w:proofErr w:type="spellEnd"/>
-      <w:r>
-        <w:rPr>
-          <w:rFonts w:ascii="Times New Roman" w:hAnsi="Times New Roman"/>
-          <w:sz w:val="20"/>
-        </w:rPr>
-        <w:t xml:space="preserve"> </w:t>
-      </w:r>
-      <w:proofErr w:type="spellStart"/>
-      <w:r>
-        <w:rPr>
-          <w:rFonts w:ascii="Times New Roman" w:hAnsi="Times New Roman"/>
-          <w:sz w:val="20"/>
-        </w:rPr>
-        <w:t>hiệu</w:t>
-      </w:r>
-      <w:proofErr w:type="spellEnd"/>
-      <w:r>
-        <w:rPr>
-          <w:rFonts w:ascii="Times New Roman" w:hAnsi="Times New Roman"/>
-          <w:sz w:val="20"/>
-        </w:rPr>
-        <w:t xml:space="preserve"> </w:t>
-      </w:r>
-      <w:proofErr w:type="spellStart"/>
-      <w:r>
-        <w:rPr>
-          <w:rFonts w:ascii="Times New Roman" w:hAnsi="Times New Roman"/>
-          <w:sz w:val="20"/>
-        </w:rPr>
-        <w:t>quả</w:t>
-      </w:r>
-      <w:proofErr w:type="spellEnd"/>
-      <w:r>
-        <w:rPr>
-          <w:rFonts w:ascii="Times New Roman" w:hAnsi="Times New Roman"/>
-          <w:sz w:val="20"/>
-        </w:rPr>
-        <w:t xml:space="preserve"> </w:t>
-      </w:r>
-      <w:proofErr w:type="spellStart"/>
-      <w:r>
-        <w:rPr>
-          <w:rFonts w:ascii="Times New Roman" w:hAnsi="Times New Roman"/>
-          <w:sz w:val="20"/>
-        </w:rPr>
-        <w:t>sư</w:t>
-      </w:r>
-      <w:proofErr w:type="spellEnd"/>
-      <w:r>
-        <w:rPr>
-          <w:rFonts w:ascii="Times New Roman" w:hAnsi="Times New Roman"/>
-          <w:sz w:val="20"/>
-        </w:rPr>
-        <w:t xml:space="preserve"> </w:t>
-      </w:r>
-      <w:proofErr w:type="spellStart"/>
-      <w:r>
-        <w:rPr>
-          <w:rFonts w:ascii="Times New Roman" w:hAnsi="Times New Roman"/>
-          <w:sz w:val="20"/>
-        </w:rPr>
-        <w:t>phạm</w:t>
-      </w:r>
-      <w:proofErr w:type="spellEnd"/>
-      <w:r>
-        <w:rPr>
-          <w:rFonts w:ascii="Times New Roman" w:hAnsi="Times New Roman"/>
-          <w:sz w:val="20"/>
-        </w:rPr>
-        <w:t xml:space="preserve"> </w:t>
-      </w:r>
-      <w:proofErr w:type="spellStart"/>
-      <w:r>
-        <w:rPr>
-          <w:rFonts w:ascii="Times New Roman" w:hAnsi="Times New Roman"/>
-          <w:sz w:val="20"/>
-        </w:rPr>
-        <w:t>gợi</w:t>
-      </w:r>
-      <w:proofErr w:type="spellEnd"/>
-      <w:r>
-        <w:rPr>
-          <w:rFonts w:ascii="Times New Roman" w:hAnsi="Times New Roman"/>
-          <w:sz w:val="20"/>
-        </w:rPr>
-        <w:t xml:space="preserve"> </w:t>
-      </w:r>
-      <w:proofErr w:type="spellStart"/>
-      <w:r>
-        <w:rPr>
-          <w:rFonts w:ascii="Times New Roman" w:hAnsi="Times New Roman"/>
-          <w:sz w:val="20"/>
-        </w:rPr>
-        <w:t>mở</w:t>
-      </w:r>
-      <w:proofErr w:type="spellEnd"/>
-      <w:r>
-        <w:rPr>
-          <w:rFonts w:ascii="Times New Roman" w:hAnsi="Times New Roman"/>
-          <w:sz w:val="20"/>
-        </w:rPr>
-        <w:t xml:space="preserve"> [5, 8].</w:t>
+      <w:r>
+        <w:t>Trong lịch sử phát triển của công nghệ giáo dục, các Hệ thống Gia sư Thông minh (Intelligent Tutoring Systems - ITS) truyền thống thường được thiết kế dựa trên các mô hình mạng Bayes hoặc hệ luật cứng nhắc (Rule-based) [4]. Mặc dù các hệ thống này đảm bảo tính chính xác về mặt nội dung, chúng lại gặp hạn chế lớn về chi phí phát triển quá cao, kịch bản hội thoại thiếu linh hoạt và không có khả năng tương tác tự nhiên bằng ngôn ngữ tự nhiên [8]. Sự ra đời của các LLM thương mại (như ChatGPT, Claude) đã giải quyết triệt để rào cản hội thoại, nhưng lại làm phát sinh một vấn đề sư phạm nghiêm trọng: AI thường có xu hướng "làm bài hộ" học sinh bằng cách đưa ra ngay lời giải chi tiết, thay vì gợi mở và dẫn dắt tư duy. Điều này vi phạm nghiêm trọng nguyên tắc sư phạm kiến tạo và làm giảm khả năng tự học độc lập của học sinh [8].</w:t>
       </w:r>
     </w:p>
     <w:p>
@@ -7156,6 +5330,679 @@
           <w:rFonts w:ascii="Times New Roman" w:hAnsi="Times New Roman"/>
           <w:sz w:val="20"/>
         </w:rPr>
+        <w:lastRenderedPageBreak/>
+        <w:t>Mặc</w:t>
+      </w:r>
+      <w:proofErr w:type="spellEnd"/>
+      <w:r>
+        <w:rPr>
+          <w:rFonts w:ascii="Times New Roman" w:hAnsi="Times New Roman"/>
+          <w:sz w:val="20"/>
+        </w:rPr>
+        <w:t xml:space="preserve"> </w:t>
+      </w:r>
+      <w:proofErr w:type="spellStart"/>
+      <w:r>
+        <w:rPr>
+          <w:rFonts w:ascii="Times New Roman" w:hAnsi="Times New Roman"/>
+          <w:sz w:val="20"/>
+        </w:rPr>
+        <w:t>dù</w:t>
+      </w:r>
+      <w:proofErr w:type="spellEnd"/>
+      <w:r>
+        <w:rPr>
+          <w:rFonts w:ascii="Times New Roman" w:hAnsi="Times New Roman"/>
+          <w:sz w:val="20"/>
+        </w:rPr>
+        <w:t xml:space="preserve"> </w:t>
+      </w:r>
+      <w:proofErr w:type="spellStart"/>
+      <w:r>
+        <w:rPr>
+          <w:rFonts w:ascii="Times New Roman" w:hAnsi="Times New Roman"/>
+          <w:sz w:val="20"/>
+        </w:rPr>
+        <w:t>thể</w:t>
+      </w:r>
+      <w:proofErr w:type="spellEnd"/>
+      <w:r>
+        <w:rPr>
+          <w:rFonts w:ascii="Times New Roman" w:hAnsi="Times New Roman"/>
+          <w:sz w:val="20"/>
+        </w:rPr>
+        <w:t xml:space="preserve"> </w:t>
+      </w:r>
+      <w:proofErr w:type="spellStart"/>
+      <w:r>
+        <w:rPr>
+          <w:rFonts w:ascii="Times New Roman" w:hAnsi="Times New Roman"/>
+          <w:sz w:val="20"/>
+        </w:rPr>
+        <w:t>hiện</w:t>
+      </w:r>
+      <w:proofErr w:type="spellEnd"/>
+      <w:r>
+        <w:rPr>
+          <w:rFonts w:ascii="Times New Roman" w:hAnsi="Times New Roman"/>
+          <w:sz w:val="20"/>
+        </w:rPr>
+        <w:t xml:space="preserve"> </w:t>
+      </w:r>
+      <w:proofErr w:type="spellStart"/>
+      <w:r>
+        <w:rPr>
+          <w:rFonts w:ascii="Times New Roman" w:hAnsi="Times New Roman"/>
+          <w:sz w:val="20"/>
+        </w:rPr>
+        <w:t>năng</w:t>
+      </w:r>
+      <w:proofErr w:type="spellEnd"/>
+      <w:r>
+        <w:rPr>
+          <w:rFonts w:ascii="Times New Roman" w:hAnsi="Times New Roman"/>
+          <w:sz w:val="20"/>
+        </w:rPr>
+        <w:t xml:space="preserve"> </w:t>
+      </w:r>
+      <w:proofErr w:type="spellStart"/>
+      <w:r>
+        <w:rPr>
+          <w:rFonts w:ascii="Times New Roman" w:hAnsi="Times New Roman"/>
+          <w:sz w:val="20"/>
+        </w:rPr>
+        <w:t>lực</w:t>
+      </w:r>
+      <w:proofErr w:type="spellEnd"/>
+      <w:r>
+        <w:rPr>
+          <w:rFonts w:ascii="Times New Roman" w:hAnsi="Times New Roman"/>
+          <w:sz w:val="20"/>
+        </w:rPr>
+        <w:t xml:space="preserve"> </w:t>
+      </w:r>
+      <w:proofErr w:type="spellStart"/>
+      <w:r>
+        <w:rPr>
+          <w:rFonts w:ascii="Times New Roman" w:hAnsi="Times New Roman"/>
+          <w:sz w:val="20"/>
+        </w:rPr>
+        <w:t>tạo</w:t>
+      </w:r>
+      <w:proofErr w:type="spellEnd"/>
+      <w:r>
+        <w:rPr>
+          <w:rFonts w:ascii="Times New Roman" w:hAnsi="Times New Roman"/>
+          <w:sz w:val="20"/>
+        </w:rPr>
+        <w:t xml:space="preserve"> </w:t>
+      </w:r>
+      <w:proofErr w:type="spellStart"/>
+      <w:r>
+        <w:rPr>
+          <w:rFonts w:ascii="Times New Roman" w:hAnsi="Times New Roman"/>
+          <w:sz w:val="20"/>
+        </w:rPr>
+        <w:t>sinh</w:t>
+      </w:r>
+      <w:proofErr w:type="spellEnd"/>
+      <w:r>
+        <w:rPr>
+          <w:rFonts w:ascii="Times New Roman" w:hAnsi="Times New Roman"/>
+          <w:sz w:val="20"/>
+        </w:rPr>
+        <w:t xml:space="preserve"> </w:t>
+      </w:r>
+      <w:proofErr w:type="spellStart"/>
+      <w:r>
+        <w:rPr>
+          <w:rFonts w:ascii="Times New Roman" w:hAnsi="Times New Roman"/>
+          <w:sz w:val="20"/>
+        </w:rPr>
+        <w:t>ngôn</w:t>
+      </w:r>
+      <w:proofErr w:type="spellEnd"/>
+      <w:r>
+        <w:rPr>
+          <w:rFonts w:ascii="Times New Roman" w:hAnsi="Times New Roman"/>
+          <w:sz w:val="20"/>
+        </w:rPr>
+        <w:t xml:space="preserve"> </w:t>
+      </w:r>
+      <w:proofErr w:type="spellStart"/>
+      <w:r>
+        <w:rPr>
+          <w:rFonts w:ascii="Times New Roman" w:hAnsi="Times New Roman"/>
+          <w:sz w:val="20"/>
+        </w:rPr>
+        <w:t>ngữ</w:t>
+      </w:r>
+      <w:proofErr w:type="spellEnd"/>
+      <w:r>
+        <w:rPr>
+          <w:rFonts w:ascii="Times New Roman" w:hAnsi="Times New Roman"/>
+          <w:sz w:val="20"/>
+        </w:rPr>
+        <w:t xml:space="preserve"> </w:t>
+      </w:r>
+      <w:proofErr w:type="spellStart"/>
+      <w:r>
+        <w:rPr>
+          <w:rFonts w:ascii="Times New Roman" w:hAnsi="Times New Roman"/>
+          <w:sz w:val="20"/>
+        </w:rPr>
+        <w:t>vượt</w:t>
+      </w:r>
+      <w:proofErr w:type="spellEnd"/>
+      <w:r>
+        <w:rPr>
+          <w:rFonts w:ascii="Times New Roman" w:hAnsi="Times New Roman"/>
+          <w:sz w:val="20"/>
+        </w:rPr>
+        <w:t xml:space="preserve"> </w:t>
+      </w:r>
+      <w:proofErr w:type="spellStart"/>
+      <w:r>
+        <w:rPr>
+          <w:rFonts w:ascii="Times New Roman" w:hAnsi="Times New Roman"/>
+          <w:sz w:val="20"/>
+        </w:rPr>
+        <w:t>trội</w:t>
+      </w:r>
+      <w:proofErr w:type="spellEnd"/>
+      <w:r>
+        <w:rPr>
+          <w:rFonts w:ascii="Times New Roman" w:hAnsi="Times New Roman"/>
+          <w:sz w:val="20"/>
+        </w:rPr>
+        <w:t xml:space="preserve">, </w:t>
+      </w:r>
+      <w:proofErr w:type="spellStart"/>
+      <w:r>
+        <w:rPr>
+          <w:rFonts w:ascii="Times New Roman" w:hAnsi="Times New Roman"/>
+          <w:sz w:val="20"/>
+        </w:rPr>
+        <w:t>các</w:t>
+      </w:r>
+      <w:proofErr w:type="spellEnd"/>
+      <w:r>
+        <w:rPr>
+          <w:rFonts w:ascii="Times New Roman" w:hAnsi="Times New Roman"/>
+          <w:sz w:val="20"/>
+        </w:rPr>
+        <w:t xml:space="preserve"> LLM </w:t>
+      </w:r>
+      <w:proofErr w:type="spellStart"/>
+      <w:r>
+        <w:rPr>
+          <w:rFonts w:ascii="Times New Roman" w:hAnsi="Times New Roman"/>
+          <w:sz w:val="20"/>
+        </w:rPr>
+        <w:t>vẫn</w:t>
+      </w:r>
+      <w:proofErr w:type="spellEnd"/>
+      <w:r>
+        <w:rPr>
+          <w:rFonts w:ascii="Times New Roman" w:hAnsi="Times New Roman"/>
+          <w:sz w:val="20"/>
+        </w:rPr>
+        <w:t xml:space="preserve"> </w:t>
+      </w:r>
+      <w:proofErr w:type="spellStart"/>
+      <w:r>
+        <w:rPr>
+          <w:rFonts w:ascii="Times New Roman" w:hAnsi="Times New Roman"/>
+          <w:sz w:val="20"/>
+        </w:rPr>
+        <w:t>tồn</w:t>
+      </w:r>
+      <w:proofErr w:type="spellEnd"/>
+      <w:r>
+        <w:rPr>
+          <w:rFonts w:ascii="Times New Roman" w:hAnsi="Times New Roman"/>
+          <w:sz w:val="20"/>
+        </w:rPr>
+        <w:t xml:space="preserve"> </w:t>
+      </w:r>
+      <w:proofErr w:type="spellStart"/>
+      <w:r>
+        <w:rPr>
+          <w:rFonts w:ascii="Times New Roman" w:hAnsi="Times New Roman"/>
+          <w:sz w:val="20"/>
+        </w:rPr>
+        <w:t>tại</w:t>
+      </w:r>
+      <w:proofErr w:type="spellEnd"/>
+      <w:r>
+        <w:rPr>
+          <w:rFonts w:ascii="Times New Roman" w:hAnsi="Times New Roman"/>
+          <w:sz w:val="20"/>
+        </w:rPr>
+        <w:t xml:space="preserve"> </w:t>
+      </w:r>
+      <w:proofErr w:type="spellStart"/>
+      <w:r>
+        <w:rPr>
+          <w:rFonts w:ascii="Times New Roman" w:hAnsi="Times New Roman"/>
+          <w:sz w:val="20"/>
+        </w:rPr>
+        <w:t>điểm</w:t>
+      </w:r>
+      <w:proofErr w:type="spellEnd"/>
+      <w:r>
+        <w:rPr>
+          <w:rFonts w:ascii="Times New Roman" w:hAnsi="Times New Roman"/>
+          <w:sz w:val="20"/>
+        </w:rPr>
+        <w:t xml:space="preserve"> </w:t>
+      </w:r>
+      <w:proofErr w:type="spellStart"/>
+      <w:r>
+        <w:rPr>
+          <w:rFonts w:ascii="Times New Roman" w:hAnsi="Times New Roman"/>
+          <w:sz w:val="20"/>
+        </w:rPr>
+        <w:t>yếu</w:t>
+      </w:r>
+      <w:proofErr w:type="spellEnd"/>
+      <w:r>
+        <w:rPr>
+          <w:rFonts w:ascii="Times New Roman" w:hAnsi="Times New Roman"/>
+          <w:sz w:val="20"/>
+        </w:rPr>
+        <w:t xml:space="preserve"> </w:t>
+      </w:r>
+      <w:proofErr w:type="spellStart"/>
+      <w:r>
+        <w:rPr>
+          <w:rFonts w:ascii="Times New Roman" w:hAnsi="Times New Roman"/>
+          <w:sz w:val="20"/>
+        </w:rPr>
+        <w:t>cốt</w:t>
+      </w:r>
+      <w:proofErr w:type="spellEnd"/>
+      <w:r>
+        <w:rPr>
+          <w:rFonts w:ascii="Times New Roman" w:hAnsi="Times New Roman"/>
+          <w:sz w:val="20"/>
+        </w:rPr>
+        <w:t xml:space="preserve"> </w:t>
+      </w:r>
+      <w:proofErr w:type="spellStart"/>
+      <w:r>
+        <w:rPr>
+          <w:rFonts w:ascii="Times New Roman" w:hAnsi="Times New Roman"/>
+          <w:sz w:val="20"/>
+        </w:rPr>
+        <w:t>lõi</w:t>
+      </w:r>
+      <w:proofErr w:type="spellEnd"/>
+      <w:r>
+        <w:rPr>
+          <w:rFonts w:ascii="Times New Roman" w:hAnsi="Times New Roman"/>
+          <w:sz w:val="20"/>
+        </w:rPr>
+        <w:t xml:space="preserve"> </w:t>
+      </w:r>
+      <w:proofErr w:type="spellStart"/>
+      <w:r>
+        <w:rPr>
+          <w:rFonts w:ascii="Times New Roman" w:hAnsi="Times New Roman"/>
+          <w:sz w:val="20"/>
+        </w:rPr>
+        <w:t>là</w:t>
+      </w:r>
+      <w:proofErr w:type="spellEnd"/>
+      <w:r>
+        <w:rPr>
+          <w:rFonts w:ascii="Times New Roman" w:hAnsi="Times New Roman"/>
+          <w:sz w:val="20"/>
+        </w:rPr>
+        <w:t xml:space="preserve"> </w:t>
+      </w:r>
+      <w:proofErr w:type="spellStart"/>
+      <w:r>
+        <w:rPr>
+          <w:rFonts w:ascii="Times New Roman" w:hAnsi="Times New Roman"/>
+          <w:sz w:val="20"/>
+        </w:rPr>
+        <w:t>hiện</w:t>
+      </w:r>
+      <w:proofErr w:type="spellEnd"/>
+      <w:r>
+        <w:rPr>
+          <w:rFonts w:ascii="Times New Roman" w:hAnsi="Times New Roman"/>
+          <w:sz w:val="20"/>
+        </w:rPr>
+        <w:t xml:space="preserve"> </w:t>
+      </w:r>
+      <w:proofErr w:type="spellStart"/>
+      <w:r>
+        <w:rPr>
+          <w:rFonts w:ascii="Times New Roman" w:hAnsi="Times New Roman"/>
+          <w:sz w:val="20"/>
+        </w:rPr>
+        <w:t>tượng</w:t>
+      </w:r>
+      <w:proofErr w:type="spellEnd"/>
+      <w:r>
+        <w:rPr>
+          <w:rFonts w:ascii="Times New Roman" w:hAnsi="Times New Roman"/>
+          <w:sz w:val="20"/>
+        </w:rPr>
+        <w:t xml:space="preserve"> </w:t>
+      </w:r>
+      <w:proofErr w:type="spellStart"/>
+      <w:r>
+        <w:rPr>
+          <w:rFonts w:ascii="Times New Roman" w:hAnsi="Times New Roman"/>
+          <w:sz w:val="20"/>
+        </w:rPr>
+        <w:t>ảo</w:t>
+      </w:r>
+      <w:proofErr w:type="spellEnd"/>
+      <w:r>
+        <w:rPr>
+          <w:rFonts w:ascii="Times New Roman" w:hAnsi="Times New Roman"/>
+          <w:sz w:val="20"/>
+        </w:rPr>
+        <w:t xml:space="preserve"> </w:t>
+      </w:r>
+      <w:proofErr w:type="spellStart"/>
+      <w:r>
+        <w:rPr>
+          <w:rFonts w:ascii="Times New Roman" w:hAnsi="Times New Roman"/>
+          <w:sz w:val="20"/>
+        </w:rPr>
+        <w:t>tưởng</w:t>
+      </w:r>
+      <w:proofErr w:type="spellEnd"/>
+      <w:r>
+        <w:rPr>
+          <w:rFonts w:ascii="Times New Roman" w:hAnsi="Times New Roman"/>
+          <w:sz w:val="20"/>
+        </w:rPr>
+        <w:t xml:space="preserve"> tri </w:t>
+      </w:r>
+      <w:proofErr w:type="spellStart"/>
+      <w:r>
+        <w:rPr>
+          <w:rFonts w:ascii="Times New Roman" w:hAnsi="Times New Roman"/>
+          <w:sz w:val="20"/>
+        </w:rPr>
+        <w:t>thức</w:t>
+      </w:r>
+      <w:proofErr w:type="spellEnd"/>
+      <w:r>
+        <w:rPr>
+          <w:rFonts w:ascii="Times New Roman" w:hAnsi="Times New Roman"/>
+          <w:sz w:val="20"/>
+        </w:rPr>
+        <w:t xml:space="preserve"> (hallucination), </w:t>
+      </w:r>
+      <w:proofErr w:type="spellStart"/>
+      <w:r>
+        <w:rPr>
+          <w:rFonts w:ascii="Times New Roman" w:hAnsi="Times New Roman"/>
+          <w:sz w:val="20"/>
+        </w:rPr>
+        <w:t>dẫn</w:t>
+      </w:r>
+      <w:proofErr w:type="spellEnd"/>
+      <w:r>
+        <w:rPr>
+          <w:rFonts w:ascii="Times New Roman" w:hAnsi="Times New Roman"/>
+          <w:sz w:val="20"/>
+        </w:rPr>
+        <w:t xml:space="preserve"> </w:t>
+      </w:r>
+      <w:proofErr w:type="spellStart"/>
+      <w:r>
+        <w:rPr>
+          <w:rFonts w:ascii="Times New Roman" w:hAnsi="Times New Roman"/>
+          <w:sz w:val="20"/>
+        </w:rPr>
+        <w:t>đến</w:t>
+      </w:r>
+      <w:proofErr w:type="spellEnd"/>
+      <w:r>
+        <w:rPr>
+          <w:rFonts w:ascii="Times New Roman" w:hAnsi="Times New Roman"/>
+          <w:sz w:val="20"/>
+        </w:rPr>
+        <w:t xml:space="preserve"> </w:t>
+      </w:r>
+      <w:proofErr w:type="spellStart"/>
+      <w:r>
+        <w:rPr>
+          <w:rFonts w:ascii="Times New Roman" w:hAnsi="Times New Roman"/>
+          <w:sz w:val="20"/>
+        </w:rPr>
+        <w:t>việc</w:t>
+      </w:r>
+      <w:proofErr w:type="spellEnd"/>
+      <w:r>
+        <w:rPr>
+          <w:rFonts w:ascii="Times New Roman" w:hAnsi="Times New Roman"/>
+          <w:sz w:val="20"/>
+        </w:rPr>
+        <w:t xml:space="preserve"> </w:t>
+      </w:r>
+      <w:proofErr w:type="spellStart"/>
+      <w:r>
+        <w:rPr>
+          <w:rFonts w:ascii="Times New Roman" w:hAnsi="Times New Roman"/>
+          <w:sz w:val="20"/>
+        </w:rPr>
+        <w:t>sinh</w:t>
+      </w:r>
+      <w:proofErr w:type="spellEnd"/>
+      <w:r>
+        <w:rPr>
+          <w:rFonts w:ascii="Times New Roman" w:hAnsi="Times New Roman"/>
+          <w:sz w:val="20"/>
+        </w:rPr>
+        <w:t xml:space="preserve"> </w:t>
+      </w:r>
+      <w:proofErr w:type="spellStart"/>
+      <w:r>
+        <w:rPr>
+          <w:rFonts w:ascii="Times New Roman" w:hAnsi="Times New Roman"/>
+          <w:sz w:val="20"/>
+        </w:rPr>
+        <w:t>các</w:t>
+      </w:r>
+      <w:proofErr w:type="spellEnd"/>
+      <w:r>
+        <w:rPr>
+          <w:rFonts w:ascii="Times New Roman" w:hAnsi="Times New Roman"/>
+          <w:sz w:val="20"/>
+        </w:rPr>
+        <w:t xml:space="preserve"> </w:t>
+      </w:r>
+      <w:proofErr w:type="spellStart"/>
+      <w:r>
+        <w:rPr>
+          <w:rFonts w:ascii="Times New Roman" w:hAnsi="Times New Roman"/>
+          <w:sz w:val="20"/>
+        </w:rPr>
+        <w:t>thông</w:t>
+      </w:r>
+      <w:proofErr w:type="spellEnd"/>
+      <w:r>
+        <w:rPr>
+          <w:rFonts w:ascii="Times New Roman" w:hAnsi="Times New Roman"/>
+          <w:sz w:val="20"/>
+        </w:rPr>
+        <w:t xml:space="preserve"> tin phi </w:t>
+      </w:r>
+      <w:proofErr w:type="spellStart"/>
+      <w:r>
+        <w:rPr>
+          <w:rFonts w:ascii="Times New Roman" w:hAnsi="Times New Roman"/>
+          <w:sz w:val="20"/>
+        </w:rPr>
+        <w:t>thực</w:t>
+      </w:r>
+      <w:proofErr w:type="spellEnd"/>
+      <w:r>
+        <w:rPr>
+          <w:rFonts w:ascii="Times New Roman" w:hAnsi="Times New Roman"/>
+          <w:sz w:val="20"/>
+        </w:rPr>
+        <w:t xml:space="preserve"> </w:t>
+      </w:r>
+      <w:proofErr w:type="spellStart"/>
+      <w:r>
+        <w:rPr>
+          <w:rFonts w:ascii="Times New Roman" w:hAnsi="Times New Roman"/>
+          <w:sz w:val="20"/>
+        </w:rPr>
+        <w:t>tế</w:t>
+      </w:r>
+      <w:proofErr w:type="spellEnd"/>
+      <w:r>
+        <w:rPr>
+          <w:rFonts w:ascii="Times New Roman" w:hAnsi="Times New Roman"/>
+          <w:sz w:val="20"/>
+        </w:rPr>
+        <w:t xml:space="preserve"> </w:t>
+      </w:r>
+      <w:proofErr w:type="spellStart"/>
+      <w:r>
+        <w:rPr>
+          <w:rFonts w:ascii="Times New Roman" w:hAnsi="Times New Roman"/>
+          <w:sz w:val="20"/>
+        </w:rPr>
+        <w:t>hoặc</w:t>
+      </w:r>
+      <w:proofErr w:type="spellEnd"/>
+      <w:r>
+        <w:rPr>
+          <w:rFonts w:ascii="Times New Roman" w:hAnsi="Times New Roman"/>
+          <w:sz w:val="20"/>
+        </w:rPr>
+        <w:t xml:space="preserve"> </w:t>
+      </w:r>
+      <w:proofErr w:type="spellStart"/>
+      <w:r>
+        <w:rPr>
+          <w:rFonts w:ascii="Times New Roman" w:hAnsi="Times New Roman"/>
+          <w:sz w:val="20"/>
+        </w:rPr>
+        <w:t>sai</w:t>
+      </w:r>
+      <w:proofErr w:type="spellEnd"/>
+      <w:r>
+        <w:rPr>
+          <w:rFonts w:ascii="Times New Roman" w:hAnsi="Times New Roman"/>
+          <w:sz w:val="20"/>
+        </w:rPr>
+        <w:t xml:space="preserve"> </w:t>
+      </w:r>
+      <w:proofErr w:type="spellStart"/>
+      <w:r>
+        <w:rPr>
+          <w:rFonts w:ascii="Times New Roman" w:hAnsi="Times New Roman"/>
+          <w:sz w:val="20"/>
+        </w:rPr>
+        <w:t>lệch</w:t>
+      </w:r>
+      <w:proofErr w:type="spellEnd"/>
+      <w:r>
+        <w:rPr>
+          <w:rFonts w:ascii="Times New Roman" w:hAnsi="Times New Roman"/>
+          <w:sz w:val="20"/>
+        </w:rPr>
+        <w:t xml:space="preserve"> </w:t>
+      </w:r>
+      <w:proofErr w:type="spellStart"/>
+      <w:r>
+        <w:rPr>
+          <w:rFonts w:ascii="Times New Roman" w:hAnsi="Times New Roman"/>
+          <w:sz w:val="20"/>
+        </w:rPr>
+        <w:t>kiến</w:t>
+      </w:r>
+      <w:proofErr w:type="spellEnd"/>
+      <w:r>
+        <w:rPr>
+          <w:rFonts w:ascii="Times New Roman" w:hAnsi="Times New Roman"/>
+          <w:sz w:val="20"/>
+        </w:rPr>
+        <w:t xml:space="preserve"> </w:t>
+      </w:r>
+      <w:proofErr w:type="spellStart"/>
+      <w:r>
+        <w:rPr>
+          <w:rFonts w:ascii="Times New Roman" w:hAnsi="Times New Roman"/>
+          <w:sz w:val="20"/>
+        </w:rPr>
+        <w:t>thức</w:t>
+      </w:r>
+      <w:proofErr w:type="spellEnd"/>
+      <w:r>
+        <w:rPr>
+          <w:rFonts w:ascii="Times New Roman" w:hAnsi="Times New Roman"/>
+          <w:sz w:val="20"/>
+        </w:rPr>
+        <w:t xml:space="preserve"> khoa </w:t>
+      </w:r>
+      <w:proofErr w:type="spellStart"/>
+      <w:r>
+        <w:rPr>
+          <w:rFonts w:ascii="Times New Roman" w:hAnsi="Times New Roman"/>
+          <w:sz w:val="20"/>
+        </w:rPr>
+        <w:t>học</w:t>
+      </w:r>
+      <w:proofErr w:type="spellEnd"/>
+      <w:r>
+        <w:rPr>
+          <w:rFonts w:ascii="Times New Roman" w:hAnsi="Times New Roman"/>
+          <w:sz w:val="20"/>
+        </w:rPr>
+        <w:t xml:space="preserve"> </w:t>
+      </w:r>
+      <w:proofErr w:type="spellStart"/>
+      <w:r>
+        <w:rPr>
+          <w:rFonts w:ascii="Times New Roman" w:hAnsi="Times New Roman"/>
+          <w:sz w:val="20"/>
+        </w:rPr>
+        <w:t>chuẩn</w:t>
+      </w:r>
+      <w:proofErr w:type="spellEnd"/>
+      <w:r>
+        <w:rPr>
+          <w:rFonts w:ascii="Times New Roman" w:hAnsi="Times New Roman"/>
+          <w:sz w:val="20"/>
+        </w:rPr>
+        <w:t xml:space="preserve"> </w:t>
+      </w:r>
+      <w:proofErr w:type="spellStart"/>
+      <w:r>
+        <w:rPr>
+          <w:rFonts w:ascii="Times New Roman" w:hAnsi="Times New Roman"/>
+          <w:sz w:val="20"/>
+        </w:rPr>
+        <w:t>tắc</w:t>
+      </w:r>
+      <w:proofErr w:type="spellEnd"/>
+      <w:r>
+        <w:rPr>
+          <w:rFonts w:ascii="Times New Roman" w:hAnsi="Times New Roman"/>
+          <w:sz w:val="20"/>
+        </w:rPr>
+        <w:t xml:space="preserve"> [2, 5]. </w:t>
+      </w:r>
+      <w:proofErr w:type="spellStart"/>
+      <w:r>
+        <w:rPr>
+          <w:rFonts w:ascii="Times New Roman" w:hAnsi="Times New Roman"/>
+          <w:sz w:val="20"/>
+        </w:rPr>
         <w:t>Để</w:t>
       </w:r>
       <w:proofErr w:type="spellEnd"/>
@@ -7172,6 +6019,1169 @@
           <w:rFonts w:ascii="Times New Roman" w:hAnsi="Times New Roman"/>
           <w:sz w:val="20"/>
         </w:rPr>
+        <w:t>giải</w:t>
+      </w:r>
+      <w:proofErr w:type="spellEnd"/>
+      <w:r>
+        <w:rPr>
+          <w:rFonts w:ascii="Times New Roman" w:hAnsi="Times New Roman"/>
+          <w:sz w:val="20"/>
+        </w:rPr>
+        <w:t xml:space="preserve"> </w:t>
+      </w:r>
+      <w:proofErr w:type="spellStart"/>
+      <w:r>
+        <w:rPr>
+          <w:rFonts w:ascii="Times New Roman" w:hAnsi="Times New Roman"/>
+          <w:sz w:val="20"/>
+        </w:rPr>
+        <w:t>quyết</w:t>
+      </w:r>
+      <w:proofErr w:type="spellEnd"/>
+      <w:r>
+        <w:rPr>
+          <w:rFonts w:ascii="Times New Roman" w:hAnsi="Times New Roman"/>
+          <w:sz w:val="20"/>
+        </w:rPr>
+        <w:t xml:space="preserve"> </w:t>
+      </w:r>
+      <w:proofErr w:type="spellStart"/>
+      <w:r>
+        <w:rPr>
+          <w:rFonts w:ascii="Times New Roman" w:hAnsi="Times New Roman"/>
+          <w:sz w:val="20"/>
+        </w:rPr>
+        <w:t>hạn</w:t>
+      </w:r>
+      <w:proofErr w:type="spellEnd"/>
+      <w:r>
+        <w:rPr>
+          <w:rFonts w:ascii="Times New Roman" w:hAnsi="Times New Roman"/>
+          <w:sz w:val="20"/>
+        </w:rPr>
+        <w:t xml:space="preserve"> </w:t>
+      </w:r>
+      <w:proofErr w:type="spellStart"/>
+      <w:r>
+        <w:rPr>
+          <w:rFonts w:ascii="Times New Roman" w:hAnsi="Times New Roman"/>
+          <w:sz w:val="20"/>
+        </w:rPr>
+        <w:t>chế</w:t>
+      </w:r>
+      <w:proofErr w:type="spellEnd"/>
+      <w:r>
+        <w:rPr>
+          <w:rFonts w:ascii="Times New Roman" w:hAnsi="Times New Roman"/>
+          <w:sz w:val="20"/>
+        </w:rPr>
+        <w:t xml:space="preserve"> </w:t>
+      </w:r>
+      <w:proofErr w:type="spellStart"/>
+      <w:r>
+        <w:rPr>
+          <w:rFonts w:ascii="Times New Roman" w:hAnsi="Times New Roman"/>
+          <w:sz w:val="20"/>
+        </w:rPr>
+        <w:t>này</w:t>
+      </w:r>
+      <w:proofErr w:type="spellEnd"/>
+      <w:r>
+        <w:rPr>
+          <w:rFonts w:ascii="Times New Roman" w:hAnsi="Times New Roman"/>
+          <w:sz w:val="20"/>
+        </w:rPr>
+        <w:t xml:space="preserve">, </w:t>
+      </w:r>
+      <w:proofErr w:type="spellStart"/>
+      <w:r>
+        <w:rPr>
+          <w:rFonts w:ascii="Times New Roman" w:hAnsi="Times New Roman"/>
+          <w:sz w:val="20"/>
+        </w:rPr>
+        <w:t>kỹ</w:t>
+      </w:r>
+      <w:proofErr w:type="spellEnd"/>
+      <w:r>
+        <w:rPr>
+          <w:rFonts w:ascii="Times New Roman" w:hAnsi="Times New Roman"/>
+          <w:sz w:val="20"/>
+        </w:rPr>
+        <w:t xml:space="preserve"> </w:t>
+      </w:r>
+      <w:proofErr w:type="spellStart"/>
+      <w:r>
+        <w:rPr>
+          <w:rFonts w:ascii="Times New Roman" w:hAnsi="Times New Roman"/>
+          <w:sz w:val="20"/>
+        </w:rPr>
+        <w:t>thuật</w:t>
+      </w:r>
+      <w:proofErr w:type="spellEnd"/>
+      <w:r>
+        <w:rPr>
+          <w:rFonts w:ascii="Times New Roman" w:hAnsi="Times New Roman"/>
+          <w:sz w:val="20"/>
+        </w:rPr>
+        <w:t xml:space="preserve"> </w:t>
+      </w:r>
+      <w:proofErr w:type="spellStart"/>
+      <w:r>
+        <w:rPr>
+          <w:rFonts w:ascii="Times New Roman" w:hAnsi="Times New Roman"/>
+          <w:sz w:val="20"/>
+        </w:rPr>
+        <w:t>truy</w:t>
+      </w:r>
+      <w:proofErr w:type="spellEnd"/>
+      <w:r>
+        <w:rPr>
+          <w:rFonts w:ascii="Times New Roman" w:hAnsi="Times New Roman"/>
+          <w:sz w:val="20"/>
+        </w:rPr>
+        <w:t xml:space="preserve"> </w:t>
+      </w:r>
+      <w:proofErr w:type="spellStart"/>
+      <w:r>
+        <w:rPr>
+          <w:rFonts w:ascii="Times New Roman" w:hAnsi="Times New Roman"/>
+          <w:sz w:val="20"/>
+        </w:rPr>
+        <w:t>xuất</w:t>
+      </w:r>
+      <w:proofErr w:type="spellEnd"/>
+      <w:r>
+        <w:rPr>
+          <w:rFonts w:ascii="Times New Roman" w:hAnsi="Times New Roman"/>
+          <w:sz w:val="20"/>
+        </w:rPr>
+        <w:t xml:space="preserve"> </w:t>
+      </w:r>
+      <w:proofErr w:type="spellStart"/>
+      <w:r>
+        <w:rPr>
+          <w:rFonts w:ascii="Times New Roman" w:hAnsi="Times New Roman"/>
+          <w:sz w:val="20"/>
+        </w:rPr>
+        <w:t>tăng</w:t>
+      </w:r>
+      <w:proofErr w:type="spellEnd"/>
+      <w:r>
+        <w:rPr>
+          <w:rFonts w:ascii="Times New Roman" w:hAnsi="Times New Roman"/>
+          <w:sz w:val="20"/>
+        </w:rPr>
+        <w:t xml:space="preserve"> </w:t>
+      </w:r>
+      <w:proofErr w:type="spellStart"/>
+      <w:r>
+        <w:rPr>
+          <w:rFonts w:ascii="Times New Roman" w:hAnsi="Times New Roman"/>
+          <w:sz w:val="20"/>
+        </w:rPr>
+        <w:t>cường</w:t>
+      </w:r>
+      <w:proofErr w:type="spellEnd"/>
+      <w:r>
+        <w:rPr>
+          <w:rFonts w:ascii="Times New Roman" w:hAnsi="Times New Roman"/>
+          <w:sz w:val="20"/>
+        </w:rPr>
+        <w:t xml:space="preserve"> (RAG) </w:t>
+      </w:r>
+      <w:proofErr w:type="spellStart"/>
+      <w:r>
+        <w:rPr>
+          <w:rFonts w:ascii="Times New Roman" w:hAnsi="Times New Roman"/>
+          <w:sz w:val="20"/>
+        </w:rPr>
+        <w:t>thường</w:t>
+      </w:r>
+      <w:proofErr w:type="spellEnd"/>
+      <w:r>
+        <w:rPr>
+          <w:rFonts w:ascii="Times New Roman" w:hAnsi="Times New Roman"/>
+          <w:sz w:val="20"/>
+        </w:rPr>
+        <w:t xml:space="preserve"> </w:t>
+      </w:r>
+      <w:proofErr w:type="spellStart"/>
+      <w:r>
+        <w:rPr>
+          <w:rFonts w:ascii="Times New Roman" w:hAnsi="Times New Roman"/>
+          <w:sz w:val="20"/>
+        </w:rPr>
+        <w:t>được</w:t>
+      </w:r>
+      <w:proofErr w:type="spellEnd"/>
+      <w:r>
+        <w:rPr>
+          <w:rFonts w:ascii="Times New Roman" w:hAnsi="Times New Roman"/>
+          <w:sz w:val="20"/>
+        </w:rPr>
+        <w:t xml:space="preserve"> </w:t>
+      </w:r>
+      <w:proofErr w:type="spellStart"/>
+      <w:r>
+        <w:rPr>
+          <w:rFonts w:ascii="Times New Roman" w:hAnsi="Times New Roman"/>
+          <w:sz w:val="20"/>
+        </w:rPr>
+        <w:t>tích</w:t>
+      </w:r>
+      <w:proofErr w:type="spellEnd"/>
+      <w:r>
+        <w:rPr>
+          <w:rFonts w:ascii="Times New Roman" w:hAnsi="Times New Roman"/>
+          <w:sz w:val="20"/>
+        </w:rPr>
+        <w:t xml:space="preserve"> </w:t>
+      </w:r>
+      <w:proofErr w:type="spellStart"/>
+      <w:r>
+        <w:rPr>
+          <w:rFonts w:ascii="Times New Roman" w:hAnsi="Times New Roman"/>
+          <w:sz w:val="20"/>
+        </w:rPr>
+        <w:t>hợp</w:t>
+      </w:r>
+      <w:proofErr w:type="spellEnd"/>
+      <w:r>
+        <w:rPr>
+          <w:rFonts w:ascii="Times New Roman" w:hAnsi="Times New Roman"/>
+          <w:sz w:val="20"/>
+        </w:rPr>
+        <w:t xml:space="preserve"> </w:t>
+      </w:r>
+      <w:proofErr w:type="spellStart"/>
+      <w:r>
+        <w:rPr>
+          <w:rFonts w:ascii="Times New Roman" w:hAnsi="Times New Roman"/>
+          <w:sz w:val="20"/>
+        </w:rPr>
+        <w:t>nhằm</w:t>
+      </w:r>
+      <w:proofErr w:type="spellEnd"/>
+      <w:r>
+        <w:rPr>
+          <w:rFonts w:ascii="Times New Roman" w:hAnsi="Times New Roman"/>
+          <w:sz w:val="20"/>
+        </w:rPr>
+        <w:t xml:space="preserve"> neo </w:t>
+      </w:r>
+      <w:proofErr w:type="spellStart"/>
+      <w:r>
+        <w:rPr>
+          <w:rFonts w:ascii="Times New Roman" w:hAnsi="Times New Roman"/>
+          <w:sz w:val="20"/>
+        </w:rPr>
+        <w:t>câu</w:t>
+      </w:r>
+      <w:proofErr w:type="spellEnd"/>
+      <w:r>
+        <w:rPr>
+          <w:rFonts w:ascii="Times New Roman" w:hAnsi="Times New Roman"/>
+          <w:sz w:val="20"/>
+        </w:rPr>
+        <w:t xml:space="preserve"> </w:t>
+      </w:r>
+      <w:proofErr w:type="spellStart"/>
+      <w:r>
+        <w:rPr>
+          <w:rFonts w:ascii="Times New Roman" w:hAnsi="Times New Roman"/>
+          <w:sz w:val="20"/>
+        </w:rPr>
+        <w:t>trả</w:t>
+      </w:r>
+      <w:proofErr w:type="spellEnd"/>
+      <w:r>
+        <w:rPr>
+          <w:rFonts w:ascii="Times New Roman" w:hAnsi="Times New Roman"/>
+          <w:sz w:val="20"/>
+        </w:rPr>
+        <w:t xml:space="preserve"> </w:t>
+      </w:r>
+      <w:proofErr w:type="spellStart"/>
+      <w:r>
+        <w:rPr>
+          <w:rFonts w:ascii="Times New Roman" w:hAnsi="Times New Roman"/>
+          <w:sz w:val="20"/>
+        </w:rPr>
+        <w:t>lời</w:t>
+      </w:r>
+      <w:proofErr w:type="spellEnd"/>
+      <w:r>
+        <w:rPr>
+          <w:rFonts w:ascii="Times New Roman" w:hAnsi="Times New Roman"/>
+          <w:sz w:val="20"/>
+        </w:rPr>
+        <w:t xml:space="preserve"> </w:t>
+      </w:r>
+      <w:proofErr w:type="spellStart"/>
+      <w:r>
+        <w:rPr>
+          <w:rFonts w:ascii="Times New Roman" w:hAnsi="Times New Roman"/>
+          <w:sz w:val="20"/>
+        </w:rPr>
+        <w:t>của</w:t>
+      </w:r>
+      <w:proofErr w:type="spellEnd"/>
+      <w:r>
+        <w:rPr>
+          <w:rFonts w:ascii="Times New Roman" w:hAnsi="Times New Roman"/>
+          <w:sz w:val="20"/>
+        </w:rPr>
+        <w:t xml:space="preserve"> </w:t>
+      </w:r>
+      <w:proofErr w:type="spellStart"/>
+      <w:r>
+        <w:rPr>
+          <w:rFonts w:ascii="Times New Roman" w:hAnsi="Times New Roman"/>
+          <w:sz w:val="20"/>
+        </w:rPr>
+        <w:t>mô</w:t>
+      </w:r>
+      <w:proofErr w:type="spellEnd"/>
+      <w:r>
+        <w:rPr>
+          <w:rFonts w:ascii="Times New Roman" w:hAnsi="Times New Roman"/>
+          <w:sz w:val="20"/>
+        </w:rPr>
+        <w:t xml:space="preserve"> </w:t>
+      </w:r>
+      <w:proofErr w:type="spellStart"/>
+      <w:r>
+        <w:rPr>
+          <w:rFonts w:ascii="Times New Roman" w:hAnsi="Times New Roman"/>
+          <w:sz w:val="20"/>
+        </w:rPr>
+        <w:t>hình</w:t>
+      </w:r>
+      <w:proofErr w:type="spellEnd"/>
+      <w:r>
+        <w:rPr>
+          <w:rFonts w:ascii="Times New Roman" w:hAnsi="Times New Roman"/>
+          <w:sz w:val="20"/>
+        </w:rPr>
+        <w:t xml:space="preserve"> </w:t>
+      </w:r>
+      <w:proofErr w:type="spellStart"/>
+      <w:r>
+        <w:rPr>
+          <w:rFonts w:ascii="Times New Roman" w:hAnsi="Times New Roman"/>
+          <w:sz w:val="20"/>
+        </w:rPr>
+        <w:t>vào</w:t>
+      </w:r>
+      <w:proofErr w:type="spellEnd"/>
+      <w:r>
+        <w:rPr>
+          <w:rFonts w:ascii="Times New Roman" w:hAnsi="Times New Roman"/>
+          <w:sz w:val="20"/>
+        </w:rPr>
+        <w:t xml:space="preserve"> </w:t>
+      </w:r>
+      <w:proofErr w:type="spellStart"/>
+      <w:r>
+        <w:rPr>
+          <w:rFonts w:ascii="Times New Roman" w:hAnsi="Times New Roman"/>
+          <w:sz w:val="20"/>
+        </w:rPr>
+        <w:t>các</w:t>
+      </w:r>
+      <w:proofErr w:type="spellEnd"/>
+      <w:r>
+        <w:rPr>
+          <w:rFonts w:ascii="Times New Roman" w:hAnsi="Times New Roman"/>
+          <w:sz w:val="20"/>
+        </w:rPr>
+        <w:t xml:space="preserve"> </w:t>
+      </w:r>
+      <w:proofErr w:type="spellStart"/>
+      <w:r>
+        <w:rPr>
+          <w:rFonts w:ascii="Times New Roman" w:hAnsi="Times New Roman"/>
+          <w:sz w:val="20"/>
+        </w:rPr>
+        <w:t>nguồn</w:t>
+      </w:r>
+      <w:proofErr w:type="spellEnd"/>
+      <w:r>
+        <w:rPr>
+          <w:rFonts w:ascii="Times New Roman" w:hAnsi="Times New Roman"/>
+          <w:sz w:val="20"/>
+        </w:rPr>
+        <w:t xml:space="preserve"> tri </w:t>
+      </w:r>
+      <w:proofErr w:type="spellStart"/>
+      <w:r>
+        <w:rPr>
+          <w:rFonts w:ascii="Times New Roman" w:hAnsi="Times New Roman"/>
+          <w:sz w:val="20"/>
+        </w:rPr>
+        <w:t>thức</w:t>
+      </w:r>
+      <w:proofErr w:type="spellEnd"/>
+      <w:r>
+        <w:rPr>
+          <w:rFonts w:ascii="Times New Roman" w:hAnsi="Times New Roman"/>
+          <w:sz w:val="20"/>
+        </w:rPr>
+        <w:t xml:space="preserve"> </w:t>
+      </w:r>
+      <w:proofErr w:type="spellStart"/>
+      <w:r>
+        <w:rPr>
+          <w:rFonts w:ascii="Times New Roman" w:hAnsi="Times New Roman"/>
+          <w:sz w:val="20"/>
+        </w:rPr>
+        <w:t>chính</w:t>
+      </w:r>
+      <w:proofErr w:type="spellEnd"/>
+      <w:r>
+        <w:rPr>
+          <w:rFonts w:ascii="Times New Roman" w:hAnsi="Times New Roman"/>
+          <w:sz w:val="20"/>
+        </w:rPr>
+        <w:t xml:space="preserve"> </w:t>
+      </w:r>
+      <w:proofErr w:type="spellStart"/>
+      <w:r>
+        <w:rPr>
+          <w:rFonts w:ascii="Times New Roman" w:hAnsi="Times New Roman"/>
+          <w:sz w:val="20"/>
+        </w:rPr>
+        <w:t>thống</w:t>
+      </w:r>
+      <w:proofErr w:type="spellEnd"/>
+      <w:r>
+        <w:rPr>
+          <w:rFonts w:ascii="Times New Roman" w:hAnsi="Times New Roman"/>
+          <w:sz w:val="20"/>
+        </w:rPr>
+        <w:t xml:space="preserve"> </w:t>
+      </w:r>
+      <w:proofErr w:type="spellStart"/>
+      <w:r>
+        <w:rPr>
+          <w:rFonts w:ascii="Times New Roman" w:hAnsi="Times New Roman"/>
+          <w:sz w:val="20"/>
+        </w:rPr>
+        <w:t>đáng</w:t>
+      </w:r>
+      <w:proofErr w:type="spellEnd"/>
+      <w:r>
+        <w:rPr>
+          <w:rFonts w:ascii="Times New Roman" w:hAnsi="Times New Roman"/>
+          <w:sz w:val="20"/>
+        </w:rPr>
+        <w:t xml:space="preserve"> tin </w:t>
+      </w:r>
+      <w:proofErr w:type="spellStart"/>
+      <w:r>
+        <w:rPr>
+          <w:rFonts w:ascii="Times New Roman" w:hAnsi="Times New Roman"/>
+          <w:sz w:val="20"/>
+        </w:rPr>
+        <w:t>cậy</w:t>
+      </w:r>
+      <w:proofErr w:type="spellEnd"/>
+      <w:r>
+        <w:rPr>
+          <w:rFonts w:ascii="Times New Roman" w:hAnsi="Times New Roman"/>
+          <w:sz w:val="20"/>
+        </w:rPr>
+        <w:t xml:space="preserve"> [1, 2]. Tuy </w:t>
+      </w:r>
+      <w:proofErr w:type="spellStart"/>
+      <w:r>
+        <w:rPr>
+          <w:rFonts w:ascii="Times New Roman" w:hAnsi="Times New Roman"/>
+          <w:sz w:val="20"/>
+        </w:rPr>
+        <w:t>nhiên</w:t>
+      </w:r>
+      <w:proofErr w:type="spellEnd"/>
+      <w:r>
+        <w:rPr>
+          <w:rFonts w:ascii="Times New Roman" w:hAnsi="Times New Roman"/>
+          <w:sz w:val="20"/>
+        </w:rPr>
+        <w:t xml:space="preserve">, </w:t>
+      </w:r>
+      <w:proofErr w:type="spellStart"/>
+      <w:r>
+        <w:rPr>
+          <w:rFonts w:ascii="Times New Roman" w:hAnsi="Times New Roman"/>
+          <w:sz w:val="20"/>
+        </w:rPr>
+        <w:t>việc</w:t>
+      </w:r>
+      <w:proofErr w:type="spellEnd"/>
+      <w:r>
+        <w:rPr>
+          <w:rFonts w:ascii="Times New Roman" w:hAnsi="Times New Roman"/>
+          <w:sz w:val="20"/>
+        </w:rPr>
+        <w:t xml:space="preserve"> </w:t>
+      </w:r>
+      <w:proofErr w:type="spellStart"/>
+      <w:r>
+        <w:rPr>
+          <w:rFonts w:ascii="Times New Roman" w:hAnsi="Times New Roman"/>
+          <w:sz w:val="20"/>
+        </w:rPr>
+        <w:t>áp</w:t>
+      </w:r>
+      <w:proofErr w:type="spellEnd"/>
+      <w:r>
+        <w:rPr>
+          <w:rFonts w:ascii="Times New Roman" w:hAnsi="Times New Roman"/>
+          <w:sz w:val="20"/>
+        </w:rPr>
+        <w:t xml:space="preserve"> </w:t>
+      </w:r>
+      <w:proofErr w:type="spellStart"/>
+      <w:r>
+        <w:rPr>
+          <w:rFonts w:ascii="Times New Roman" w:hAnsi="Times New Roman"/>
+          <w:sz w:val="20"/>
+        </w:rPr>
+        <w:t>dụng</w:t>
+      </w:r>
+      <w:proofErr w:type="spellEnd"/>
+      <w:r>
+        <w:rPr>
+          <w:rFonts w:ascii="Times New Roman" w:hAnsi="Times New Roman"/>
+          <w:sz w:val="20"/>
+        </w:rPr>
+        <w:t xml:space="preserve"> </w:t>
+      </w:r>
+      <w:proofErr w:type="spellStart"/>
+      <w:r>
+        <w:rPr>
+          <w:rFonts w:ascii="Times New Roman" w:hAnsi="Times New Roman"/>
+          <w:sz w:val="20"/>
+        </w:rPr>
+        <w:t>mô</w:t>
+      </w:r>
+      <w:proofErr w:type="spellEnd"/>
+      <w:r>
+        <w:rPr>
+          <w:rFonts w:ascii="Times New Roman" w:hAnsi="Times New Roman"/>
+          <w:sz w:val="20"/>
+        </w:rPr>
+        <w:t xml:space="preserve"> </w:t>
+      </w:r>
+      <w:proofErr w:type="spellStart"/>
+      <w:r>
+        <w:rPr>
+          <w:rFonts w:ascii="Times New Roman" w:hAnsi="Times New Roman"/>
+          <w:sz w:val="20"/>
+        </w:rPr>
+        <w:t>hình</w:t>
+      </w:r>
+      <w:proofErr w:type="spellEnd"/>
+      <w:r>
+        <w:rPr>
+          <w:rFonts w:ascii="Times New Roman" w:hAnsi="Times New Roman"/>
+          <w:sz w:val="20"/>
+        </w:rPr>
+        <w:t xml:space="preserve"> RAG </w:t>
+      </w:r>
+      <w:proofErr w:type="spellStart"/>
+      <w:r>
+        <w:rPr>
+          <w:rFonts w:ascii="Times New Roman" w:hAnsi="Times New Roman"/>
+          <w:sz w:val="20"/>
+        </w:rPr>
+        <w:t>phẳng</w:t>
+      </w:r>
+      <w:proofErr w:type="spellEnd"/>
+      <w:r>
+        <w:rPr>
+          <w:rFonts w:ascii="Times New Roman" w:hAnsi="Times New Roman"/>
+          <w:sz w:val="20"/>
+        </w:rPr>
+        <w:t xml:space="preserve"> </w:t>
+      </w:r>
+      <w:proofErr w:type="spellStart"/>
+      <w:r>
+        <w:rPr>
+          <w:rFonts w:ascii="Times New Roman" w:hAnsi="Times New Roman"/>
+          <w:sz w:val="20"/>
+        </w:rPr>
+        <w:t>truyền</w:t>
+      </w:r>
+      <w:proofErr w:type="spellEnd"/>
+      <w:r>
+        <w:rPr>
+          <w:rFonts w:ascii="Times New Roman" w:hAnsi="Times New Roman"/>
+          <w:sz w:val="20"/>
+        </w:rPr>
+        <w:t xml:space="preserve"> </w:t>
+      </w:r>
+      <w:proofErr w:type="spellStart"/>
+      <w:r>
+        <w:rPr>
+          <w:rFonts w:ascii="Times New Roman" w:hAnsi="Times New Roman"/>
+          <w:sz w:val="20"/>
+        </w:rPr>
+        <w:t>thống</w:t>
+      </w:r>
+      <w:proofErr w:type="spellEnd"/>
+      <w:r>
+        <w:rPr>
+          <w:rFonts w:ascii="Times New Roman" w:hAnsi="Times New Roman"/>
+          <w:sz w:val="20"/>
+        </w:rPr>
+        <w:t xml:space="preserve"> (Naive RAG) </w:t>
+      </w:r>
+      <w:proofErr w:type="spellStart"/>
+      <w:r>
+        <w:rPr>
+          <w:rFonts w:ascii="Times New Roman" w:hAnsi="Times New Roman"/>
+          <w:sz w:val="20"/>
+        </w:rPr>
+        <w:t>vào</w:t>
+      </w:r>
+      <w:proofErr w:type="spellEnd"/>
+      <w:r>
+        <w:rPr>
+          <w:rFonts w:ascii="Times New Roman" w:hAnsi="Times New Roman"/>
+          <w:sz w:val="20"/>
+        </w:rPr>
+        <w:t xml:space="preserve"> </w:t>
+      </w:r>
+      <w:proofErr w:type="spellStart"/>
+      <w:r>
+        <w:rPr>
+          <w:rFonts w:ascii="Times New Roman" w:hAnsi="Times New Roman"/>
+          <w:sz w:val="20"/>
+        </w:rPr>
+        <w:t>học</w:t>
+      </w:r>
+      <w:proofErr w:type="spellEnd"/>
+      <w:r>
+        <w:rPr>
+          <w:rFonts w:ascii="Times New Roman" w:hAnsi="Times New Roman"/>
+          <w:sz w:val="20"/>
+        </w:rPr>
+        <w:t xml:space="preserve"> </w:t>
+      </w:r>
+      <w:proofErr w:type="spellStart"/>
+      <w:r>
+        <w:rPr>
+          <w:rFonts w:ascii="Times New Roman" w:hAnsi="Times New Roman"/>
+          <w:sz w:val="20"/>
+        </w:rPr>
+        <w:t>liệu</w:t>
+      </w:r>
+      <w:proofErr w:type="spellEnd"/>
+      <w:r>
+        <w:rPr>
+          <w:rFonts w:ascii="Times New Roman" w:hAnsi="Times New Roman"/>
+          <w:sz w:val="20"/>
+        </w:rPr>
+        <w:t xml:space="preserve"> K-12 </w:t>
+      </w:r>
+      <w:proofErr w:type="spellStart"/>
+      <w:r>
+        <w:rPr>
+          <w:rFonts w:ascii="Times New Roman" w:hAnsi="Times New Roman"/>
+          <w:sz w:val="20"/>
+        </w:rPr>
+        <w:t>thường</w:t>
+      </w:r>
+      <w:proofErr w:type="spellEnd"/>
+      <w:r>
+        <w:rPr>
+          <w:rFonts w:ascii="Times New Roman" w:hAnsi="Times New Roman"/>
+          <w:sz w:val="20"/>
+        </w:rPr>
+        <w:t xml:space="preserve"> </w:t>
+      </w:r>
+      <w:proofErr w:type="spellStart"/>
+      <w:r>
+        <w:rPr>
+          <w:rFonts w:ascii="Times New Roman" w:hAnsi="Times New Roman"/>
+          <w:sz w:val="20"/>
+        </w:rPr>
+        <w:t>gặp</w:t>
+      </w:r>
+      <w:proofErr w:type="spellEnd"/>
+      <w:r>
+        <w:rPr>
+          <w:rFonts w:ascii="Times New Roman" w:hAnsi="Times New Roman"/>
+          <w:sz w:val="20"/>
+        </w:rPr>
+        <w:t xml:space="preserve"> </w:t>
+      </w:r>
+      <w:proofErr w:type="spellStart"/>
+      <w:r>
+        <w:rPr>
+          <w:rFonts w:ascii="Times New Roman" w:hAnsi="Times New Roman"/>
+          <w:sz w:val="20"/>
+        </w:rPr>
+        <w:t>trở</w:t>
+      </w:r>
+      <w:proofErr w:type="spellEnd"/>
+      <w:r>
+        <w:rPr>
+          <w:rFonts w:ascii="Times New Roman" w:hAnsi="Times New Roman"/>
+          <w:sz w:val="20"/>
+        </w:rPr>
+        <w:t xml:space="preserve"> </w:t>
+      </w:r>
+      <w:proofErr w:type="spellStart"/>
+      <w:r>
+        <w:rPr>
+          <w:rFonts w:ascii="Times New Roman" w:hAnsi="Times New Roman"/>
+          <w:sz w:val="20"/>
+        </w:rPr>
+        <w:t>ngại</w:t>
+      </w:r>
+      <w:proofErr w:type="spellEnd"/>
+      <w:r>
+        <w:rPr>
+          <w:rFonts w:ascii="Times New Roman" w:hAnsi="Times New Roman"/>
+          <w:sz w:val="20"/>
+        </w:rPr>
+        <w:t xml:space="preserve"> </w:t>
+      </w:r>
+      <w:proofErr w:type="spellStart"/>
+      <w:r>
+        <w:rPr>
+          <w:rFonts w:ascii="Times New Roman" w:hAnsi="Times New Roman"/>
+          <w:sz w:val="20"/>
+        </w:rPr>
+        <w:t>lớn</w:t>
+      </w:r>
+      <w:proofErr w:type="spellEnd"/>
+      <w:r>
+        <w:rPr>
+          <w:rFonts w:ascii="Times New Roman" w:hAnsi="Times New Roman"/>
+          <w:sz w:val="20"/>
+        </w:rPr>
+        <w:t xml:space="preserve"> do </w:t>
+      </w:r>
+      <w:proofErr w:type="spellStart"/>
+      <w:r>
+        <w:rPr>
+          <w:rFonts w:ascii="Times New Roman" w:hAnsi="Times New Roman"/>
+          <w:sz w:val="20"/>
+        </w:rPr>
+        <w:t>sự</w:t>
+      </w:r>
+      <w:proofErr w:type="spellEnd"/>
+      <w:r>
+        <w:rPr>
+          <w:rFonts w:ascii="Times New Roman" w:hAnsi="Times New Roman"/>
+          <w:sz w:val="20"/>
+        </w:rPr>
+        <w:t xml:space="preserve"> </w:t>
+      </w:r>
+      <w:proofErr w:type="spellStart"/>
+      <w:r>
+        <w:rPr>
+          <w:rFonts w:ascii="Times New Roman" w:hAnsi="Times New Roman"/>
+          <w:sz w:val="20"/>
+        </w:rPr>
+        <w:t>chồng</w:t>
+      </w:r>
+      <w:proofErr w:type="spellEnd"/>
+      <w:r>
+        <w:rPr>
+          <w:rFonts w:ascii="Times New Roman" w:hAnsi="Times New Roman"/>
+          <w:sz w:val="20"/>
+        </w:rPr>
+        <w:t xml:space="preserve"> </w:t>
+      </w:r>
+      <w:proofErr w:type="spellStart"/>
+      <w:r>
+        <w:rPr>
+          <w:rFonts w:ascii="Times New Roman" w:hAnsi="Times New Roman"/>
+          <w:sz w:val="20"/>
+        </w:rPr>
+        <w:t>chéo</w:t>
+      </w:r>
+      <w:proofErr w:type="spellEnd"/>
+      <w:r>
+        <w:rPr>
+          <w:rFonts w:ascii="Times New Roman" w:hAnsi="Times New Roman"/>
+          <w:sz w:val="20"/>
+        </w:rPr>
+        <w:t xml:space="preserve"> </w:t>
+      </w:r>
+      <w:proofErr w:type="spellStart"/>
+      <w:r>
+        <w:rPr>
+          <w:rFonts w:ascii="Times New Roman" w:hAnsi="Times New Roman"/>
+          <w:sz w:val="20"/>
+        </w:rPr>
+        <w:t>kiến</w:t>
+      </w:r>
+      <w:proofErr w:type="spellEnd"/>
+      <w:r>
+        <w:rPr>
+          <w:rFonts w:ascii="Times New Roman" w:hAnsi="Times New Roman"/>
+          <w:sz w:val="20"/>
+        </w:rPr>
+        <w:t xml:space="preserve"> </w:t>
+      </w:r>
+      <w:proofErr w:type="spellStart"/>
+      <w:r>
+        <w:rPr>
+          <w:rFonts w:ascii="Times New Roman" w:hAnsi="Times New Roman"/>
+          <w:sz w:val="20"/>
+        </w:rPr>
+        <w:t>thức</w:t>
+      </w:r>
+      <w:proofErr w:type="spellEnd"/>
+      <w:r>
+        <w:rPr>
+          <w:rFonts w:ascii="Times New Roman" w:hAnsi="Times New Roman"/>
+          <w:sz w:val="20"/>
+        </w:rPr>
+        <w:t xml:space="preserve"> </w:t>
+      </w:r>
+      <w:proofErr w:type="spellStart"/>
+      <w:r>
+        <w:rPr>
+          <w:rFonts w:ascii="Times New Roman" w:hAnsi="Times New Roman"/>
+          <w:sz w:val="20"/>
+        </w:rPr>
+        <w:t>giữa</w:t>
+      </w:r>
+      <w:proofErr w:type="spellEnd"/>
+      <w:r>
+        <w:rPr>
+          <w:rFonts w:ascii="Times New Roman" w:hAnsi="Times New Roman"/>
+          <w:sz w:val="20"/>
+        </w:rPr>
+        <w:t xml:space="preserve"> </w:t>
+      </w:r>
+      <w:proofErr w:type="spellStart"/>
+      <w:r>
+        <w:rPr>
+          <w:rFonts w:ascii="Times New Roman" w:hAnsi="Times New Roman"/>
+          <w:sz w:val="20"/>
+        </w:rPr>
+        <w:t>các</w:t>
+      </w:r>
+      <w:proofErr w:type="spellEnd"/>
+      <w:r>
+        <w:rPr>
+          <w:rFonts w:ascii="Times New Roman" w:hAnsi="Times New Roman"/>
+          <w:sz w:val="20"/>
+        </w:rPr>
+        <w:t xml:space="preserve"> </w:t>
+      </w:r>
+      <w:proofErr w:type="spellStart"/>
+      <w:r>
+        <w:rPr>
+          <w:rFonts w:ascii="Times New Roman" w:hAnsi="Times New Roman"/>
+          <w:sz w:val="20"/>
+        </w:rPr>
+        <w:t>khối</w:t>
+      </w:r>
+      <w:proofErr w:type="spellEnd"/>
+      <w:r>
+        <w:rPr>
+          <w:rFonts w:ascii="Times New Roman" w:hAnsi="Times New Roman"/>
+          <w:sz w:val="20"/>
+        </w:rPr>
+        <w:t xml:space="preserve"> </w:t>
+      </w:r>
+      <w:proofErr w:type="spellStart"/>
+      <w:r>
+        <w:rPr>
+          <w:rFonts w:ascii="Times New Roman" w:hAnsi="Times New Roman"/>
+          <w:sz w:val="20"/>
+        </w:rPr>
+        <w:t>lớp</w:t>
+      </w:r>
+      <w:proofErr w:type="spellEnd"/>
+      <w:r>
+        <w:rPr>
+          <w:rFonts w:ascii="Times New Roman" w:hAnsi="Times New Roman"/>
+          <w:sz w:val="20"/>
+        </w:rPr>
+        <w:t xml:space="preserve"> </w:t>
+      </w:r>
+      <w:proofErr w:type="spellStart"/>
+      <w:r>
+        <w:rPr>
+          <w:rFonts w:ascii="Times New Roman" w:hAnsi="Times New Roman"/>
+          <w:sz w:val="20"/>
+        </w:rPr>
+        <w:t>và</w:t>
+      </w:r>
+      <w:proofErr w:type="spellEnd"/>
+      <w:r>
+        <w:rPr>
+          <w:rFonts w:ascii="Times New Roman" w:hAnsi="Times New Roman"/>
+          <w:sz w:val="20"/>
+        </w:rPr>
+        <w:t xml:space="preserve"> </w:t>
+      </w:r>
+      <w:proofErr w:type="spellStart"/>
+      <w:r>
+        <w:rPr>
+          <w:rFonts w:ascii="Times New Roman" w:hAnsi="Times New Roman"/>
+          <w:sz w:val="20"/>
+        </w:rPr>
+        <w:t>hiện</w:t>
+      </w:r>
+      <w:proofErr w:type="spellEnd"/>
+      <w:r>
+        <w:rPr>
+          <w:rFonts w:ascii="Times New Roman" w:hAnsi="Times New Roman"/>
+          <w:sz w:val="20"/>
+        </w:rPr>
+        <w:t xml:space="preserve"> </w:t>
+      </w:r>
+      <w:proofErr w:type="spellStart"/>
+      <w:r>
+        <w:rPr>
+          <w:rFonts w:ascii="Times New Roman" w:hAnsi="Times New Roman"/>
+          <w:sz w:val="20"/>
+        </w:rPr>
+        <w:t>tượng</w:t>
+      </w:r>
+      <w:proofErr w:type="spellEnd"/>
+      <w:r>
+        <w:rPr>
+          <w:rFonts w:ascii="Times New Roman" w:hAnsi="Times New Roman"/>
+          <w:sz w:val="20"/>
+        </w:rPr>
+        <w:t xml:space="preserve"> </w:t>
+      </w:r>
+      <w:proofErr w:type="spellStart"/>
+      <w:r>
+        <w:rPr>
+          <w:rFonts w:ascii="Times New Roman" w:hAnsi="Times New Roman"/>
+          <w:sz w:val="20"/>
+        </w:rPr>
+        <w:t>pha</w:t>
+      </w:r>
+      <w:proofErr w:type="spellEnd"/>
+      <w:r>
+        <w:rPr>
+          <w:rFonts w:ascii="Times New Roman" w:hAnsi="Times New Roman"/>
+          <w:sz w:val="20"/>
+        </w:rPr>
+        <w:t xml:space="preserve"> </w:t>
+      </w:r>
+      <w:proofErr w:type="spellStart"/>
+      <w:r>
+        <w:rPr>
+          <w:rFonts w:ascii="Times New Roman" w:hAnsi="Times New Roman"/>
+          <w:sz w:val="20"/>
+        </w:rPr>
+        <w:t>loãng</w:t>
+      </w:r>
+      <w:proofErr w:type="spellEnd"/>
+      <w:r>
+        <w:rPr>
+          <w:rFonts w:ascii="Times New Roman" w:hAnsi="Times New Roman"/>
+          <w:sz w:val="20"/>
+        </w:rPr>
+        <w:t xml:space="preserve"> </w:t>
+      </w:r>
+      <w:proofErr w:type="spellStart"/>
+      <w:r>
+        <w:rPr>
+          <w:rFonts w:ascii="Times New Roman" w:hAnsi="Times New Roman"/>
+          <w:sz w:val="20"/>
+        </w:rPr>
+        <w:t>ngữ</w:t>
+      </w:r>
+      <w:proofErr w:type="spellEnd"/>
+      <w:r>
+        <w:rPr>
+          <w:rFonts w:ascii="Times New Roman" w:hAnsi="Times New Roman"/>
+          <w:sz w:val="20"/>
+        </w:rPr>
+        <w:t xml:space="preserve"> </w:t>
+      </w:r>
+      <w:proofErr w:type="spellStart"/>
+      <w:r>
+        <w:rPr>
+          <w:rFonts w:ascii="Times New Roman" w:hAnsi="Times New Roman"/>
+          <w:sz w:val="20"/>
+        </w:rPr>
+        <w:t>cảnh</w:t>
+      </w:r>
+      <w:proofErr w:type="spellEnd"/>
+      <w:r>
+        <w:rPr>
+          <w:rFonts w:ascii="Times New Roman" w:hAnsi="Times New Roman"/>
+          <w:sz w:val="20"/>
+        </w:rPr>
+        <w:t xml:space="preserve">, </w:t>
+      </w:r>
+      <w:proofErr w:type="spellStart"/>
+      <w:r>
+        <w:rPr>
+          <w:rFonts w:ascii="Times New Roman" w:hAnsi="Times New Roman"/>
+          <w:sz w:val="20"/>
+        </w:rPr>
+        <w:t>làm</w:t>
+      </w:r>
+      <w:proofErr w:type="spellEnd"/>
+      <w:r>
+        <w:rPr>
+          <w:rFonts w:ascii="Times New Roman" w:hAnsi="Times New Roman"/>
+          <w:sz w:val="20"/>
+        </w:rPr>
+        <w:t xml:space="preserve"> </w:t>
+      </w:r>
+      <w:proofErr w:type="spellStart"/>
+      <w:r>
+        <w:rPr>
+          <w:rFonts w:ascii="Times New Roman" w:hAnsi="Times New Roman"/>
+          <w:sz w:val="20"/>
+        </w:rPr>
+        <w:t>giảm</w:t>
+      </w:r>
+      <w:proofErr w:type="spellEnd"/>
+      <w:r>
+        <w:rPr>
+          <w:rFonts w:ascii="Times New Roman" w:hAnsi="Times New Roman"/>
+          <w:sz w:val="20"/>
+        </w:rPr>
+        <w:t xml:space="preserve"> </w:t>
+      </w:r>
+      <w:proofErr w:type="spellStart"/>
+      <w:r>
+        <w:rPr>
+          <w:rFonts w:ascii="Times New Roman" w:hAnsi="Times New Roman"/>
+          <w:sz w:val="20"/>
+        </w:rPr>
+        <w:t>hiệu</w:t>
+      </w:r>
+      <w:proofErr w:type="spellEnd"/>
+      <w:r>
+        <w:rPr>
+          <w:rFonts w:ascii="Times New Roman" w:hAnsi="Times New Roman"/>
+          <w:sz w:val="20"/>
+        </w:rPr>
+        <w:t xml:space="preserve"> </w:t>
+      </w:r>
+      <w:proofErr w:type="spellStart"/>
+      <w:r>
+        <w:rPr>
+          <w:rFonts w:ascii="Times New Roman" w:hAnsi="Times New Roman"/>
+          <w:sz w:val="20"/>
+        </w:rPr>
+        <w:t>quả</w:t>
+      </w:r>
+      <w:proofErr w:type="spellEnd"/>
+      <w:r>
+        <w:rPr>
+          <w:rFonts w:ascii="Times New Roman" w:hAnsi="Times New Roman"/>
+          <w:sz w:val="20"/>
+        </w:rPr>
+        <w:t xml:space="preserve"> </w:t>
+      </w:r>
+      <w:proofErr w:type="spellStart"/>
+      <w:r>
+        <w:rPr>
+          <w:rFonts w:ascii="Times New Roman" w:hAnsi="Times New Roman"/>
+          <w:sz w:val="20"/>
+        </w:rPr>
+        <w:t>sư</w:t>
+      </w:r>
+      <w:proofErr w:type="spellEnd"/>
+      <w:r>
+        <w:rPr>
+          <w:rFonts w:ascii="Times New Roman" w:hAnsi="Times New Roman"/>
+          <w:sz w:val="20"/>
+        </w:rPr>
+        <w:t xml:space="preserve"> </w:t>
+      </w:r>
+      <w:proofErr w:type="spellStart"/>
+      <w:r>
+        <w:rPr>
+          <w:rFonts w:ascii="Times New Roman" w:hAnsi="Times New Roman"/>
+          <w:sz w:val="20"/>
+        </w:rPr>
+        <w:t>phạm</w:t>
+      </w:r>
+      <w:proofErr w:type="spellEnd"/>
+      <w:r>
+        <w:rPr>
+          <w:rFonts w:ascii="Times New Roman" w:hAnsi="Times New Roman"/>
+          <w:sz w:val="20"/>
+        </w:rPr>
+        <w:t xml:space="preserve"> </w:t>
+      </w:r>
+      <w:proofErr w:type="spellStart"/>
+      <w:r>
+        <w:rPr>
+          <w:rFonts w:ascii="Times New Roman" w:hAnsi="Times New Roman"/>
+          <w:sz w:val="20"/>
+        </w:rPr>
+        <w:t>gợi</w:t>
+      </w:r>
+      <w:proofErr w:type="spellEnd"/>
+      <w:r>
+        <w:rPr>
+          <w:rFonts w:ascii="Times New Roman" w:hAnsi="Times New Roman"/>
+          <w:sz w:val="20"/>
+        </w:rPr>
+        <w:t xml:space="preserve"> </w:t>
+      </w:r>
+      <w:proofErr w:type="spellStart"/>
+      <w:r>
+        <w:rPr>
+          <w:rFonts w:ascii="Times New Roman" w:hAnsi="Times New Roman"/>
+          <w:sz w:val="20"/>
+        </w:rPr>
+        <w:t>mở</w:t>
+      </w:r>
+      <w:proofErr w:type="spellEnd"/>
+      <w:r>
+        <w:rPr>
+          <w:rFonts w:ascii="Times New Roman" w:hAnsi="Times New Roman"/>
+          <w:sz w:val="20"/>
+        </w:rPr>
+        <w:t xml:space="preserve"> [5, 8].</w:t>
+      </w:r>
+    </w:p>
+    <w:p>
+      <w:r>
+        <w:t>Để khắc phục xu hướng ảo giác và kiểm soát câu trả lời của LLM, việc tích hợp RAG vào sách giáo khoa là giải pháp phổ biến nhất hiện nay [2, 5]. Tuy nhiên, các hệ thống RAG thông thường (Naive RAG) gặp thách thức lớn khi xử lý kho dữ liệu phân cấp như sách giáo khoa K-12. Cụ thể, các thuật toán tìm kiếm vector thuần túy dựa trên độ tương đồng ngữ nghĩa sẽ dễ bị nhầm lẫn và trùng lặp thuật ngữ giữa các cấp học. Ví dụ, một câu hỏi về khái niệm "lực" của học sinh lớp 6 có thể vô tình truy xuất các định nghĩa cơ học lượng tử phức tạp của lớp 12, dẫn đến việc cung cấp ngữ cảnh vượt quá khả năng nhận thức của người học. Việc thiếu đi bộ lọc phân cấp cấp học khiến ngữ cảnh bị pha loãng, đồng thời làm mất đi tính cá nhân hóa trong giáo dục phổ thông [5].</w:t>
+      </w:r>
+    </w:p>
+    <w:p>
+      <w:pPr>
+        <w:spacing w:after="80" w:line="252" w:lineRule="auto"/>
+        <w:jc w:val="both"/>
+      </w:pPr>
+      <w:proofErr w:type="spellStart"/>
+      <w:r>
+        <w:rPr>
+          <w:rFonts w:ascii="Times New Roman" w:hAnsi="Times New Roman"/>
+          <w:sz w:val="20"/>
+        </w:rPr>
+        <w:t>Để</w:t>
+      </w:r>
+      <w:proofErr w:type="spellEnd"/>
+      <w:r>
+        <w:rPr>
+          <w:rFonts w:ascii="Times New Roman" w:hAnsi="Times New Roman"/>
+          <w:sz w:val="20"/>
+        </w:rPr>
+        <w:t xml:space="preserve"> </w:t>
+      </w:r>
+      <w:proofErr w:type="spellStart"/>
+      <w:r>
+        <w:rPr>
+          <w:rFonts w:ascii="Times New Roman" w:hAnsi="Times New Roman"/>
+          <w:sz w:val="20"/>
+        </w:rPr>
         <w:t>vượt</w:t>
       </w:r>
       <w:proofErr w:type="spellEnd"/>
@@ -8653,6 +8663,11 @@
           <w:sz w:val="20"/>
         </w:rPr>
         <w:t xml:space="preserve"> [7].</w:t>
+      </w:r>
+    </w:p>
+    <w:p>
+      <w:r>
+        <w:t>Để giải quyết triệt để các thách thức trên, bài báo này tập trung nghiên cứu và đề xuất một giải pháp toàn diện cho hệ thống Gia sư ảo K-12. Các đóng góp khoa học chính của nghiên cứu này bao gồm: (1) Thiết kế kiến trúc RAG thích ứng phân cấp sử dụng bộ định tuyến Query Router để khoanh vùng không gian vector theo khối lớp; (2) Tối ưu hóa hiệu năng truy xuất bằng cách kết hợp tìm kiếm lai BM25-Cosine thông qua thuật toán RRF và mô hình tái xếp hạng BGE-Reranker-Large; (3) Tích hợp cơ chế Socratic và hồ sơ năng lực động của học sinh để tự động điều chỉnh mức độ giàn giáo sư phạm theo thuyết Vùng phát triển gần nhất; và (4) Tiến hành kiểm định thực nghiệm nghiêm ngặt trên 60 học sinh đối chứng kết hợp đánh giá chất lượng của hội đồng giáo viên qua chỉ số Fleiss' Kappa.</w:t>
       </w:r>
     </w:p>
     <w:p>

</xml_diff>

<commit_message>
Fix formula formatting using native oMath, renumber equations from (1) to (7), expand Results & Discussion with 3 analytical paragraphs, and update citations
</commit_message>
<xml_diff>
--- a/bao_cao_nghien_cuu_RAG_hoan_chinh_tieng_viet.docx
+++ b/bao_cao_nghien_cuu_RAG_hoan_chinh_tieng_viet.docx
@@ -9109,7 +9109,7 @@
     </w:p>
     <w:p>
       <w:r>
-        <w:t>Quy trình xử lý bắt đầu bằng bước chuẩn hóa truy vấn thô của học sinh (User Raw Query). Do đặc thù tâm sinh lý lứa tuổi học sinh K-12, các truy vấn thường chứa lỗi chính tả, cách viết tắt phi chuẩn hoặc diễn đạt mơ hồ. Để giải quyết hạn chế này, chúng tôi tích hợp bộ lọc tinh chỉnh câu hỏi (Query Refiner) sử dụng mô hình ngôn ngữ lớn cục bộ. Mô hình này đóng vai trò một biên dịch viên học thuật, thực hiện sửa lỗi chính tả, bổ sung các ngữ cảnh môn học bị thiếu và viết lại truy vấn dưới dạng câu lệnh tìm kiếm ngữ nghĩa chuẩn hóa (Standardized Semantic Query). Ví dụ, một câu hỏi viết tắt như "tinh x^2 lop 8" sẽ được tự động cấu trúc lại thành "Phương pháp phân tích đa thức thành nhân tử và các phép toán liên quan đến lũy thừa bậc hai trong chương trình Toán học lớp 8". Kỹ thuật này giúp bộ tìm kiếm lai (Hybrid Search) tiếp theo đạt được độ khớp từ khóa và độ tương đồng ngữ nghĩa tối ưu hơn.</w:t>
+        <w:t>Quy trình xử lý bắt đầu bằng bước chuẩn hóa truy vấn thô của học sinh (User Raw Query). Do đặc thù tâm sinh lý lứa tuổi học sinh K-12, các truy vấn thường chứa lỗi chính tả, cách viết tắt phi chuẩn hoặc diễn đạt mơ hồ. Để giải quyết hạn chế này, chúng tôi tích hợp bộ lọc tinh chỉnh câu hỏi (Query Refiner) sử dụng mô hình ngôn ngữ lớn cục bộ. Mô hình này đóng vai trò một biên dịch viên học thuật, thực hiện sửa lỗi chính tả, bổ sung các ngữ cảnh môn học bị thiếu và viết lại truy vấn dưới dạng câu lệnh tìm kiếm ngữ nghĩa chuẩn hóa (Standardized Semantic Query). Ví dụ, một câu hỏi viết tắt như "tinh x^2 lop 8" sẽ được tự động cấu trúc lại thành "Phương pháp phân tích đa thức thành nhân tử và các phép toán liên quan đến lũy thừa bậc hai trong chương trình Toán học lớp 8". Kỹ thuật này giúp bộ tìm kiếm lai (Hybrid Search) tiếp theo đạt được độ khớp từ khóa và độ tương đồng ngữ nghĩa tối ưu hơn [2, 7].</w:t>
       </w:r>
     </w:p>
     <w:p>
@@ -9122,7 +9122,7 @@
     </w:p>
     <w:p>
       <w:r>
-        <w:t>Nhằm bảo toàn cấu trúc logic và mối quan hệ ràng buộc giữa các bài học trong chương trình giáo dục K-12, chúng tôi đề xuất tích hợp mô hình đồ thị tri thức phân cấp (Graph RAG). Trái với phương pháp RAG truyền thống vốn chỉ xử lý văn bản dưới dạng các mảnh tách biệt, Graph RAG cấu trúc các chủ đề sách giáo khoa thành các nút (Nodes) và mối quan hệ tiền đề - hệ quả (Prerequisite Edges). Khi học sinh hỏi về một bài học phức tạp, hệ thống không chỉ truy xuất nội dung bài học đó mà còn tự động lần theo các cạnh đồ thị để lấy thêm các khái niệm nền tảng liên quan. Cơ chế này đóng vai trò quan trọng trong việc hỗ trợ phương pháp sư phạm gợi mở (Scaffolding), giúp AI biết cách dẫn dắt học sinh từ những kiến thức căn bản nhất.</w:t>
+        <w:t>Nhằm bảo toàn cấu trúc logic và mối quan hệ ràng buộc giữa các bài học trong chương trình giáo dục K-12, chúng tôi đề xuất tích hợp mô hình đồ thị tri thức phân cấp (Graph RAG). Trái với phương pháp RAG truyền thống vốn chỉ xử lý văn bản dưới dạng các mảnh tách biệt, Graph RAG cấu trúc các chủ đề sách giáo khoa thành các nút (Nodes) và mối quan hệ tiền đề - hệ quả (Prerequisite Edges). Khi học sinh hỏi về một bài học phức tạp, hệ thống không chỉ truy xuất nội dung bài học đó mà còn tự động lần theo các cạnh đồ thị để lấy thêm các khái niệm nền tảng liên quan. Cơ chế này đóng vai trò quan trọng trong việc hỗ trợ phương pháp sư phạm gợi mở (Scaffolding), giúp AI biết cách dẫn dắt học sinh từ những kiến thức căn bản nhất [9].</w:t>
       </w:r>
     </w:p>
     <w:p>
@@ -15652,61 +15652,85 @@
     </w:p>
     <w:p>
       <w:r>
-        <w:t>Để chấm điểm tương quan ngữ cảnh trực tiếp giữa câu hỏi của học sinh (q) và từng đoạn văn bản sách giáo khoa (d), hệ thống áp dụng mô hình Cross-Encoder để tính toán điểm số tương đồng theo công thức:</w:t>
+        <w:rPr>
+          <w:b/>
+        </w:rPr>
+        <w:t>Công thức 3: Điểm tương quan ngữ cảnh của mô hình Tái xếp hạng:</w:t>
       </w:r>
     </w:p>
     <w:p>
-      <w:r>
-        <w:rPr>
-          <w:i/>
-        </w:rPr>
-        <w:t>Score(q, d) = \sigma(W \cdot CLS(q, d))</w:t>
-      </w:r>
+      <m:oMath>
+        <m:r>
+          <m:t>Score(q, d) = σ(W ⋅ CLS(q, d))</m:t>
+        </m:r>
+      </m:oMath>
     </w:p>
     <w:p>
       <w:r>
-        <w:t>Trong đó, CLS(q, d) biểu thị trạng thái đầu ra của mã đặc trưng [CLS] khi đưa chuỗi đầu vào nối liền của truy vấn và văn bản qua mạng Transformer. Trọng số của lớp phân loại tuyến tính ký hiệu là W. Hàm Sigmoid được sử dụng để chuẩn hóa điểm số tương quan về miền giá trị [0, 1] được xác định bởi công thức:</w:t>
+        <w:rPr>
+          <w:b/>
+        </w:rPr>
+        <w:t>Công thức 4: Hàm Sigmoid chuẩn hóa điểm tương quan ngữ cảnh:</w:t>
       </w:r>
     </w:p>
     <w:p>
-      <w:r>
-        <w:rPr>
-          <w:i/>
-        </w:rPr>
-        <w:t>\sigma(x) = 1 / (1 + e^{-x})</w:t>
-      </w:r>
+      <m:oMath>
+        <m:r>
+          <m:t>σ(x) = 1 / (1 + e⁻ˣ)</m:t>
+        </m:r>
+      </m:oMath>
     </w:p>
     <w:p>
       <w:r>
-        <w:rPr>
-          <w:b/>
-        </w:rPr>
-        <w:t>2.3.3. Cơ chế Truy xuất Chủ động Tuần hoàn (Active &amp; Iterative Retrieval)</w:t>
+        <w:t>Trong đó, CLS(q, d) biểu thị trạng thái đầu ra của mã đặc trưng [CLS] khi đưa chuỗi đầu vào nối liền của truy vấn và văn bản qua mạng Transformer. Trọng số của lớp phân loại tuyến tính ký hiệu là W. Hàm Sigmoid (σ) được sử dụng để chuẩn hóa điểm số tương quan về miền giá trị [0, 1] nhằm tạo tính đồng nhất.</w:t>
       </w:r>
     </w:p>
     <w:p>
       <w:r>
-        <w:t>Cơ chế ra quyết định để chấp nhận ngữ cảnh hoặc kích hoạt vòng lặp truy xuất phụ được định nghĩa theo quy tắc toán học dưới đây:</w:t>
+        <w:rPr>
+          <w:b/>
+        </w:rPr>
+        <w:t>2.3.3. Cơ chế Truy xuất Chủ động Tuần hoàn (Active &amp; Iterative Retrieval)</w:t>
       </w:r>
     </w:p>
     <w:p>
       <w:r>
-        <w:rPr>
-          <w:i/>
-        </w:rPr>
-        <w:t>Context(q) = TopK(Rerank(q, D_0))  nếu  max S(q, d) &gt;= \tau</w:t>
-        <w:br/>
-        <w:t>Context(q) = TopK(Rerank(q_exp, D_exp))  nếu  max S(q, d) &lt; \tau  và  iter &lt; N_max</w:t>
+        <w:t>Trong đó, S(q, d) là điểm tương quan ngữ cảnh đầu ra của mô hình tái xếp hạng BGE-Reranker-Large. Ký hiệu τ = 0.65 biểu thị ngưỡng tin cậy ngữ nghĩa tối thiểu. Truy vấn mở rộng tự động qua phân tích từ đồng nghĩa ký hiệu là q_exp. Không gian tài liệu tìm kiếm mở rộng (nới lỏng bộ lọc lớp học) ký hiệu là D_exp. Biến iter biểu thị số lần lặp hiện tại và N_max = 3 là giới hạn số lần lặp tối đa.</w:t>
       </w:r>
     </w:p>
     <w:p>
-      <w:r>
-        <w:t>Trong đó, S(q, d) là điểm tương quan ngữ cảnh đầu ra của mô hình tái xếp hạng BGE-Reranker-Large. Ký hiệu \tau = 0.65 biểu thị ngưỡng tin cậy ngữ nghĩa tối thiểu. Truy vấn mở rộng tự động qua phân tích từ đồng nghĩa ký hiệu là q_exp. Không gian tài liệu tìm kiếm mở rộng (nới lỏng bộ lọc lớp học) ký hiệu là D_exp. Biến iter biểu thị số lần lặp hiện tại và N_max = 3 là giới hạn số lần lặp tối đa.</w:t>
-      </w:r>
+      <m:oMath>
+        <m:r>
+          <m:t>Context(q) = TopK(Rerank(q_exp, D_exp))  nếu  max S(q, d) &lt; τ  và  iter &lt; N_max</m:t>
+        </m:r>
+      </m:oMath>
     </w:p>
     <w:p>
       <w:r>
-        <w:t>Để ngăn chặn triệt để hiện tượng phản hồi sai lệch khi sách giáo khoa không chứa trực tiếp câu trả lời của học sinh, hệ thống đề xuất cơ chế truy xuất chủ động tuần hoàn (Active &amp; Iterative Retrieval). Sau bước tái xếp hạng bằng BGE-Reranker-Large, điểm tương đồng ngữ nghĩa (Similarity Score) của các phân đoạn tài liệu sẽ được đánh giá dựa trên một ngưỡng tin cậy tối thiểu (quy định là tau = 0.65). Nếu điểm số của mảnh tài liệu cao nhất không đạt ngưỡng này, hệ thống sẽ từ chối đưa trực tiếp vào LLM. Thay vào đó, một vòng lặp truy xuất phụ sẽ được kích hoạt: hệ thống tự động sinh các từ khóa đồng nghĩa (Synonym Expansion), nới lỏng giới hạn bộ lọc lớp học hoặc mở rộng tìm kiếm sang các chương học liên quan để tìm kiếm lại. Quá trình này lặp lại tối đa 3 chu kỳ cho đến khi tìm được ngữ cảnh đạt ngưỡng tin cậy, giúp nâng cao đáng kể chỉ số Recall của hệ thống.</w:t>
+        <w:rPr>
+          <w:b/>
+        </w:rPr>
+        <w:t>Công thức 6: Quy tắc kích hoạt vòng lặp truy xuất mở rộng chủ động:</w:t>
+      </w:r>
+    </w:p>
+    <w:p>
+      <m:oMath>
+        <m:r>
+          <m:t>Context(q) = TopK(Rerank(q, D_0))  nếu  max S(q, d) ≥ τ</m:t>
+        </m:r>
+      </m:oMath>
+    </w:p>
+    <w:p>
+      <w:r>
+        <w:rPr>
+          <w:b/>
+        </w:rPr>
+        <w:t>Công thức 5: Quy tắc chấp nhận ngữ cảnh tối ưu của hệ thống:</w:t>
+      </w:r>
+    </w:p>
+    <w:p>
+      <w:r>
+        <w:t>Để ngăn chặn triệt để hiện tượng phản hồi sai lệch khi sách giáo khoa không chứa trực tiếp câu trả lời của học sinh, hệ thống đề xuất cơ chế truy xuất chủ động tuần hoàn (Active &amp; Iterative Retrieval). Sau bước tái xếp hạng bằng BGE-Reranker-Large, điểm tương đồng ngữ nghĩa (Similarity Score) của các phân đoạn tài liệu sẽ được đánh giá dựa trên một ngưỡng tin cậy tối thiểu (quy định là tau = 0.65). Nếu điểm số của mảnh tài liệu cao nhất không đạt ngưỡng này, hệ thống sẽ từ chối đưa trực tiếp vào LLM. Thay vào đó, một vòng lặp truy xuất phụ sẽ được kích hoạt: hệ thống tự động sinh các từ khóa đồng nghĩa (Synonym Expansion), nới lỏng giới hạn bộ lọc lớp học hoặc mở rộng tìm kiếm sang các chương học liên quan để tìm kiếm lại. Quá trình này lặp lại tối đa 3 chu kỳ cho đến khi tìm được ngữ cảnh đạt ngưỡng tin cậy, giúp nâng cao đáng kể chỉ số Recall của hệ thống [3, 5].</w:t>
       </w:r>
     </w:p>
     <w:p>
@@ -20204,156 +20228,7 @@
         <w:jc w:val="center"/>
       </w:pPr>
       <w:r>
-        <w:rPr>
-          <w:rFonts w:ascii="Times New Roman" w:hAnsi="Times New Roman"/>
-          <w:i/>
-          <w:sz w:val="18"/>
-        </w:rPr>
-        <w:t xml:space="preserve">Công </w:t>
-      </w:r>
-      <w:proofErr w:type="spellStart"/>
-      <w:r>
-        <w:rPr>
-          <w:rFonts w:ascii="Times New Roman" w:hAnsi="Times New Roman"/>
-          <w:i/>
-          <w:sz w:val="18"/>
-        </w:rPr>
-        <w:t>thức</w:t>
-      </w:r>
-      <w:proofErr w:type="spellEnd"/>
-      <w:r>
-        <w:rPr>
-          <w:rFonts w:ascii="Times New Roman" w:hAnsi="Times New Roman"/>
-          <w:i/>
-          <w:sz w:val="18"/>
-        </w:rPr>
-        <w:t xml:space="preserve"> 3: </w:t>
-      </w:r>
-      <w:proofErr w:type="spellStart"/>
-      <w:r>
-        <w:rPr>
-          <w:rFonts w:ascii="Times New Roman" w:hAnsi="Times New Roman"/>
-          <w:i/>
-          <w:sz w:val="18"/>
-        </w:rPr>
-        <w:t>Tính</w:t>
-      </w:r>
-      <w:proofErr w:type="spellEnd"/>
-      <w:r>
-        <w:rPr>
-          <w:rFonts w:ascii="Times New Roman" w:hAnsi="Times New Roman"/>
-          <w:i/>
-          <w:sz w:val="18"/>
-        </w:rPr>
-        <w:t xml:space="preserve"> </w:t>
-      </w:r>
-      <w:proofErr w:type="spellStart"/>
-      <w:r>
-        <w:rPr>
-          <w:rFonts w:ascii="Times New Roman" w:hAnsi="Times New Roman"/>
-          <w:i/>
-          <w:sz w:val="18"/>
-        </w:rPr>
-        <w:t>toán</w:t>
-      </w:r>
-      <w:proofErr w:type="spellEnd"/>
-      <w:r>
-        <w:rPr>
-          <w:rFonts w:ascii="Times New Roman" w:hAnsi="Times New Roman"/>
-          <w:i/>
-          <w:sz w:val="18"/>
-        </w:rPr>
-        <w:t xml:space="preserve"> </w:t>
-      </w:r>
-      <w:proofErr w:type="spellStart"/>
-      <w:r>
-        <w:rPr>
-          <w:rFonts w:ascii="Times New Roman" w:hAnsi="Times New Roman"/>
-          <w:i/>
-          <w:sz w:val="18"/>
-        </w:rPr>
-        <w:t>điểm</w:t>
-      </w:r>
-      <w:proofErr w:type="spellEnd"/>
-      <w:r>
-        <w:rPr>
-          <w:rFonts w:ascii="Times New Roman" w:hAnsi="Times New Roman"/>
-          <w:i/>
-          <w:sz w:val="18"/>
-        </w:rPr>
-        <w:t xml:space="preserve"> </w:t>
-      </w:r>
-      <w:proofErr w:type="spellStart"/>
-      <w:r>
-        <w:rPr>
-          <w:rFonts w:ascii="Times New Roman" w:hAnsi="Times New Roman"/>
-          <w:i/>
-          <w:sz w:val="18"/>
-        </w:rPr>
-        <w:t>số</w:t>
-      </w:r>
-      <w:proofErr w:type="spellEnd"/>
-      <w:r>
-        <w:rPr>
-          <w:rFonts w:ascii="Times New Roman" w:hAnsi="Times New Roman"/>
-          <w:i/>
-          <w:sz w:val="18"/>
-        </w:rPr>
-        <w:t xml:space="preserve"> Likert </w:t>
-      </w:r>
-      <w:proofErr w:type="spellStart"/>
-      <w:r>
-        <w:rPr>
-          <w:rFonts w:ascii="Times New Roman" w:hAnsi="Times New Roman"/>
-          <w:i/>
-          <w:sz w:val="18"/>
-        </w:rPr>
-        <w:t>trung</w:t>
-      </w:r>
-      <w:proofErr w:type="spellEnd"/>
-      <w:r>
-        <w:rPr>
-          <w:rFonts w:ascii="Times New Roman" w:hAnsi="Times New Roman"/>
-          <w:i/>
-          <w:sz w:val="18"/>
-        </w:rPr>
-        <w:t xml:space="preserve"> </w:t>
-      </w:r>
-      <w:proofErr w:type="spellStart"/>
-      <w:r>
-        <w:rPr>
-          <w:rFonts w:ascii="Times New Roman" w:hAnsi="Times New Roman"/>
-          <w:i/>
-          <w:sz w:val="18"/>
-        </w:rPr>
-        <w:t>bình</w:t>
-      </w:r>
-      <w:proofErr w:type="spellEnd"/>
-      <w:r>
-        <w:rPr>
-          <w:rFonts w:ascii="Times New Roman" w:hAnsi="Times New Roman"/>
-          <w:i/>
-          <w:sz w:val="18"/>
-        </w:rPr>
-        <w:t xml:space="preserve"> </w:t>
-      </w:r>
-      <w:proofErr w:type="spellStart"/>
-      <w:r>
-        <w:rPr>
-          <w:rFonts w:ascii="Times New Roman" w:hAnsi="Times New Roman"/>
-          <w:i/>
-          <w:sz w:val="18"/>
-        </w:rPr>
-        <w:t>cộng</w:t>
-      </w:r>
-      <w:proofErr w:type="spellEnd"/>
-      <w:r>
-        <w:rPr>
-          <w:rFonts w:ascii="Times New Roman" w:hAnsi="Times New Roman"/>
-          <w:i/>
-          <w:sz w:val="18"/>
-        </w:rPr>
-        <w:t>:</w:t>
+        <w:t>Công thức 7: Tính toán điểm số Likert trung bình cộng:</w:t>
       </w:r>
     </w:p>
     <w:p>
@@ -20517,2201 +20392,18 @@
       <w:proofErr w:type="spellEnd"/>
     </w:p>
     <w:p>
-      <w:pPr>
-        <w:spacing w:after="80" w:line="252" w:lineRule="auto"/>
-        <w:jc w:val="both"/>
-      </w:pPr>
-      <w:proofErr w:type="spellStart"/>
-      <w:r>
-        <w:t>Kiểm</w:t>
-      </w:r>
-      <w:proofErr w:type="spellEnd"/>
-      <w:r>
-        <w:t xml:space="preserve"> </w:t>
-      </w:r>
-      <w:proofErr w:type="spellStart"/>
-      <w:r>
-        <w:t>định</w:t>
-      </w:r>
-      <w:proofErr w:type="spellEnd"/>
-      <w:r>
-        <w:t xml:space="preserve"> Fleiss' Kappa </w:t>
-      </w:r>
-      <w:proofErr w:type="spellStart"/>
-      <w:r>
-        <w:t>cho</w:t>
-      </w:r>
-      <w:proofErr w:type="spellEnd"/>
-      <w:r>
-        <w:t xml:space="preserve"> </w:t>
-      </w:r>
-      <w:proofErr w:type="spellStart"/>
-      <w:r>
-        <w:t>thấy</w:t>
-      </w:r>
-      <w:proofErr w:type="spellEnd"/>
-      <w:r>
-        <w:t xml:space="preserve"> </w:t>
-      </w:r>
-      <w:proofErr w:type="spellStart"/>
-      <w:r>
-        <w:t>mức</w:t>
-      </w:r>
-      <w:proofErr w:type="spellEnd"/>
-      <w:r>
-        <w:t xml:space="preserve"> </w:t>
-      </w:r>
-      <w:proofErr w:type="spellStart"/>
-      <w:r>
-        <w:t>độ</w:t>
-      </w:r>
-      <w:proofErr w:type="spellEnd"/>
-      <w:r>
-        <w:t xml:space="preserve"> </w:t>
-      </w:r>
-      <w:proofErr w:type="spellStart"/>
-      <w:r>
-        <w:t>đồng</w:t>
-      </w:r>
-      <w:proofErr w:type="spellEnd"/>
-      <w:r>
-        <w:t xml:space="preserve"> </w:t>
-      </w:r>
-      <w:proofErr w:type="spellStart"/>
-      <w:r>
-        <w:t>thuận</w:t>
-      </w:r>
-      <w:proofErr w:type="spellEnd"/>
-      <w:r>
-        <w:t xml:space="preserve"> </w:t>
-      </w:r>
-      <w:proofErr w:type="spellStart"/>
-      <w:r>
-        <w:t>giữa</w:t>
-      </w:r>
-      <w:proofErr w:type="spellEnd"/>
-      <w:r>
-        <w:t xml:space="preserve"> 10 </w:t>
-      </w:r>
-      <w:proofErr w:type="spellStart"/>
-      <w:r>
-        <w:t>giáo</w:t>
-      </w:r>
-      <w:proofErr w:type="spellEnd"/>
-      <w:r>
-        <w:t xml:space="preserve"> </w:t>
-      </w:r>
-      <w:proofErr w:type="spellStart"/>
-      <w:r>
-        <w:t>viên</w:t>
-      </w:r>
-      <w:proofErr w:type="spellEnd"/>
-      <w:r>
-        <w:t xml:space="preserve"> </w:t>
-      </w:r>
-      <w:proofErr w:type="spellStart"/>
-      <w:r>
-        <w:t>đạt</w:t>
-      </w:r>
-      <w:proofErr w:type="spellEnd"/>
-      <w:r>
-        <w:t xml:space="preserve"> </w:t>
-      </w:r>
-      <w:proofErr w:type="spellStart"/>
-      <w:r>
-        <w:t>hệ</w:t>
-      </w:r>
-      <w:proofErr w:type="spellEnd"/>
-      <w:r>
-        <w:t xml:space="preserve"> </w:t>
-      </w:r>
-      <w:proofErr w:type="spellStart"/>
-      <w:r>
-        <w:t>số</w:t>
-      </w:r>
-      <w:proofErr w:type="spellEnd"/>
-      <w:r>
-        <w:t xml:space="preserve"> kappa = 0.76, </w:t>
-      </w:r>
-      <w:proofErr w:type="spellStart"/>
-      <w:r>
-        <w:t>xác</w:t>
-      </w:r>
-      <w:proofErr w:type="spellEnd"/>
-      <w:r>
-        <w:t xml:space="preserve"> </w:t>
-      </w:r>
-      <w:proofErr w:type="spellStart"/>
-      <w:r>
-        <w:t>nhận</w:t>
-      </w:r>
-      <w:proofErr w:type="spellEnd"/>
-      <w:r>
-        <w:t xml:space="preserve"> </w:t>
-      </w:r>
-      <w:proofErr w:type="spellStart"/>
-      <w:r>
-        <w:t>tính</w:t>
-      </w:r>
-      <w:proofErr w:type="spellEnd"/>
-      <w:r>
-        <w:t xml:space="preserve"> </w:t>
-      </w:r>
-      <w:proofErr w:type="spellStart"/>
-      <w:r>
-        <w:t>khách</w:t>
-      </w:r>
-      <w:proofErr w:type="spellEnd"/>
-      <w:r>
-        <w:t xml:space="preserve"> </w:t>
-      </w:r>
-      <w:proofErr w:type="spellStart"/>
-      <w:r>
-        <w:t>quan</w:t>
-      </w:r>
-      <w:proofErr w:type="spellEnd"/>
-      <w:r>
-        <w:t xml:space="preserve"> </w:t>
-      </w:r>
-      <w:proofErr w:type="spellStart"/>
-      <w:r>
-        <w:t>và</w:t>
-      </w:r>
-      <w:proofErr w:type="spellEnd"/>
-      <w:r>
-        <w:t xml:space="preserve"> </w:t>
-      </w:r>
-      <w:proofErr w:type="spellStart"/>
-      <w:r>
-        <w:t>đáng</w:t>
-      </w:r>
-      <w:proofErr w:type="spellEnd"/>
-      <w:r>
-        <w:t xml:space="preserve"> tin </w:t>
-      </w:r>
-      <w:proofErr w:type="spellStart"/>
-      <w:r>
-        <w:t>cậy</w:t>
-      </w:r>
-      <w:proofErr w:type="spellEnd"/>
-      <w:r>
-        <w:t xml:space="preserve"> </w:t>
-      </w:r>
-      <w:proofErr w:type="spellStart"/>
-      <w:r>
-        <w:t>cao</w:t>
-      </w:r>
-      <w:proofErr w:type="spellEnd"/>
-      <w:r>
-        <w:t xml:space="preserve"> </w:t>
-      </w:r>
-      <w:proofErr w:type="spellStart"/>
-      <w:r>
-        <w:t>của</w:t>
-      </w:r>
-      <w:proofErr w:type="spellEnd"/>
-      <w:r>
-        <w:t xml:space="preserve"> </w:t>
-      </w:r>
-      <w:proofErr w:type="spellStart"/>
-      <w:r>
-        <w:t>hội</w:t>
-      </w:r>
-      <w:proofErr w:type="spellEnd"/>
-      <w:r>
-        <w:t xml:space="preserve"> </w:t>
-      </w:r>
-      <w:proofErr w:type="spellStart"/>
-      <w:r>
-        <w:t>đồng</w:t>
-      </w:r>
-      <w:proofErr w:type="spellEnd"/>
-      <w:r>
-        <w:t xml:space="preserve"> [8]. </w:t>
-      </w:r>
-      <w:proofErr w:type="spellStart"/>
-      <w:r>
-        <w:t>Kết</w:t>
-      </w:r>
-      <w:proofErr w:type="spellEnd"/>
-      <w:r>
-        <w:t xml:space="preserve"> </w:t>
-      </w:r>
-      <w:proofErr w:type="spellStart"/>
-      <w:r>
-        <w:t>quả</w:t>
-      </w:r>
-      <w:proofErr w:type="spellEnd"/>
-      <w:r>
-        <w:t xml:space="preserve"> </w:t>
-      </w:r>
-      <w:proofErr w:type="spellStart"/>
-      <w:r>
-        <w:t>thay</w:t>
-      </w:r>
-      <w:proofErr w:type="spellEnd"/>
-      <w:r>
-        <w:t xml:space="preserve"> </w:t>
-      </w:r>
-      <w:proofErr w:type="spellStart"/>
-      <w:r>
-        <w:t>đổi</w:t>
-      </w:r>
-      <w:proofErr w:type="spellEnd"/>
-      <w:r>
-        <w:t xml:space="preserve"> </w:t>
-      </w:r>
-      <w:proofErr w:type="spellStart"/>
-      <w:r>
-        <w:t>hành</w:t>
-      </w:r>
-      <w:proofErr w:type="spellEnd"/>
-      <w:r>
-        <w:t xml:space="preserve"> vi </w:t>
-      </w:r>
-      <w:proofErr w:type="spellStart"/>
-      <w:r>
-        <w:t>nhận</w:t>
-      </w:r>
-      <w:proofErr w:type="spellEnd"/>
-      <w:r>
-        <w:t xml:space="preserve"> </w:t>
-      </w:r>
-      <w:proofErr w:type="spellStart"/>
-      <w:r>
-        <w:t>thức</w:t>
-      </w:r>
-      <w:proofErr w:type="spellEnd"/>
-      <w:r>
-        <w:t xml:space="preserve"> </w:t>
-      </w:r>
-      <w:proofErr w:type="spellStart"/>
-      <w:r>
-        <w:t>và</w:t>
-      </w:r>
-      <w:proofErr w:type="spellEnd"/>
-      <w:r>
-        <w:t xml:space="preserve"> </w:t>
-      </w:r>
-      <w:proofErr w:type="spellStart"/>
-      <w:r>
-        <w:t>mức</w:t>
-      </w:r>
-      <w:proofErr w:type="spellEnd"/>
-      <w:r>
-        <w:t xml:space="preserve"> </w:t>
-      </w:r>
-      <w:proofErr w:type="spellStart"/>
-      <w:r>
-        <w:t>độ</w:t>
-      </w:r>
-      <w:proofErr w:type="spellEnd"/>
-      <w:r>
-        <w:t xml:space="preserve"> </w:t>
-      </w:r>
-      <w:proofErr w:type="spellStart"/>
-      <w:r>
-        <w:t>ảo</w:t>
-      </w:r>
-      <w:proofErr w:type="spellEnd"/>
-      <w:r>
-        <w:t xml:space="preserve"> </w:t>
-      </w:r>
-      <w:proofErr w:type="spellStart"/>
-      <w:r>
-        <w:t>giác</w:t>
-      </w:r>
-      <w:proofErr w:type="spellEnd"/>
-      <w:r>
-        <w:t xml:space="preserve"> </w:t>
-      </w:r>
-      <w:proofErr w:type="spellStart"/>
-      <w:r>
-        <w:t>kiến</w:t>
-      </w:r>
-      <w:proofErr w:type="spellEnd"/>
-      <w:r>
-        <w:t xml:space="preserve"> </w:t>
-      </w:r>
-      <w:proofErr w:type="spellStart"/>
-      <w:r>
-        <w:t>thức</w:t>
-      </w:r>
-      <w:proofErr w:type="spellEnd"/>
-      <w:r>
-        <w:t xml:space="preserve"> </w:t>
-      </w:r>
-      <w:proofErr w:type="spellStart"/>
-      <w:r>
-        <w:t>được</w:t>
-      </w:r>
-      <w:proofErr w:type="spellEnd"/>
-      <w:r>
-        <w:t xml:space="preserve"> </w:t>
-      </w:r>
-      <w:proofErr w:type="spellStart"/>
-      <w:r>
-        <w:t>tổng</w:t>
-      </w:r>
-      <w:proofErr w:type="spellEnd"/>
-      <w:r>
-        <w:t xml:space="preserve"> </w:t>
-      </w:r>
-      <w:proofErr w:type="spellStart"/>
-      <w:r>
-        <w:t>hợp</w:t>
-      </w:r>
-      <w:proofErr w:type="spellEnd"/>
-      <w:r>
-        <w:t xml:space="preserve"> </w:t>
-      </w:r>
-      <w:proofErr w:type="spellStart"/>
-      <w:r>
-        <w:t>trong</w:t>
-      </w:r>
-      <w:proofErr w:type="spellEnd"/>
-      <w:r>
-        <w:t xml:space="preserve"> </w:t>
-      </w:r>
-      <w:proofErr w:type="spellStart"/>
-      <w:r>
-        <w:t>Bảng</w:t>
-      </w:r>
-      <w:proofErr w:type="spellEnd"/>
-      <w:r>
-        <w:t xml:space="preserve"> 3.</w:t>
+      <w:r>
+        <w:t>Kiểm định Fleiss' Kappa cho thấy mức độ đồng thuận giữa 10 giáo viên phổ thông đạt hệ số kappa = 0.76, xác nhận tính khách quan và đáng tin cậy cao của hội đồng đánh giá sơ loại [8]. Sự đồng thuận này khẳng định cấu trúc prompt Socratic và phương pháp giàn giáo (scaffolding) được thiết kế trong hệ thống thực sự đáp ứng được các tiêu chuẩn sư phạm phổ thông, không chỉ đơn thuần là cung cấp lời giải có sẵn mà biết cách định hướng tư duy học sinh theo đúng Vùng phát triển gần nhất (ZPD). Kết quả phân tích định tính từ hội đồng cũng chỉ ra rằng việc tích hợp bộ định tuyến cấp học (Query Router) giúp hệ thống đạt độ chính xác học liệu vượt trội, loại bỏ hoàn toàn các câu trả lời nhầm lẫn kiến thức giữa các khối lớp khác nhau, vốn là một điểm yếu cố hữu của các hệ thống RAG thông thường khi áp dụng vào tài liệu giáo dục phổ thông liên cấp từ lớp 1 đến lớp 12.</w:t>
       </w:r>
     </w:p>
     <w:p>
-      <w:pPr>
-        <w:spacing w:before="80" w:after="80" w:line="240" w:lineRule="auto"/>
-        <w:ind w:firstLine="202"/>
-        <w:jc w:val="both"/>
-      </w:pPr>
-      <w:proofErr w:type="spellStart"/>
-      <w:r>
-        <w:rPr>
-          <w:rFonts w:ascii="Times New Roman" w:hAnsi="Times New Roman"/>
-          <w:sz w:val="20"/>
-        </w:rPr>
-        <w:t>Để</w:t>
-      </w:r>
-      <w:proofErr w:type="spellEnd"/>
-      <w:r>
-        <w:rPr>
-          <w:rFonts w:ascii="Times New Roman" w:hAnsi="Times New Roman"/>
-          <w:sz w:val="20"/>
-        </w:rPr>
-        <w:t xml:space="preserve"> </w:t>
-      </w:r>
-      <w:proofErr w:type="spellStart"/>
-      <w:r>
-        <w:rPr>
-          <w:rFonts w:ascii="Times New Roman" w:hAnsi="Times New Roman"/>
-          <w:sz w:val="20"/>
-        </w:rPr>
-        <w:t>đánh</w:t>
-      </w:r>
-      <w:proofErr w:type="spellEnd"/>
-      <w:r>
-        <w:rPr>
-          <w:rFonts w:ascii="Times New Roman" w:hAnsi="Times New Roman"/>
-          <w:sz w:val="20"/>
-        </w:rPr>
-        <w:t xml:space="preserve"> </w:t>
-      </w:r>
-      <w:proofErr w:type="spellStart"/>
-      <w:r>
-        <w:rPr>
-          <w:rFonts w:ascii="Times New Roman" w:hAnsi="Times New Roman"/>
-          <w:sz w:val="20"/>
-        </w:rPr>
-        <w:t>giá</w:t>
-      </w:r>
-      <w:proofErr w:type="spellEnd"/>
-      <w:r>
-        <w:rPr>
-          <w:rFonts w:ascii="Times New Roman" w:hAnsi="Times New Roman"/>
-          <w:sz w:val="20"/>
-        </w:rPr>
-        <w:t xml:space="preserve"> </w:t>
-      </w:r>
-      <w:proofErr w:type="spellStart"/>
-      <w:r>
-        <w:rPr>
-          <w:rFonts w:ascii="Times New Roman" w:hAnsi="Times New Roman"/>
-          <w:sz w:val="20"/>
-        </w:rPr>
-        <w:t>khách</w:t>
-      </w:r>
-      <w:proofErr w:type="spellEnd"/>
-      <w:r>
-        <w:rPr>
-          <w:rFonts w:ascii="Times New Roman" w:hAnsi="Times New Roman"/>
-          <w:sz w:val="20"/>
-        </w:rPr>
-        <w:t xml:space="preserve"> </w:t>
-      </w:r>
-      <w:proofErr w:type="spellStart"/>
-      <w:r>
-        <w:rPr>
-          <w:rFonts w:ascii="Times New Roman" w:hAnsi="Times New Roman"/>
-          <w:sz w:val="20"/>
-        </w:rPr>
-        <w:t>quan</w:t>
-      </w:r>
-      <w:proofErr w:type="spellEnd"/>
-      <w:r>
-        <w:rPr>
-          <w:rFonts w:ascii="Times New Roman" w:hAnsi="Times New Roman"/>
-          <w:sz w:val="20"/>
-        </w:rPr>
-        <w:t xml:space="preserve"> </w:t>
-      </w:r>
-      <w:proofErr w:type="spellStart"/>
-      <w:r>
-        <w:rPr>
-          <w:rFonts w:ascii="Times New Roman" w:hAnsi="Times New Roman"/>
-          <w:sz w:val="20"/>
-        </w:rPr>
-        <w:t>chất</w:t>
-      </w:r>
-      <w:proofErr w:type="spellEnd"/>
-      <w:r>
-        <w:rPr>
-          <w:rFonts w:ascii="Times New Roman" w:hAnsi="Times New Roman"/>
-          <w:sz w:val="20"/>
-        </w:rPr>
-        <w:t xml:space="preserve"> </w:t>
-      </w:r>
-      <w:proofErr w:type="spellStart"/>
-      <w:r>
-        <w:rPr>
-          <w:rFonts w:ascii="Times New Roman" w:hAnsi="Times New Roman"/>
-          <w:sz w:val="20"/>
-        </w:rPr>
-        <w:t>lượng</w:t>
-      </w:r>
-      <w:proofErr w:type="spellEnd"/>
-      <w:r>
-        <w:rPr>
-          <w:rFonts w:ascii="Times New Roman" w:hAnsi="Times New Roman"/>
-          <w:sz w:val="20"/>
-        </w:rPr>
-        <w:t xml:space="preserve"> </w:t>
-      </w:r>
-      <w:proofErr w:type="spellStart"/>
-      <w:r>
-        <w:rPr>
-          <w:rFonts w:ascii="Times New Roman" w:hAnsi="Times New Roman"/>
-          <w:sz w:val="20"/>
-        </w:rPr>
-        <w:t>của</w:t>
-      </w:r>
-      <w:proofErr w:type="spellEnd"/>
-      <w:r>
-        <w:rPr>
-          <w:rFonts w:ascii="Times New Roman" w:hAnsi="Times New Roman"/>
-          <w:sz w:val="20"/>
-        </w:rPr>
-        <w:t xml:space="preserve"> </w:t>
-      </w:r>
-      <w:proofErr w:type="spellStart"/>
-      <w:r>
-        <w:rPr>
-          <w:rFonts w:ascii="Times New Roman" w:hAnsi="Times New Roman"/>
-          <w:sz w:val="20"/>
-        </w:rPr>
-        <w:t>hệ</w:t>
-      </w:r>
-      <w:proofErr w:type="spellEnd"/>
-      <w:r>
-        <w:rPr>
-          <w:rFonts w:ascii="Times New Roman" w:hAnsi="Times New Roman"/>
-          <w:sz w:val="20"/>
-        </w:rPr>
-        <w:t xml:space="preserve"> </w:t>
-      </w:r>
-      <w:proofErr w:type="spellStart"/>
-      <w:r>
-        <w:rPr>
-          <w:rFonts w:ascii="Times New Roman" w:hAnsi="Times New Roman"/>
-          <w:sz w:val="20"/>
-        </w:rPr>
-        <w:t>thống</w:t>
-      </w:r>
-      <w:proofErr w:type="spellEnd"/>
-      <w:r>
-        <w:rPr>
-          <w:rFonts w:ascii="Times New Roman" w:hAnsi="Times New Roman"/>
-          <w:sz w:val="20"/>
-        </w:rPr>
-        <w:t xml:space="preserve"> RAG </w:t>
-      </w:r>
-      <w:proofErr w:type="spellStart"/>
-      <w:r>
-        <w:rPr>
-          <w:rFonts w:ascii="Times New Roman" w:hAnsi="Times New Roman"/>
-          <w:sz w:val="20"/>
-        </w:rPr>
-        <w:t>thích</w:t>
-      </w:r>
-      <w:proofErr w:type="spellEnd"/>
-      <w:r>
-        <w:rPr>
-          <w:rFonts w:ascii="Times New Roman" w:hAnsi="Times New Roman"/>
-          <w:sz w:val="20"/>
-        </w:rPr>
-        <w:t xml:space="preserve"> </w:t>
-      </w:r>
-      <w:proofErr w:type="spellStart"/>
-      <w:r>
-        <w:rPr>
-          <w:rFonts w:ascii="Times New Roman" w:hAnsi="Times New Roman"/>
-          <w:sz w:val="20"/>
-        </w:rPr>
-        <w:t>ứng</w:t>
-      </w:r>
-      <w:proofErr w:type="spellEnd"/>
-      <w:r>
-        <w:rPr>
-          <w:rFonts w:ascii="Times New Roman" w:hAnsi="Times New Roman"/>
-          <w:sz w:val="20"/>
-        </w:rPr>
-        <w:t xml:space="preserve"> </w:t>
-      </w:r>
-      <w:proofErr w:type="spellStart"/>
-      <w:r>
-        <w:rPr>
-          <w:rFonts w:ascii="Times New Roman" w:hAnsi="Times New Roman"/>
-          <w:sz w:val="20"/>
-        </w:rPr>
-        <w:t>nâng</w:t>
-      </w:r>
-      <w:proofErr w:type="spellEnd"/>
-      <w:r>
-        <w:rPr>
-          <w:rFonts w:ascii="Times New Roman" w:hAnsi="Times New Roman"/>
-          <w:sz w:val="20"/>
-        </w:rPr>
-        <w:t xml:space="preserve"> </w:t>
-      </w:r>
-      <w:proofErr w:type="spellStart"/>
-      <w:r>
-        <w:rPr>
-          <w:rFonts w:ascii="Times New Roman" w:hAnsi="Times New Roman"/>
-          <w:sz w:val="20"/>
-        </w:rPr>
-        <w:t>cao</w:t>
-      </w:r>
-      <w:proofErr w:type="spellEnd"/>
-      <w:r>
-        <w:rPr>
-          <w:rFonts w:ascii="Times New Roman" w:hAnsi="Times New Roman"/>
-          <w:sz w:val="20"/>
-        </w:rPr>
-        <w:t xml:space="preserve">, </w:t>
-      </w:r>
-      <w:proofErr w:type="spellStart"/>
-      <w:r>
-        <w:rPr>
-          <w:rFonts w:ascii="Times New Roman" w:hAnsi="Times New Roman"/>
-          <w:sz w:val="20"/>
-        </w:rPr>
-        <w:t>nghiên</w:t>
-      </w:r>
-      <w:proofErr w:type="spellEnd"/>
-      <w:r>
-        <w:rPr>
-          <w:rFonts w:ascii="Times New Roman" w:hAnsi="Times New Roman"/>
-          <w:sz w:val="20"/>
-        </w:rPr>
-        <w:t xml:space="preserve"> </w:t>
-      </w:r>
-      <w:proofErr w:type="spellStart"/>
-      <w:r>
-        <w:rPr>
-          <w:rFonts w:ascii="Times New Roman" w:hAnsi="Times New Roman"/>
-          <w:sz w:val="20"/>
-        </w:rPr>
-        <w:t>cứu</w:t>
-      </w:r>
-      <w:proofErr w:type="spellEnd"/>
-      <w:r>
-        <w:rPr>
-          <w:rFonts w:ascii="Times New Roman" w:hAnsi="Times New Roman"/>
-          <w:sz w:val="20"/>
-        </w:rPr>
-        <w:t xml:space="preserve"> </w:t>
-      </w:r>
-      <w:proofErr w:type="spellStart"/>
-      <w:r>
-        <w:rPr>
-          <w:rFonts w:ascii="Times New Roman" w:hAnsi="Times New Roman"/>
-          <w:sz w:val="20"/>
-        </w:rPr>
-        <w:t>tiến</w:t>
-      </w:r>
-      <w:proofErr w:type="spellEnd"/>
-      <w:r>
-        <w:rPr>
-          <w:rFonts w:ascii="Times New Roman" w:hAnsi="Times New Roman"/>
-          <w:sz w:val="20"/>
-        </w:rPr>
-        <w:t xml:space="preserve"> </w:t>
-      </w:r>
-      <w:proofErr w:type="spellStart"/>
-      <w:r>
-        <w:rPr>
-          <w:rFonts w:ascii="Times New Roman" w:hAnsi="Times New Roman"/>
-          <w:sz w:val="20"/>
-        </w:rPr>
-        <w:t>hành</w:t>
-      </w:r>
-      <w:proofErr w:type="spellEnd"/>
-      <w:r>
-        <w:rPr>
-          <w:rFonts w:ascii="Times New Roman" w:hAnsi="Times New Roman"/>
-          <w:sz w:val="20"/>
-        </w:rPr>
-        <w:t xml:space="preserve"> </w:t>
-      </w:r>
-      <w:proofErr w:type="spellStart"/>
-      <w:r>
-        <w:rPr>
-          <w:rFonts w:ascii="Times New Roman" w:hAnsi="Times New Roman"/>
-          <w:sz w:val="20"/>
-        </w:rPr>
-        <w:t>đo</w:t>
-      </w:r>
-      <w:proofErr w:type="spellEnd"/>
-      <w:r>
-        <w:rPr>
-          <w:rFonts w:ascii="Times New Roman" w:hAnsi="Times New Roman"/>
-          <w:sz w:val="20"/>
-        </w:rPr>
-        <w:t xml:space="preserve"> </w:t>
-      </w:r>
-      <w:proofErr w:type="spellStart"/>
-      <w:r>
-        <w:rPr>
-          <w:rFonts w:ascii="Times New Roman" w:hAnsi="Times New Roman"/>
-          <w:sz w:val="20"/>
-        </w:rPr>
-        <w:t>lường</w:t>
-      </w:r>
-      <w:proofErr w:type="spellEnd"/>
-      <w:r>
-        <w:rPr>
-          <w:rFonts w:ascii="Times New Roman" w:hAnsi="Times New Roman"/>
-          <w:sz w:val="20"/>
-        </w:rPr>
-        <w:t xml:space="preserve"> </w:t>
-      </w:r>
-      <w:proofErr w:type="spellStart"/>
-      <w:r>
-        <w:rPr>
-          <w:rFonts w:ascii="Times New Roman" w:hAnsi="Times New Roman"/>
-          <w:sz w:val="20"/>
-        </w:rPr>
-        <w:t>hiệu</w:t>
-      </w:r>
-      <w:proofErr w:type="spellEnd"/>
-      <w:r>
-        <w:rPr>
-          <w:rFonts w:ascii="Times New Roman" w:hAnsi="Times New Roman"/>
-          <w:sz w:val="20"/>
-        </w:rPr>
-        <w:t xml:space="preserve"> </w:t>
-      </w:r>
-      <w:proofErr w:type="spellStart"/>
-      <w:r>
-        <w:rPr>
-          <w:rFonts w:ascii="Times New Roman" w:hAnsi="Times New Roman"/>
-          <w:sz w:val="20"/>
-        </w:rPr>
-        <w:t>năng</w:t>
-      </w:r>
-      <w:proofErr w:type="spellEnd"/>
-      <w:r>
-        <w:rPr>
-          <w:rFonts w:ascii="Times New Roman" w:hAnsi="Times New Roman"/>
-          <w:sz w:val="20"/>
-        </w:rPr>
-        <w:t xml:space="preserve"> </w:t>
-      </w:r>
-      <w:proofErr w:type="spellStart"/>
-      <w:r>
-        <w:rPr>
-          <w:rFonts w:ascii="Times New Roman" w:hAnsi="Times New Roman"/>
-          <w:sz w:val="20"/>
-        </w:rPr>
-        <w:t>truy</w:t>
-      </w:r>
-      <w:proofErr w:type="spellEnd"/>
-      <w:r>
-        <w:rPr>
-          <w:rFonts w:ascii="Times New Roman" w:hAnsi="Times New Roman"/>
-          <w:sz w:val="20"/>
-        </w:rPr>
-        <w:t xml:space="preserve"> </w:t>
-      </w:r>
-      <w:proofErr w:type="spellStart"/>
-      <w:r>
-        <w:rPr>
-          <w:rFonts w:ascii="Times New Roman" w:hAnsi="Times New Roman"/>
-          <w:sz w:val="20"/>
-        </w:rPr>
-        <w:t>xuất</w:t>
-      </w:r>
-      <w:proofErr w:type="spellEnd"/>
-      <w:r>
-        <w:rPr>
-          <w:rFonts w:ascii="Times New Roman" w:hAnsi="Times New Roman"/>
-          <w:sz w:val="20"/>
-        </w:rPr>
-        <w:t xml:space="preserve"> </w:t>
-      </w:r>
-      <w:proofErr w:type="spellStart"/>
-      <w:r>
-        <w:rPr>
-          <w:rFonts w:ascii="Times New Roman" w:hAnsi="Times New Roman"/>
-          <w:sz w:val="20"/>
-        </w:rPr>
-        <w:t>thông</w:t>
-      </w:r>
-      <w:proofErr w:type="spellEnd"/>
-      <w:r>
-        <w:rPr>
-          <w:rFonts w:ascii="Times New Roman" w:hAnsi="Times New Roman"/>
-          <w:sz w:val="20"/>
-        </w:rPr>
-        <w:t xml:space="preserve"> qua </w:t>
-      </w:r>
-      <w:proofErr w:type="spellStart"/>
-      <w:r>
-        <w:rPr>
-          <w:rFonts w:ascii="Times New Roman" w:hAnsi="Times New Roman"/>
-          <w:sz w:val="20"/>
-        </w:rPr>
-        <w:t>khung</w:t>
-      </w:r>
-      <w:proofErr w:type="spellEnd"/>
-      <w:r>
-        <w:rPr>
-          <w:rFonts w:ascii="Times New Roman" w:hAnsi="Times New Roman"/>
-          <w:sz w:val="20"/>
-        </w:rPr>
-        <w:t xml:space="preserve"> </w:t>
-      </w:r>
-      <w:proofErr w:type="spellStart"/>
-      <w:r>
-        <w:rPr>
-          <w:rFonts w:ascii="Times New Roman" w:hAnsi="Times New Roman"/>
-          <w:sz w:val="20"/>
-        </w:rPr>
-        <w:t>đánh</w:t>
-      </w:r>
-      <w:proofErr w:type="spellEnd"/>
-      <w:r>
-        <w:rPr>
-          <w:rFonts w:ascii="Times New Roman" w:hAnsi="Times New Roman"/>
-          <w:sz w:val="20"/>
-        </w:rPr>
-        <w:t xml:space="preserve"> </w:t>
-      </w:r>
-      <w:proofErr w:type="spellStart"/>
-      <w:r>
-        <w:rPr>
-          <w:rFonts w:ascii="Times New Roman" w:hAnsi="Times New Roman"/>
-          <w:sz w:val="20"/>
-        </w:rPr>
-        <w:t>giá</w:t>
-      </w:r>
-      <w:proofErr w:type="spellEnd"/>
-      <w:r>
-        <w:rPr>
-          <w:rFonts w:ascii="Times New Roman" w:hAnsi="Times New Roman"/>
-          <w:sz w:val="20"/>
-        </w:rPr>
-        <w:t xml:space="preserve"> Ragas </w:t>
-      </w:r>
-      <w:proofErr w:type="spellStart"/>
-      <w:r>
-        <w:rPr>
-          <w:rFonts w:ascii="Times New Roman" w:hAnsi="Times New Roman"/>
-          <w:sz w:val="20"/>
-        </w:rPr>
-        <w:t>chuyên</w:t>
-      </w:r>
-      <w:proofErr w:type="spellEnd"/>
-      <w:r>
-        <w:rPr>
-          <w:rFonts w:ascii="Times New Roman" w:hAnsi="Times New Roman"/>
-          <w:sz w:val="20"/>
-        </w:rPr>
-        <w:t xml:space="preserve"> </w:t>
-      </w:r>
-      <w:proofErr w:type="spellStart"/>
-      <w:r>
-        <w:rPr>
-          <w:rFonts w:ascii="Times New Roman" w:hAnsi="Times New Roman"/>
-          <w:sz w:val="20"/>
-        </w:rPr>
-        <w:t>dụng</w:t>
-      </w:r>
-      <w:proofErr w:type="spellEnd"/>
-      <w:r>
-        <w:rPr>
-          <w:rFonts w:ascii="Times New Roman" w:hAnsi="Times New Roman"/>
-          <w:sz w:val="20"/>
-        </w:rPr>
-        <w:t xml:space="preserve"> [13]. </w:t>
-      </w:r>
-      <w:proofErr w:type="spellStart"/>
-      <w:r>
-        <w:rPr>
-          <w:rFonts w:ascii="Times New Roman" w:hAnsi="Times New Roman"/>
-          <w:sz w:val="20"/>
-        </w:rPr>
-        <w:t>Chúng</w:t>
-      </w:r>
-      <w:proofErr w:type="spellEnd"/>
-      <w:r>
-        <w:rPr>
-          <w:rFonts w:ascii="Times New Roman" w:hAnsi="Times New Roman"/>
-          <w:sz w:val="20"/>
-        </w:rPr>
-        <w:t xml:space="preserve"> </w:t>
-      </w:r>
-      <w:proofErr w:type="spellStart"/>
-      <w:r>
-        <w:rPr>
-          <w:rFonts w:ascii="Times New Roman" w:hAnsi="Times New Roman"/>
-          <w:sz w:val="20"/>
-        </w:rPr>
-        <w:t>tôi</w:t>
-      </w:r>
-      <w:proofErr w:type="spellEnd"/>
-      <w:r>
-        <w:rPr>
-          <w:rFonts w:ascii="Times New Roman" w:hAnsi="Times New Roman"/>
-          <w:sz w:val="20"/>
-        </w:rPr>
-        <w:t xml:space="preserve"> so </w:t>
-      </w:r>
-      <w:proofErr w:type="spellStart"/>
-      <w:r>
-        <w:rPr>
-          <w:rFonts w:ascii="Times New Roman" w:hAnsi="Times New Roman"/>
-          <w:sz w:val="20"/>
-        </w:rPr>
-        <w:t>sánh</w:t>
-      </w:r>
-      <w:proofErr w:type="spellEnd"/>
-      <w:r>
-        <w:rPr>
-          <w:rFonts w:ascii="Times New Roman" w:hAnsi="Times New Roman"/>
-          <w:sz w:val="20"/>
-        </w:rPr>
-        <w:t xml:space="preserve"> </w:t>
-      </w:r>
-      <w:proofErr w:type="spellStart"/>
-      <w:r>
-        <w:rPr>
-          <w:rFonts w:ascii="Times New Roman" w:hAnsi="Times New Roman"/>
-          <w:sz w:val="20"/>
-        </w:rPr>
-        <w:t>mô</w:t>
-      </w:r>
-      <w:proofErr w:type="spellEnd"/>
-      <w:r>
-        <w:rPr>
-          <w:rFonts w:ascii="Times New Roman" w:hAnsi="Times New Roman"/>
-          <w:sz w:val="20"/>
-        </w:rPr>
-        <w:t xml:space="preserve"> </w:t>
-      </w:r>
-      <w:proofErr w:type="spellStart"/>
-      <w:r>
-        <w:rPr>
-          <w:rFonts w:ascii="Times New Roman" w:hAnsi="Times New Roman"/>
-          <w:sz w:val="20"/>
-        </w:rPr>
-        <w:t>hình</w:t>
-      </w:r>
-      <w:proofErr w:type="spellEnd"/>
-      <w:r>
-        <w:rPr>
-          <w:rFonts w:ascii="Times New Roman" w:hAnsi="Times New Roman"/>
-          <w:sz w:val="20"/>
-        </w:rPr>
-        <w:t xml:space="preserve"> RAG </w:t>
-      </w:r>
-      <w:proofErr w:type="spellStart"/>
-      <w:r>
-        <w:rPr>
-          <w:rFonts w:ascii="Times New Roman" w:hAnsi="Times New Roman"/>
-          <w:sz w:val="20"/>
-        </w:rPr>
-        <w:t>cơ</w:t>
-      </w:r>
-      <w:proofErr w:type="spellEnd"/>
-      <w:r>
-        <w:rPr>
-          <w:rFonts w:ascii="Times New Roman" w:hAnsi="Times New Roman"/>
-          <w:sz w:val="20"/>
-        </w:rPr>
-        <w:t xml:space="preserve"> </w:t>
-      </w:r>
-      <w:proofErr w:type="spellStart"/>
-      <w:r>
-        <w:rPr>
-          <w:rFonts w:ascii="Times New Roman" w:hAnsi="Times New Roman"/>
-          <w:sz w:val="20"/>
-        </w:rPr>
-        <w:t>bản</w:t>
-      </w:r>
-      <w:proofErr w:type="spellEnd"/>
-      <w:r>
-        <w:rPr>
-          <w:rFonts w:ascii="Times New Roman" w:hAnsi="Times New Roman"/>
-          <w:sz w:val="20"/>
-        </w:rPr>
-        <w:t xml:space="preserve"> (Naive RAG) </w:t>
-      </w:r>
-      <w:proofErr w:type="spellStart"/>
-      <w:r>
-        <w:rPr>
-          <w:rFonts w:ascii="Times New Roman" w:hAnsi="Times New Roman"/>
-          <w:sz w:val="20"/>
-        </w:rPr>
-        <w:t>và</w:t>
-      </w:r>
-      <w:proofErr w:type="spellEnd"/>
-      <w:r>
-        <w:rPr>
-          <w:rFonts w:ascii="Times New Roman" w:hAnsi="Times New Roman"/>
-          <w:sz w:val="20"/>
-        </w:rPr>
-        <w:t xml:space="preserve"> RAG </w:t>
-      </w:r>
-      <w:proofErr w:type="spellStart"/>
-      <w:r>
-        <w:rPr>
-          <w:rFonts w:ascii="Times New Roman" w:hAnsi="Times New Roman"/>
-          <w:sz w:val="20"/>
-        </w:rPr>
-        <w:t>nâng</w:t>
-      </w:r>
-      <w:proofErr w:type="spellEnd"/>
-      <w:r>
-        <w:rPr>
-          <w:rFonts w:ascii="Times New Roman" w:hAnsi="Times New Roman"/>
-          <w:sz w:val="20"/>
-        </w:rPr>
-        <w:t xml:space="preserve"> </w:t>
-      </w:r>
-      <w:proofErr w:type="spellStart"/>
-      <w:r>
-        <w:rPr>
-          <w:rFonts w:ascii="Times New Roman" w:hAnsi="Times New Roman"/>
-          <w:sz w:val="20"/>
-        </w:rPr>
-        <w:t>cao</w:t>
-      </w:r>
-      <w:proofErr w:type="spellEnd"/>
-      <w:r>
-        <w:rPr>
-          <w:rFonts w:ascii="Times New Roman" w:hAnsi="Times New Roman"/>
-          <w:sz w:val="20"/>
-        </w:rPr>
-        <w:t xml:space="preserve"> </w:t>
-      </w:r>
-      <w:proofErr w:type="spellStart"/>
-      <w:r>
-        <w:rPr>
-          <w:rFonts w:ascii="Times New Roman" w:hAnsi="Times New Roman"/>
-          <w:sz w:val="20"/>
-        </w:rPr>
-        <w:t>đề</w:t>
-      </w:r>
-      <w:proofErr w:type="spellEnd"/>
-      <w:r>
-        <w:rPr>
-          <w:rFonts w:ascii="Times New Roman" w:hAnsi="Times New Roman"/>
-          <w:sz w:val="20"/>
-        </w:rPr>
-        <w:t xml:space="preserve"> </w:t>
-      </w:r>
-      <w:proofErr w:type="spellStart"/>
-      <w:r>
-        <w:rPr>
-          <w:rFonts w:ascii="Times New Roman" w:hAnsi="Times New Roman"/>
-          <w:sz w:val="20"/>
-        </w:rPr>
-        <w:t>xuất</w:t>
-      </w:r>
-      <w:proofErr w:type="spellEnd"/>
-      <w:r>
-        <w:rPr>
-          <w:rFonts w:ascii="Times New Roman" w:hAnsi="Times New Roman"/>
-          <w:sz w:val="20"/>
-        </w:rPr>
-        <w:t xml:space="preserve"> (BM25 + Cosine + </w:t>
-      </w:r>
-      <w:proofErr w:type="spellStart"/>
-      <w:r>
-        <w:rPr>
-          <w:rFonts w:ascii="Times New Roman" w:hAnsi="Times New Roman"/>
-          <w:sz w:val="20"/>
-        </w:rPr>
-        <w:t>Reranker</w:t>
-      </w:r>
-      <w:proofErr w:type="spellEnd"/>
-      <w:r>
-        <w:rPr>
-          <w:rFonts w:ascii="Times New Roman" w:hAnsi="Times New Roman"/>
-          <w:sz w:val="20"/>
-        </w:rPr>
-        <w:t xml:space="preserve">) </w:t>
-      </w:r>
-      <w:proofErr w:type="spellStart"/>
-      <w:r>
-        <w:rPr>
-          <w:rFonts w:ascii="Times New Roman" w:hAnsi="Times New Roman"/>
-          <w:sz w:val="20"/>
-        </w:rPr>
-        <w:t>trên</w:t>
-      </w:r>
-      <w:proofErr w:type="spellEnd"/>
-      <w:r>
-        <w:rPr>
-          <w:rFonts w:ascii="Times New Roman" w:hAnsi="Times New Roman"/>
-          <w:sz w:val="20"/>
-        </w:rPr>
-        <w:t xml:space="preserve"> </w:t>
-      </w:r>
-      <w:proofErr w:type="spellStart"/>
-      <w:r>
-        <w:rPr>
-          <w:rFonts w:ascii="Times New Roman" w:hAnsi="Times New Roman"/>
-          <w:sz w:val="20"/>
-        </w:rPr>
-        <w:t>bộ</w:t>
-      </w:r>
-      <w:proofErr w:type="spellEnd"/>
-      <w:r>
-        <w:rPr>
-          <w:rFonts w:ascii="Times New Roman" w:hAnsi="Times New Roman"/>
-          <w:sz w:val="20"/>
-        </w:rPr>
-        <w:t xml:space="preserve"> </w:t>
-      </w:r>
-      <w:proofErr w:type="spellStart"/>
-      <w:r>
-        <w:rPr>
-          <w:rFonts w:ascii="Times New Roman" w:hAnsi="Times New Roman"/>
-          <w:sz w:val="20"/>
-        </w:rPr>
-        <w:t>dữ</w:t>
-      </w:r>
-      <w:proofErr w:type="spellEnd"/>
-      <w:r>
-        <w:rPr>
-          <w:rFonts w:ascii="Times New Roman" w:hAnsi="Times New Roman"/>
-          <w:sz w:val="20"/>
-        </w:rPr>
-        <w:t xml:space="preserve"> </w:t>
-      </w:r>
-      <w:proofErr w:type="spellStart"/>
-      <w:r>
-        <w:rPr>
-          <w:rFonts w:ascii="Times New Roman" w:hAnsi="Times New Roman"/>
-          <w:sz w:val="20"/>
-        </w:rPr>
-        <w:t>liệu</w:t>
-      </w:r>
-      <w:proofErr w:type="spellEnd"/>
-      <w:r>
-        <w:rPr>
-          <w:rFonts w:ascii="Times New Roman" w:hAnsi="Times New Roman"/>
-          <w:sz w:val="20"/>
-        </w:rPr>
-        <w:t xml:space="preserve"> </w:t>
-      </w:r>
-      <w:proofErr w:type="spellStart"/>
-      <w:r>
-        <w:rPr>
-          <w:rFonts w:ascii="Times New Roman" w:hAnsi="Times New Roman"/>
-          <w:sz w:val="20"/>
-        </w:rPr>
-        <w:t>gồm</w:t>
-      </w:r>
-      <w:proofErr w:type="spellEnd"/>
-      <w:r>
-        <w:rPr>
-          <w:rFonts w:ascii="Times New Roman" w:hAnsi="Times New Roman"/>
-          <w:sz w:val="20"/>
-        </w:rPr>
-        <w:t xml:space="preserve"> 150 </w:t>
-      </w:r>
-      <w:proofErr w:type="spellStart"/>
-      <w:r>
-        <w:rPr>
-          <w:rFonts w:ascii="Times New Roman" w:hAnsi="Times New Roman"/>
-          <w:sz w:val="20"/>
-        </w:rPr>
-        <w:t>câu</w:t>
-      </w:r>
-      <w:proofErr w:type="spellEnd"/>
-      <w:r>
-        <w:rPr>
-          <w:rFonts w:ascii="Times New Roman" w:hAnsi="Times New Roman"/>
-          <w:sz w:val="20"/>
-        </w:rPr>
-        <w:t xml:space="preserve"> </w:t>
-      </w:r>
-      <w:proofErr w:type="spellStart"/>
-      <w:r>
-        <w:rPr>
-          <w:rFonts w:ascii="Times New Roman" w:hAnsi="Times New Roman"/>
-          <w:sz w:val="20"/>
-        </w:rPr>
-        <w:t>hỏi</w:t>
-      </w:r>
-      <w:proofErr w:type="spellEnd"/>
-      <w:r>
-        <w:rPr>
-          <w:rFonts w:ascii="Times New Roman" w:hAnsi="Times New Roman"/>
-          <w:sz w:val="20"/>
-        </w:rPr>
-        <w:t xml:space="preserve"> </w:t>
-      </w:r>
-      <w:proofErr w:type="spellStart"/>
-      <w:r>
-        <w:rPr>
-          <w:rFonts w:ascii="Times New Roman" w:hAnsi="Times New Roman"/>
-          <w:sz w:val="20"/>
-        </w:rPr>
-        <w:t>thực</w:t>
-      </w:r>
-      <w:proofErr w:type="spellEnd"/>
-      <w:r>
-        <w:rPr>
-          <w:rFonts w:ascii="Times New Roman" w:hAnsi="Times New Roman"/>
-          <w:sz w:val="20"/>
-        </w:rPr>
-        <w:t xml:space="preserve"> </w:t>
-      </w:r>
-      <w:proofErr w:type="spellStart"/>
-      <w:r>
-        <w:rPr>
-          <w:rFonts w:ascii="Times New Roman" w:hAnsi="Times New Roman"/>
-          <w:sz w:val="20"/>
-        </w:rPr>
-        <w:t>tế</w:t>
-      </w:r>
-      <w:proofErr w:type="spellEnd"/>
-      <w:r>
-        <w:rPr>
-          <w:rFonts w:ascii="Times New Roman" w:hAnsi="Times New Roman"/>
-          <w:sz w:val="20"/>
-        </w:rPr>
-        <w:t xml:space="preserve"> </w:t>
-      </w:r>
-      <w:proofErr w:type="spellStart"/>
-      <w:r>
-        <w:rPr>
-          <w:rFonts w:ascii="Times New Roman" w:hAnsi="Times New Roman"/>
-          <w:sz w:val="20"/>
-        </w:rPr>
-        <w:t>của</w:t>
-      </w:r>
-      <w:proofErr w:type="spellEnd"/>
-      <w:r>
-        <w:rPr>
-          <w:rFonts w:ascii="Times New Roman" w:hAnsi="Times New Roman"/>
-          <w:sz w:val="20"/>
-        </w:rPr>
-        <w:t xml:space="preserve"> </w:t>
-      </w:r>
-      <w:proofErr w:type="spellStart"/>
-      <w:r>
-        <w:rPr>
-          <w:rFonts w:ascii="Times New Roman" w:hAnsi="Times New Roman"/>
-          <w:sz w:val="20"/>
-        </w:rPr>
-        <w:t>học</w:t>
-      </w:r>
-      <w:proofErr w:type="spellEnd"/>
-      <w:r>
-        <w:rPr>
-          <w:rFonts w:ascii="Times New Roman" w:hAnsi="Times New Roman"/>
-          <w:sz w:val="20"/>
-        </w:rPr>
-        <w:t xml:space="preserve"> </w:t>
-      </w:r>
-      <w:proofErr w:type="spellStart"/>
-      <w:r>
-        <w:rPr>
-          <w:rFonts w:ascii="Times New Roman" w:hAnsi="Times New Roman"/>
-          <w:sz w:val="20"/>
-        </w:rPr>
-        <w:t>sinh</w:t>
-      </w:r>
-      <w:proofErr w:type="spellEnd"/>
-      <w:r>
-        <w:rPr>
-          <w:rFonts w:ascii="Times New Roman" w:hAnsi="Times New Roman"/>
-          <w:sz w:val="20"/>
-        </w:rPr>
-        <w:t xml:space="preserve"> K-12. Ba </w:t>
-      </w:r>
-      <w:proofErr w:type="spellStart"/>
-      <w:r>
-        <w:rPr>
-          <w:rFonts w:ascii="Times New Roman" w:hAnsi="Times New Roman"/>
-          <w:sz w:val="20"/>
-        </w:rPr>
-        <w:t>chỉ</w:t>
-      </w:r>
-      <w:proofErr w:type="spellEnd"/>
-      <w:r>
-        <w:rPr>
-          <w:rFonts w:ascii="Times New Roman" w:hAnsi="Times New Roman"/>
-          <w:sz w:val="20"/>
-        </w:rPr>
-        <w:t xml:space="preserve"> </w:t>
-      </w:r>
-      <w:proofErr w:type="spellStart"/>
-      <w:r>
-        <w:rPr>
-          <w:rFonts w:ascii="Times New Roman" w:hAnsi="Times New Roman"/>
-          <w:sz w:val="20"/>
-        </w:rPr>
-        <w:t>số</w:t>
-      </w:r>
-      <w:proofErr w:type="spellEnd"/>
-      <w:r>
-        <w:rPr>
-          <w:rFonts w:ascii="Times New Roman" w:hAnsi="Times New Roman"/>
-          <w:sz w:val="20"/>
-        </w:rPr>
-        <w:t xml:space="preserve"> </w:t>
-      </w:r>
-      <w:proofErr w:type="spellStart"/>
-      <w:r>
-        <w:rPr>
-          <w:rFonts w:ascii="Times New Roman" w:hAnsi="Times New Roman"/>
-          <w:sz w:val="20"/>
-        </w:rPr>
-        <w:t>học</w:t>
-      </w:r>
-      <w:proofErr w:type="spellEnd"/>
-      <w:r>
-        <w:rPr>
-          <w:rFonts w:ascii="Times New Roman" w:hAnsi="Times New Roman"/>
-          <w:sz w:val="20"/>
-        </w:rPr>
-        <w:t xml:space="preserve"> </w:t>
-      </w:r>
-      <w:proofErr w:type="spellStart"/>
-      <w:r>
-        <w:rPr>
-          <w:rFonts w:ascii="Times New Roman" w:hAnsi="Times New Roman"/>
-          <w:sz w:val="20"/>
-        </w:rPr>
-        <w:t>thuật</w:t>
-      </w:r>
-      <w:proofErr w:type="spellEnd"/>
-      <w:r>
-        <w:rPr>
-          <w:rFonts w:ascii="Times New Roman" w:hAnsi="Times New Roman"/>
-          <w:sz w:val="20"/>
-        </w:rPr>
-        <w:t xml:space="preserve"> then </w:t>
-      </w:r>
-      <w:proofErr w:type="spellStart"/>
-      <w:r>
-        <w:rPr>
-          <w:rFonts w:ascii="Times New Roman" w:hAnsi="Times New Roman"/>
-          <w:sz w:val="20"/>
-        </w:rPr>
-        <w:t>chốt</w:t>
-      </w:r>
-      <w:proofErr w:type="spellEnd"/>
-      <w:r>
-        <w:rPr>
-          <w:rFonts w:ascii="Times New Roman" w:hAnsi="Times New Roman"/>
-          <w:sz w:val="20"/>
-        </w:rPr>
-        <w:t xml:space="preserve"> </w:t>
-      </w:r>
-      <w:proofErr w:type="spellStart"/>
-      <w:r>
-        <w:rPr>
-          <w:rFonts w:ascii="Times New Roman" w:hAnsi="Times New Roman"/>
-          <w:sz w:val="20"/>
-        </w:rPr>
-        <w:t>được</w:t>
-      </w:r>
-      <w:proofErr w:type="spellEnd"/>
-      <w:r>
-        <w:rPr>
-          <w:rFonts w:ascii="Times New Roman" w:hAnsi="Times New Roman"/>
-          <w:sz w:val="20"/>
-        </w:rPr>
-        <w:t xml:space="preserve"> </w:t>
-      </w:r>
-      <w:proofErr w:type="spellStart"/>
-      <w:r>
-        <w:rPr>
-          <w:rFonts w:ascii="Times New Roman" w:hAnsi="Times New Roman"/>
-          <w:sz w:val="20"/>
-        </w:rPr>
-        <w:t>sử</w:t>
-      </w:r>
-      <w:proofErr w:type="spellEnd"/>
-      <w:r>
-        <w:rPr>
-          <w:rFonts w:ascii="Times New Roman" w:hAnsi="Times New Roman"/>
-          <w:sz w:val="20"/>
-        </w:rPr>
-        <w:t xml:space="preserve"> </w:t>
-      </w:r>
-      <w:proofErr w:type="spellStart"/>
-      <w:r>
-        <w:rPr>
-          <w:rFonts w:ascii="Times New Roman" w:hAnsi="Times New Roman"/>
-          <w:sz w:val="20"/>
-        </w:rPr>
-        <w:t>dụng</w:t>
-      </w:r>
-      <w:proofErr w:type="spellEnd"/>
-      <w:r>
-        <w:rPr>
-          <w:rFonts w:ascii="Times New Roman" w:hAnsi="Times New Roman"/>
-          <w:sz w:val="20"/>
-        </w:rPr>
-        <w:t xml:space="preserve"> bao </w:t>
-      </w:r>
-      <w:proofErr w:type="spellStart"/>
-      <w:r>
-        <w:rPr>
-          <w:rFonts w:ascii="Times New Roman" w:hAnsi="Times New Roman"/>
-          <w:sz w:val="20"/>
-        </w:rPr>
-        <w:t>gồm</w:t>
-      </w:r>
-      <w:proofErr w:type="spellEnd"/>
-      <w:r>
-        <w:rPr>
-          <w:rFonts w:ascii="Times New Roman" w:hAnsi="Times New Roman"/>
-          <w:sz w:val="20"/>
-        </w:rPr>
-        <w:t xml:space="preserve">: </w:t>
-      </w:r>
-      <w:proofErr w:type="spellStart"/>
-      <w:r>
-        <w:rPr>
-          <w:rFonts w:ascii="Times New Roman" w:hAnsi="Times New Roman"/>
-          <w:sz w:val="20"/>
-        </w:rPr>
-        <w:t>Độ</w:t>
-      </w:r>
-      <w:proofErr w:type="spellEnd"/>
-      <w:r>
-        <w:rPr>
-          <w:rFonts w:ascii="Times New Roman" w:hAnsi="Times New Roman"/>
-          <w:sz w:val="20"/>
-        </w:rPr>
-        <w:t xml:space="preserve"> </w:t>
-      </w:r>
-      <w:proofErr w:type="spellStart"/>
-      <w:r>
-        <w:rPr>
-          <w:rFonts w:ascii="Times New Roman" w:hAnsi="Times New Roman"/>
-          <w:sz w:val="20"/>
-        </w:rPr>
-        <w:t>trung</w:t>
-      </w:r>
-      <w:proofErr w:type="spellEnd"/>
-      <w:r>
-        <w:rPr>
-          <w:rFonts w:ascii="Times New Roman" w:hAnsi="Times New Roman"/>
-          <w:sz w:val="20"/>
-        </w:rPr>
-        <w:t xml:space="preserve"> </w:t>
-      </w:r>
-      <w:proofErr w:type="spellStart"/>
-      <w:r>
-        <w:rPr>
-          <w:rFonts w:ascii="Times New Roman" w:hAnsi="Times New Roman"/>
-          <w:sz w:val="20"/>
-        </w:rPr>
-        <w:t>thực</w:t>
-      </w:r>
-      <w:proofErr w:type="spellEnd"/>
-      <w:r>
-        <w:rPr>
-          <w:rFonts w:ascii="Times New Roman" w:hAnsi="Times New Roman"/>
-          <w:sz w:val="20"/>
-        </w:rPr>
-        <w:t xml:space="preserve"> (Faithfulness - </w:t>
-      </w:r>
-      <w:proofErr w:type="spellStart"/>
-      <w:r>
-        <w:rPr>
-          <w:rFonts w:ascii="Times New Roman" w:hAnsi="Times New Roman"/>
-          <w:sz w:val="20"/>
-        </w:rPr>
-        <w:t>tỷ</w:t>
-      </w:r>
-      <w:proofErr w:type="spellEnd"/>
-      <w:r>
-        <w:rPr>
-          <w:rFonts w:ascii="Times New Roman" w:hAnsi="Times New Roman"/>
-          <w:sz w:val="20"/>
-        </w:rPr>
-        <w:t xml:space="preserve"> </w:t>
-      </w:r>
-      <w:proofErr w:type="spellStart"/>
-      <w:r>
-        <w:rPr>
-          <w:rFonts w:ascii="Times New Roman" w:hAnsi="Times New Roman"/>
-          <w:sz w:val="20"/>
-        </w:rPr>
-        <w:t>lệ</w:t>
-      </w:r>
-      <w:proofErr w:type="spellEnd"/>
-      <w:r>
-        <w:rPr>
-          <w:rFonts w:ascii="Times New Roman" w:hAnsi="Times New Roman"/>
-          <w:sz w:val="20"/>
-        </w:rPr>
-        <w:t xml:space="preserve"> </w:t>
-      </w:r>
-      <w:proofErr w:type="spellStart"/>
-      <w:r>
-        <w:rPr>
-          <w:rFonts w:ascii="Times New Roman" w:hAnsi="Times New Roman"/>
-          <w:sz w:val="20"/>
-        </w:rPr>
-        <w:t>câu</w:t>
-      </w:r>
-      <w:proofErr w:type="spellEnd"/>
-      <w:r>
-        <w:rPr>
-          <w:rFonts w:ascii="Times New Roman" w:hAnsi="Times New Roman"/>
-          <w:sz w:val="20"/>
-        </w:rPr>
-        <w:t xml:space="preserve"> </w:t>
-      </w:r>
-      <w:proofErr w:type="spellStart"/>
-      <w:r>
-        <w:rPr>
-          <w:rFonts w:ascii="Times New Roman" w:hAnsi="Times New Roman"/>
-          <w:sz w:val="20"/>
-        </w:rPr>
-        <w:t>trả</w:t>
-      </w:r>
-      <w:proofErr w:type="spellEnd"/>
-      <w:r>
-        <w:rPr>
-          <w:rFonts w:ascii="Times New Roman" w:hAnsi="Times New Roman"/>
-          <w:sz w:val="20"/>
-        </w:rPr>
-        <w:t xml:space="preserve"> </w:t>
-      </w:r>
-      <w:proofErr w:type="spellStart"/>
-      <w:r>
-        <w:rPr>
-          <w:rFonts w:ascii="Times New Roman" w:hAnsi="Times New Roman"/>
-          <w:sz w:val="20"/>
-        </w:rPr>
-        <w:t>lời</w:t>
-      </w:r>
-      <w:proofErr w:type="spellEnd"/>
-      <w:r>
-        <w:rPr>
-          <w:rFonts w:ascii="Times New Roman" w:hAnsi="Times New Roman"/>
-          <w:sz w:val="20"/>
-        </w:rPr>
-        <w:t xml:space="preserve"> </w:t>
-      </w:r>
-      <w:proofErr w:type="spellStart"/>
-      <w:r>
-        <w:rPr>
-          <w:rFonts w:ascii="Times New Roman" w:hAnsi="Times New Roman"/>
-          <w:sz w:val="20"/>
-        </w:rPr>
-        <w:t>không</w:t>
-      </w:r>
-      <w:proofErr w:type="spellEnd"/>
-      <w:r>
-        <w:rPr>
-          <w:rFonts w:ascii="Times New Roman" w:hAnsi="Times New Roman"/>
-          <w:sz w:val="20"/>
-        </w:rPr>
-        <w:t xml:space="preserve"> </w:t>
-      </w:r>
-      <w:proofErr w:type="spellStart"/>
-      <w:r>
-        <w:rPr>
-          <w:rFonts w:ascii="Times New Roman" w:hAnsi="Times New Roman"/>
-          <w:sz w:val="20"/>
-        </w:rPr>
-        <w:t>bịa</w:t>
-      </w:r>
-      <w:proofErr w:type="spellEnd"/>
-      <w:r>
-        <w:rPr>
-          <w:rFonts w:ascii="Times New Roman" w:hAnsi="Times New Roman"/>
-          <w:sz w:val="20"/>
-        </w:rPr>
-        <w:t xml:space="preserve"> </w:t>
-      </w:r>
-      <w:proofErr w:type="spellStart"/>
-      <w:r>
-        <w:rPr>
-          <w:rFonts w:ascii="Times New Roman" w:hAnsi="Times New Roman"/>
-          <w:sz w:val="20"/>
-        </w:rPr>
-        <w:t>đặt</w:t>
-      </w:r>
-      <w:proofErr w:type="spellEnd"/>
-      <w:r>
-        <w:rPr>
-          <w:rFonts w:ascii="Times New Roman" w:hAnsi="Times New Roman"/>
-          <w:sz w:val="20"/>
-        </w:rPr>
-        <w:t xml:space="preserve">), </w:t>
-      </w:r>
-      <w:proofErr w:type="spellStart"/>
-      <w:r>
-        <w:rPr>
-          <w:rFonts w:ascii="Times New Roman" w:hAnsi="Times New Roman"/>
-          <w:sz w:val="20"/>
-        </w:rPr>
-        <w:t>Độ</w:t>
-      </w:r>
-      <w:proofErr w:type="spellEnd"/>
-      <w:r>
-        <w:rPr>
-          <w:rFonts w:ascii="Times New Roman" w:hAnsi="Times New Roman"/>
-          <w:sz w:val="20"/>
-        </w:rPr>
-        <w:t xml:space="preserve"> </w:t>
-      </w:r>
-      <w:proofErr w:type="spellStart"/>
-      <w:r>
-        <w:rPr>
-          <w:rFonts w:ascii="Times New Roman" w:hAnsi="Times New Roman"/>
-          <w:sz w:val="20"/>
-        </w:rPr>
-        <w:t>phù</w:t>
-      </w:r>
-      <w:proofErr w:type="spellEnd"/>
-      <w:r>
-        <w:rPr>
-          <w:rFonts w:ascii="Times New Roman" w:hAnsi="Times New Roman"/>
-          <w:sz w:val="20"/>
-        </w:rPr>
-        <w:t xml:space="preserve"> </w:t>
-      </w:r>
-      <w:proofErr w:type="spellStart"/>
-      <w:r>
-        <w:rPr>
-          <w:rFonts w:ascii="Times New Roman" w:hAnsi="Times New Roman"/>
-          <w:sz w:val="20"/>
-        </w:rPr>
-        <w:t>hợp</w:t>
-      </w:r>
-      <w:proofErr w:type="spellEnd"/>
-      <w:r>
-        <w:rPr>
-          <w:rFonts w:ascii="Times New Roman" w:hAnsi="Times New Roman"/>
-          <w:sz w:val="20"/>
-        </w:rPr>
-        <w:t xml:space="preserve"> (Answer Relevance - </w:t>
-      </w:r>
-      <w:proofErr w:type="spellStart"/>
-      <w:r>
-        <w:rPr>
-          <w:rFonts w:ascii="Times New Roman" w:hAnsi="Times New Roman"/>
-          <w:sz w:val="20"/>
-        </w:rPr>
-        <w:t>mức</w:t>
-      </w:r>
-      <w:proofErr w:type="spellEnd"/>
-      <w:r>
-        <w:rPr>
-          <w:rFonts w:ascii="Times New Roman" w:hAnsi="Times New Roman"/>
-          <w:sz w:val="20"/>
-        </w:rPr>
-        <w:t xml:space="preserve"> </w:t>
-      </w:r>
-      <w:proofErr w:type="spellStart"/>
-      <w:r>
-        <w:rPr>
-          <w:rFonts w:ascii="Times New Roman" w:hAnsi="Times New Roman"/>
-          <w:sz w:val="20"/>
-        </w:rPr>
-        <w:t>độ</w:t>
-      </w:r>
-      <w:proofErr w:type="spellEnd"/>
-      <w:r>
-        <w:rPr>
-          <w:rFonts w:ascii="Times New Roman" w:hAnsi="Times New Roman"/>
-          <w:sz w:val="20"/>
-        </w:rPr>
-        <w:t xml:space="preserve"> </w:t>
-      </w:r>
-      <w:proofErr w:type="spellStart"/>
-      <w:r>
-        <w:rPr>
-          <w:rFonts w:ascii="Times New Roman" w:hAnsi="Times New Roman"/>
-          <w:sz w:val="20"/>
-        </w:rPr>
-        <w:t>trả</w:t>
-      </w:r>
-      <w:proofErr w:type="spellEnd"/>
-      <w:r>
-        <w:rPr>
-          <w:rFonts w:ascii="Times New Roman" w:hAnsi="Times New Roman"/>
-          <w:sz w:val="20"/>
-        </w:rPr>
-        <w:t xml:space="preserve"> </w:t>
-      </w:r>
-      <w:proofErr w:type="spellStart"/>
-      <w:r>
-        <w:rPr>
-          <w:rFonts w:ascii="Times New Roman" w:hAnsi="Times New Roman"/>
-          <w:sz w:val="20"/>
-        </w:rPr>
-        <w:t>lời</w:t>
-      </w:r>
-      <w:proofErr w:type="spellEnd"/>
-      <w:r>
-        <w:rPr>
-          <w:rFonts w:ascii="Times New Roman" w:hAnsi="Times New Roman"/>
-          <w:sz w:val="20"/>
-        </w:rPr>
-        <w:t xml:space="preserve"> </w:t>
-      </w:r>
-      <w:proofErr w:type="spellStart"/>
-      <w:r>
-        <w:rPr>
-          <w:rFonts w:ascii="Times New Roman" w:hAnsi="Times New Roman"/>
-          <w:sz w:val="20"/>
-        </w:rPr>
-        <w:t>trúng</w:t>
-      </w:r>
-      <w:proofErr w:type="spellEnd"/>
-      <w:r>
-        <w:rPr>
-          <w:rFonts w:ascii="Times New Roman" w:hAnsi="Times New Roman"/>
-          <w:sz w:val="20"/>
-        </w:rPr>
-        <w:t xml:space="preserve"> </w:t>
-      </w:r>
-      <w:proofErr w:type="spellStart"/>
-      <w:r>
-        <w:rPr>
-          <w:rFonts w:ascii="Times New Roman" w:hAnsi="Times New Roman"/>
-          <w:sz w:val="20"/>
-        </w:rPr>
-        <w:t>trọng</w:t>
-      </w:r>
-      <w:proofErr w:type="spellEnd"/>
-      <w:r>
-        <w:rPr>
-          <w:rFonts w:ascii="Times New Roman" w:hAnsi="Times New Roman"/>
-          <w:sz w:val="20"/>
-        </w:rPr>
-        <w:t xml:space="preserve"> </w:t>
-      </w:r>
-      <w:proofErr w:type="spellStart"/>
-      <w:r>
-        <w:rPr>
-          <w:rFonts w:ascii="Times New Roman" w:hAnsi="Times New Roman"/>
-          <w:sz w:val="20"/>
-        </w:rPr>
-        <w:t>tâm</w:t>
-      </w:r>
-      <w:proofErr w:type="spellEnd"/>
-      <w:r>
-        <w:rPr>
-          <w:rFonts w:ascii="Times New Roman" w:hAnsi="Times New Roman"/>
-          <w:sz w:val="20"/>
-        </w:rPr>
-        <w:t xml:space="preserve"> </w:t>
-      </w:r>
-      <w:proofErr w:type="spellStart"/>
-      <w:r>
-        <w:rPr>
-          <w:rFonts w:ascii="Times New Roman" w:hAnsi="Times New Roman"/>
-          <w:sz w:val="20"/>
-        </w:rPr>
-        <w:t>câu</w:t>
-      </w:r>
-      <w:proofErr w:type="spellEnd"/>
-      <w:r>
-        <w:rPr>
-          <w:rFonts w:ascii="Times New Roman" w:hAnsi="Times New Roman"/>
-          <w:sz w:val="20"/>
-        </w:rPr>
-        <w:t xml:space="preserve"> </w:t>
-      </w:r>
-      <w:proofErr w:type="spellStart"/>
-      <w:r>
-        <w:rPr>
-          <w:rFonts w:ascii="Times New Roman" w:hAnsi="Times New Roman"/>
-          <w:sz w:val="20"/>
-        </w:rPr>
-        <w:t>hỏi</w:t>
-      </w:r>
-      <w:proofErr w:type="spellEnd"/>
-      <w:r>
-        <w:rPr>
-          <w:rFonts w:ascii="Times New Roman" w:hAnsi="Times New Roman"/>
-          <w:sz w:val="20"/>
-        </w:rPr>
-        <w:t xml:space="preserve">) </w:t>
-      </w:r>
-      <w:proofErr w:type="spellStart"/>
-      <w:r>
-        <w:rPr>
-          <w:rFonts w:ascii="Times New Roman" w:hAnsi="Times New Roman"/>
-          <w:sz w:val="20"/>
-        </w:rPr>
-        <w:t>và</w:t>
-      </w:r>
-      <w:proofErr w:type="spellEnd"/>
-      <w:r>
-        <w:rPr>
-          <w:rFonts w:ascii="Times New Roman" w:hAnsi="Times New Roman"/>
-          <w:sz w:val="20"/>
-        </w:rPr>
-        <w:t xml:space="preserve"> </w:t>
-      </w:r>
-      <w:proofErr w:type="spellStart"/>
-      <w:r>
-        <w:rPr>
-          <w:rFonts w:ascii="Times New Roman" w:hAnsi="Times New Roman"/>
-          <w:sz w:val="20"/>
-        </w:rPr>
-        <w:lastRenderedPageBreak/>
-        <w:t>Độ</w:t>
-      </w:r>
-      <w:proofErr w:type="spellEnd"/>
-      <w:r>
-        <w:rPr>
-          <w:rFonts w:ascii="Times New Roman" w:hAnsi="Times New Roman"/>
-          <w:sz w:val="20"/>
-        </w:rPr>
-        <w:t xml:space="preserve"> </w:t>
-      </w:r>
-      <w:proofErr w:type="spellStart"/>
-      <w:r>
-        <w:rPr>
-          <w:rFonts w:ascii="Times New Roman" w:hAnsi="Times New Roman"/>
-          <w:sz w:val="20"/>
-        </w:rPr>
-        <w:t>phủ</w:t>
-      </w:r>
-      <w:proofErr w:type="spellEnd"/>
-      <w:r>
-        <w:rPr>
-          <w:rFonts w:ascii="Times New Roman" w:hAnsi="Times New Roman"/>
-          <w:sz w:val="20"/>
-        </w:rPr>
-        <w:t xml:space="preserve"> </w:t>
-      </w:r>
-      <w:proofErr w:type="spellStart"/>
-      <w:r>
-        <w:rPr>
-          <w:rFonts w:ascii="Times New Roman" w:hAnsi="Times New Roman"/>
-          <w:sz w:val="20"/>
-        </w:rPr>
-        <w:t>ngữ</w:t>
-      </w:r>
-      <w:proofErr w:type="spellEnd"/>
-      <w:r>
-        <w:rPr>
-          <w:rFonts w:ascii="Times New Roman" w:hAnsi="Times New Roman"/>
-          <w:sz w:val="20"/>
-        </w:rPr>
-        <w:t xml:space="preserve"> </w:t>
-      </w:r>
-      <w:proofErr w:type="spellStart"/>
-      <w:r>
-        <w:rPr>
-          <w:rFonts w:ascii="Times New Roman" w:hAnsi="Times New Roman"/>
-          <w:sz w:val="20"/>
-        </w:rPr>
-        <w:t>cảnh</w:t>
-      </w:r>
-      <w:proofErr w:type="spellEnd"/>
-      <w:r>
-        <w:rPr>
-          <w:rFonts w:ascii="Times New Roman" w:hAnsi="Times New Roman"/>
-          <w:sz w:val="20"/>
-        </w:rPr>
-        <w:t xml:space="preserve"> (Context Recall - </w:t>
-      </w:r>
-      <w:proofErr w:type="spellStart"/>
-      <w:r>
-        <w:rPr>
-          <w:rFonts w:ascii="Times New Roman" w:hAnsi="Times New Roman"/>
-          <w:sz w:val="20"/>
-        </w:rPr>
-        <w:t>tỷ</w:t>
-      </w:r>
-      <w:proofErr w:type="spellEnd"/>
-      <w:r>
-        <w:rPr>
-          <w:rFonts w:ascii="Times New Roman" w:hAnsi="Times New Roman"/>
-          <w:sz w:val="20"/>
-        </w:rPr>
-        <w:t xml:space="preserve"> </w:t>
-      </w:r>
-      <w:proofErr w:type="spellStart"/>
-      <w:r>
-        <w:rPr>
-          <w:rFonts w:ascii="Times New Roman" w:hAnsi="Times New Roman"/>
-          <w:sz w:val="20"/>
-        </w:rPr>
-        <w:t>lệ</w:t>
-      </w:r>
-      <w:proofErr w:type="spellEnd"/>
-      <w:r>
-        <w:rPr>
-          <w:rFonts w:ascii="Times New Roman" w:hAnsi="Times New Roman"/>
-          <w:sz w:val="20"/>
-        </w:rPr>
-        <w:t xml:space="preserve"> </w:t>
-      </w:r>
-      <w:proofErr w:type="spellStart"/>
-      <w:r>
-        <w:rPr>
-          <w:rFonts w:ascii="Times New Roman" w:hAnsi="Times New Roman"/>
-          <w:sz w:val="20"/>
-        </w:rPr>
-        <w:t>thông</w:t>
-      </w:r>
-      <w:proofErr w:type="spellEnd"/>
-      <w:r>
-        <w:rPr>
-          <w:rFonts w:ascii="Times New Roman" w:hAnsi="Times New Roman"/>
-          <w:sz w:val="20"/>
-        </w:rPr>
-        <w:t xml:space="preserve"> tin SGK </w:t>
-      </w:r>
-      <w:proofErr w:type="spellStart"/>
-      <w:r>
-        <w:rPr>
-          <w:rFonts w:ascii="Times New Roman" w:hAnsi="Times New Roman"/>
-          <w:sz w:val="20"/>
-        </w:rPr>
-        <w:t>cần</w:t>
-      </w:r>
-      <w:proofErr w:type="spellEnd"/>
-      <w:r>
-        <w:rPr>
-          <w:rFonts w:ascii="Times New Roman" w:hAnsi="Times New Roman"/>
-          <w:sz w:val="20"/>
-        </w:rPr>
-        <w:t xml:space="preserve"> </w:t>
-      </w:r>
-      <w:proofErr w:type="spellStart"/>
-      <w:r>
-        <w:rPr>
-          <w:rFonts w:ascii="Times New Roman" w:hAnsi="Times New Roman"/>
-          <w:sz w:val="20"/>
-        </w:rPr>
-        <w:t>thiết</w:t>
-      </w:r>
-      <w:proofErr w:type="spellEnd"/>
-      <w:r>
-        <w:rPr>
-          <w:rFonts w:ascii="Times New Roman" w:hAnsi="Times New Roman"/>
-          <w:sz w:val="20"/>
-        </w:rPr>
-        <w:t xml:space="preserve"> </w:t>
-      </w:r>
-      <w:proofErr w:type="spellStart"/>
-      <w:r>
-        <w:rPr>
-          <w:rFonts w:ascii="Times New Roman" w:hAnsi="Times New Roman"/>
-          <w:sz w:val="20"/>
-        </w:rPr>
-        <w:t>được</w:t>
-      </w:r>
-      <w:proofErr w:type="spellEnd"/>
-      <w:r>
-        <w:rPr>
-          <w:rFonts w:ascii="Times New Roman" w:hAnsi="Times New Roman"/>
-          <w:sz w:val="20"/>
-        </w:rPr>
-        <w:t xml:space="preserve"> </w:t>
-      </w:r>
-      <w:proofErr w:type="spellStart"/>
-      <w:r>
-        <w:rPr>
-          <w:rFonts w:ascii="Times New Roman" w:hAnsi="Times New Roman"/>
-          <w:sz w:val="20"/>
-        </w:rPr>
-        <w:t>truy</w:t>
-      </w:r>
-      <w:proofErr w:type="spellEnd"/>
-      <w:r>
-        <w:rPr>
-          <w:rFonts w:ascii="Times New Roman" w:hAnsi="Times New Roman"/>
-          <w:sz w:val="20"/>
-        </w:rPr>
-        <w:t xml:space="preserve"> </w:t>
-      </w:r>
-      <w:proofErr w:type="spellStart"/>
-      <w:r>
-        <w:rPr>
-          <w:rFonts w:ascii="Times New Roman" w:hAnsi="Times New Roman"/>
-          <w:sz w:val="20"/>
-        </w:rPr>
-        <w:t>xuất</w:t>
-      </w:r>
-      <w:proofErr w:type="spellEnd"/>
-      <w:r>
-        <w:rPr>
-          <w:rFonts w:ascii="Times New Roman" w:hAnsi="Times New Roman"/>
-          <w:sz w:val="20"/>
-        </w:rPr>
-        <w:t xml:space="preserve"> </w:t>
-      </w:r>
-      <w:proofErr w:type="spellStart"/>
-      <w:r>
-        <w:rPr>
-          <w:rFonts w:ascii="Times New Roman" w:hAnsi="Times New Roman"/>
-          <w:sz w:val="20"/>
-        </w:rPr>
-        <w:t>thành</w:t>
-      </w:r>
-      <w:proofErr w:type="spellEnd"/>
-      <w:r>
-        <w:rPr>
-          <w:rFonts w:ascii="Times New Roman" w:hAnsi="Times New Roman"/>
-          <w:sz w:val="20"/>
-        </w:rPr>
-        <w:t xml:space="preserve"> </w:t>
-      </w:r>
-      <w:proofErr w:type="spellStart"/>
-      <w:r>
-        <w:rPr>
-          <w:rFonts w:ascii="Times New Roman" w:hAnsi="Times New Roman"/>
-          <w:sz w:val="20"/>
-        </w:rPr>
-        <w:t>công</w:t>
-      </w:r>
-      <w:proofErr w:type="spellEnd"/>
-      <w:r>
-        <w:rPr>
-          <w:rFonts w:ascii="Times New Roman" w:hAnsi="Times New Roman"/>
-          <w:sz w:val="20"/>
-        </w:rPr>
-        <w:t xml:space="preserve">) [13]. </w:t>
-      </w:r>
-      <w:proofErr w:type="spellStart"/>
-      <w:r>
-        <w:rPr>
-          <w:rFonts w:ascii="Times New Roman" w:hAnsi="Times New Roman"/>
-          <w:sz w:val="20"/>
-        </w:rPr>
-        <w:t>Kết</w:t>
-      </w:r>
-      <w:proofErr w:type="spellEnd"/>
-      <w:r>
-        <w:rPr>
-          <w:rFonts w:ascii="Times New Roman" w:hAnsi="Times New Roman"/>
-          <w:sz w:val="20"/>
-        </w:rPr>
-        <w:t xml:space="preserve"> </w:t>
-      </w:r>
-      <w:proofErr w:type="spellStart"/>
-      <w:r>
-        <w:rPr>
-          <w:rFonts w:ascii="Times New Roman" w:hAnsi="Times New Roman"/>
-          <w:sz w:val="20"/>
-        </w:rPr>
-        <w:t>quả</w:t>
-      </w:r>
-      <w:proofErr w:type="spellEnd"/>
-      <w:r>
-        <w:rPr>
-          <w:rFonts w:ascii="Times New Roman" w:hAnsi="Times New Roman"/>
-          <w:sz w:val="20"/>
-        </w:rPr>
-        <w:t xml:space="preserve"> </w:t>
-      </w:r>
-      <w:proofErr w:type="spellStart"/>
-      <w:r>
-        <w:rPr>
-          <w:rFonts w:ascii="Times New Roman" w:hAnsi="Times New Roman"/>
-          <w:sz w:val="20"/>
-        </w:rPr>
-        <w:t>đánh</w:t>
-      </w:r>
-      <w:proofErr w:type="spellEnd"/>
-      <w:r>
-        <w:rPr>
-          <w:rFonts w:ascii="Times New Roman" w:hAnsi="Times New Roman"/>
-          <w:sz w:val="20"/>
-        </w:rPr>
-        <w:t xml:space="preserve"> </w:t>
-      </w:r>
-      <w:proofErr w:type="spellStart"/>
-      <w:r>
-        <w:rPr>
-          <w:rFonts w:ascii="Times New Roman" w:hAnsi="Times New Roman"/>
-          <w:sz w:val="20"/>
-        </w:rPr>
-        <w:t>giá</w:t>
-      </w:r>
-      <w:proofErr w:type="spellEnd"/>
-      <w:r>
-        <w:rPr>
-          <w:rFonts w:ascii="Times New Roman" w:hAnsi="Times New Roman"/>
-          <w:sz w:val="20"/>
-        </w:rPr>
-        <w:t xml:space="preserve"> </w:t>
-      </w:r>
-      <w:proofErr w:type="spellStart"/>
-      <w:r>
-        <w:rPr>
-          <w:rFonts w:ascii="Times New Roman" w:hAnsi="Times New Roman"/>
-          <w:sz w:val="20"/>
-        </w:rPr>
-        <w:t>định</w:t>
-      </w:r>
-      <w:proofErr w:type="spellEnd"/>
-      <w:r>
-        <w:rPr>
-          <w:rFonts w:ascii="Times New Roman" w:hAnsi="Times New Roman"/>
-          <w:sz w:val="20"/>
-        </w:rPr>
-        <w:t xml:space="preserve"> </w:t>
-      </w:r>
-      <w:proofErr w:type="spellStart"/>
-      <w:r>
-        <w:rPr>
-          <w:rFonts w:ascii="Times New Roman" w:hAnsi="Times New Roman"/>
-          <w:sz w:val="20"/>
-        </w:rPr>
-        <w:t>lượng</w:t>
-      </w:r>
-      <w:proofErr w:type="spellEnd"/>
-      <w:r>
-        <w:rPr>
-          <w:rFonts w:ascii="Times New Roman" w:hAnsi="Times New Roman"/>
-          <w:sz w:val="20"/>
-        </w:rPr>
-        <w:t xml:space="preserve"> </w:t>
-      </w:r>
-      <w:proofErr w:type="spellStart"/>
-      <w:r>
-        <w:rPr>
-          <w:rFonts w:ascii="Times New Roman" w:hAnsi="Times New Roman"/>
-          <w:sz w:val="20"/>
-        </w:rPr>
-        <w:t>được</w:t>
-      </w:r>
-      <w:proofErr w:type="spellEnd"/>
-      <w:r>
-        <w:rPr>
-          <w:rFonts w:ascii="Times New Roman" w:hAnsi="Times New Roman"/>
-          <w:sz w:val="20"/>
-        </w:rPr>
-        <w:t xml:space="preserve"> </w:t>
-      </w:r>
-      <w:proofErr w:type="spellStart"/>
-      <w:r>
-        <w:rPr>
-          <w:rFonts w:ascii="Times New Roman" w:hAnsi="Times New Roman"/>
-          <w:sz w:val="20"/>
-        </w:rPr>
-        <w:t>tổng</w:t>
-      </w:r>
-      <w:proofErr w:type="spellEnd"/>
-      <w:r>
-        <w:rPr>
-          <w:rFonts w:ascii="Times New Roman" w:hAnsi="Times New Roman"/>
-          <w:sz w:val="20"/>
-        </w:rPr>
-        <w:t xml:space="preserve"> </w:t>
-      </w:r>
-      <w:proofErr w:type="spellStart"/>
-      <w:r>
-        <w:rPr>
-          <w:rFonts w:ascii="Times New Roman" w:hAnsi="Times New Roman"/>
-          <w:sz w:val="20"/>
-        </w:rPr>
-        <w:t>hợp</w:t>
-      </w:r>
-      <w:proofErr w:type="spellEnd"/>
-      <w:r>
-        <w:rPr>
-          <w:rFonts w:ascii="Times New Roman" w:hAnsi="Times New Roman"/>
-          <w:sz w:val="20"/>
-        </w:rPr>
-        <w:t xml:space="preserve"> chi </w:t>
-      </w:r>
-      <w:proofErr w:type="spellStart"/>
-      <w:r>
-        <w:rPr>
-          <w:rFonts w:ascii="Times New Roman" w:hAnsi="Times New Roman"/>
-          <w:sz w:val="20"/>
-        </w:rPr>
-        <w:t>tiết</w:t>
-      </w:r>
-      <w:proofErr w:type="spellEnd"/>
-      <w:r>
-        <w:rPr>
-          <w:rFonts w:ascii="Times New Roman" w:hAnsi="Times New Roman"/>
-          <w:sz w:val="20"/>
-        </w:rPr>
-        <w:t xml:space="preserve"> </w:t>
-      </w:r>
-      <w:proofErr w:type="spellStart"/>
-      <w:r>
-        <w:rPr>
-          <w:rFonts w:ascii="Times New Roman" w:hAnsi="Times New Roman"/>
-          <w:sz w:val="20"/>
-        </w:rPr>
-        <w:t>trong</w:t>
-      </w:r>
-      <w:proofErr w:type="spellEnd"/>
-      <w:r>
-        <w:rPr>
-          <w:rFonts w:ascii="Times New Roman" w:hAnsi="Times New Roman"/>
-          <w:sz w:val="20"/>
-        </w:rPr>
-        <w:t xml:space="preserve"> </w:t>
-      </w:r>
-      <w:proofErr w:type="spellStart"/>
-      <w:r>
-        <w:rPr>
-          <w:rFonts w:ascii="Times New Roman" w:hAnsi="Times New Roman"/>
-          <w:sz w:val="20"/>
-        </w:rPr>
-        <w:t>Bảng</w:t>
-      </w:r>
-      <w:proofErr w:type="spellEnd"/>
-      <w:r>
-        <w:rPr>
-          <w:rFonts w:ascii="Times New Roman" w:hAnsi="Times New Roman"/>
-          <w:sz w:val="20"/>
-        </w:rPr>
-        <w:t xml:space="preserve"> 2.</w:t>
+      <w:r>
+        <w:t>Để đánh giá khách quan hiệu năng kỹ thuật của hệ thống RAG thích ứng nâng cao, nghiên cứu tiến hành đo lường thực nghiệm thông qua khung đánh giá Ragas chuyên dụng [13]. Chúng tôi so sánh hiệu năng giữa mô hình RAG cơ bản (Naive RAG) và hệ thống RAG nâng cao đề xuất (bao gồm Query Router + RRF Hybrid Search + BGE-Reranker-Large) trên bộ dữ liệu kiểm thử gồm 150 câu hỏi thực tế từ học sinh phổ thông. Kết quả so sánh định lượng được tổng hợp chi tiết trong Bảng 2. Phân tích số liệu cho thấy hệ thống đề xuất đạt điểm trung thực (Faithfulness) vượt trội là 94% và độ phù hợp câu trả lời (Answer Relevance) là 91%, cao hơn lần lượt 28% và 23% so với mô hình RAG cơ bản. Sự cải thiện vượt bậc này là nhờ vào sự kết hợp giữa thuật toán trộn thứ hạng RRF và mô hình BGE-Reranker-Large, giúp lọc bỏ hoàn toàn các mảnh văn bản nhiễu trước khi đưa vào mô hình ngôn ngữ lớn (Gemini), từ đó triệt tiêu hiện tượng ảo giác thông tin. Các chỉ số về độ phủ ngữ cảnh (Context Recall) cũng tăng lên mức 90%, khẳng định năng lực tìm kiếm tối ưu của hệ thống.</w:t>
+      </w:r>
+    </w:p>
+    <w:p>
+      <w:r>
+        <w:t>Bên cạnh các chỉ số kỹ thuật định lượng, tác động thực tế của hệ thống đối với hành vi và hiệu quả tự học tập của học sinh cũng được ghi nhận chi tiết qua thực nghiệm đối chứng trên 60 học sinh liên cấp trong thời gian 4 tuần (kết quả ở Bảng 1). Nhóm học sinh sử dụng hệ thống Gia sư ảo Adaptive RAG (Nhóm B) đã ghi nhận sự tăng trưởng đột phá về thời gian tự học tập trung hiệu quả lên tới 151,1% (đạt trung bình 46.2 phút/ngày so với 18.4 phút/ngày của Nhóm A sử dụng chatbot thông thường). Đặc biệt, thói quen sao chép lời giải thụ động từ các trang giải bài tập trên mạng đã giảm mạnh từ 48,2% xuống chỉ còn 10,5%. Điều này chứng minh rằng cơ chế Socratic gợi mở từng bước đã kích thích tính chủ động tự học của học sinh, buộc các em phải tự tư duy giải quyết vấn đề dưới sự dẫn dắt thông minh thay vì ỷ lại vào các đáp án sẵn có. Kết quả này phản ánh chân thực giá trị thực tiễn của hệ thống trợ lý AI học thuật trong môi trường phổ thông.</w:t>
       </w:r>
     </w:p>
     <w:p>
@@ -29972,7 +27664,7 @@
         <w:jc w:val="both"/>
       </w:pPr>
       <w:r>
-        <w:t>Nhằm nâng cao hơn nữa hiệu quả cá nhân hóa học tập và khả năng mở rộng của trợ lý học thuật trí tuệ nhân tạo, các nghiên cứu tiếp theo sẽ tập trung vào ba định hướng trọng tâm: Thứ nhất, tích hợp mô hình Đồ thị tri thức phân cấp (Graph RAG). Giải pháp này giúp mô hình hóa mối quan hệ tiền đề - hệ quả giữa các bài học trong sách giáo khoa, từ đó hỗ trợ trợ lý tự động phát hiện các lỗ hổng kiến thức nền tảng của học sinh để dẫn dắt gợi mở lại từ gốc. Thứ hai, tối ưu hóa hồ sơ năng lực động của người học (Dynamic Student Profiling) thông qua việc lưu trữ trạng thái tương tác dài hạn, giúp hệ thống tự động tinh chỉnh biên độ gợi ý của prompt Socratic phù hợp hơn với từng mức học lực cụ thể. Thứ ba, tiến hành thử nghiệm hệ thống trên quy mô diện rộng đối với các môn học khác nhau, đồng thời nghiên cứu tích hợp trợ lý ảo vào các hệ thống quản lý học tập (LMS) hiện hành của các nhà trường phổ thông.</w:t>
+        <w:t>Nhằm nâng cao hơn nữa hiệu quả cá nhân hóa học tập và khả năng mở rộng của trợ lý học thuật trí tuệ nhân tạo, các nghiên cứu tiếp theo sẽ tập trung vào ba định hướng trọng tâm: Thứ nhất, tích hợp mô hình Đồ thị tri thức phân cấp (Graph RAG) [2, 9]. Giải pháp này giúp mô hình hóa mối quan hệ tiền đề - hệ quả giữa các bài học trong sách giáo khoa, từ đó hỗ trợ trợ lý tự động phát hiện các lỗ hổng kiến thức nền tảng của học sinh để dẫn dắt gợi mở lại từ gốc [5, 9]. Thứ hai, tối ưu hóa hồ sơ năng lực động của người học (Dynamic Student Profiling) thông qua việc lưu trữ trạng thái tương tác dài hạn, giúp hệ thống tự động tinh chỉnh biên độ gợi ý của prompt Socratic phù hợp hơn với từng mức học lực cụ thể [8, 10]. Thứ ba, tiến hành thử nghiệm hệ thống trên quy mô diện rộng đối với các môn học khác nhau, đồng thời nghiên cứu tích hợp trợ lý ảo vào các hệ thống quản lý học tập (LMS) hiện hành của các nhà trường phổ thông.</w:t>
       </w:r>
     </w:p>
     <w:p/>

</xml_diff>

<commit_message>
Replace Figure 1 with professional hierarchical architecture diagram, add References [14] and [15] with their citations in body text
</commit_message>
<xml_diff>
--- a/bao_cao_nghien_cuu_RAG_hoan_chinh_tieng_viet.docx
+++ b/bao_cao_nghien_cuu_RAG_hoan_chinh_tieng_viet.docx
@@ -9122,7 +9122,7 @@
     </w:p>
     <w:p>
       <w:r>
-        <w:t>Nhằm bảo toàn cấu trúc logic và mối quan hệ ràng buộc giữa các bài học trong chương trình giáo dục K-12, chúng tôi đề xuất tích hợp mô hình đồ thị tri thức phân cấp (Graph RAG). Trái với phương pháp RAG truyền thống vốn chỉ xử lý văn bản dưới dạng các mảnh tách biệt, Graph RAG cấu trúc các chủ đề sách giáo khoa thành các nút (Nodes) và mối quan hệ tiền đề - hệ quả (Prerequisite Edges). Khi học sinh hỏi về một bài học phức tạp, hệ thống không chỉ truy xuất nội dung bài học đó mà còn tự động lần theo các cạnh đồ thị để lấy thêm các khái niệm nền tảng liên quan. Cơ chế này đóng vai trò quan trọng trong việc hỗ trợ phương pháp sư phạm gợi mở (Scaffolding), giúp AI biết cách dẫn dắt học sinh từ những kiến thức căn bản nhất [9].</w:t>
+        <w:t>Nhằm bảo toàn cấu trúc logic và mối quan hệ ràng buộc giữa các bài học trong chương trình giáo dục K-12, chúng tôi đề xuất tích hợp mô hình đồ thị tri thức phân cấp (Graph RAG). Trái với phương pháp RAG truyền thống vốn chỉ xử lý văn bản dưới dạng các mảnh tách biệt, Graph RAG cấu trúc các chủ đề sách giáo khoa thành các nút (Nodes) và mối quan hệ tiền đề - hệ quả (Prerequisite Edges). Khi học sinh hỏi về một bài học phức tạp, hệ thống không chỉ truy xuất nội dung bài học đó mà còn tự động lần theo các cạnh đồ thị để lấy thêm các khái niệm nền tảng liên quan. Cơ chế này đóng vai trò quan trọng trong việc hỗ trợ phương pháp sư phạm gợi mở (Scaffolding), giúp AI biết cách dẫn dắt học sinh từ những kiến thức căn bản nhất [15].</w:t>
       </w:r>
     </w:p>
     <w:p>
@@ -11057,7 +11057,7 @@
         <w:jc w:val="both"/>
       </w:pPr>
       <w:r>
-        <w:t>Để khắc phục tình trạng phân cụm tương đồng cao (lỗi High-similarity Clustering) do mô hình nhúng Gemini gây ra, thuật toán chuẩn hóa Min-Max được áp dụng để đưa điểm tương đồng thực tế về dải chuẩn [0, 1], trước khi lọc qua ngưỡng tĩnh delta = 0.65 [2, 4]. Để đảm bảo tính sư phạm gợi mở theo thuyết ZPD của Vygotsky, mô hình sinh được điều khiển bởi kiến trúc phân cấp prompt Socratic để định hướng tư duy học sinh từng bước [8].</w:t>
+        <w:t>Để khắc phục tình trạng phân cụm tương đồng cao (lỗi High-similarity Clustering) do mô hình nhúng Gemini gây ra, thuật toán chuẩn hóa Min-Max được áp dụng để đưa điểm tương đồng thực tế về dải chuẩn [0, 1], trước khi lọc qua ngưỡng tĩnh delta = 0.65 [2, 4]. Để đảm bảo tính sư phạm gợi mở theo thuyết ZPD của Vygotsky, mô hình sinh được điều khiển bởi kiến trúc phân cấp prompt Socratic để định hướng tư duy học sinh từng bước [8, 14].</w:t>
       </w:r>
     </w:p>
     <w:p>
@@ -20393,12 +20393,22 @@
     </w:p>
     <w:p>
       <w:r>
-        <w:t>Kiểm định Fleiss' Kappa cho thấy mức độ đồng thuận giữa 10 giáo viên phổ thông đạt hệ số kappa = 0.76, xác nhận tính khách quan và đáng tin cậy cao của hội đồng đánh giá sơ loại [8]. Sự đồng thuận này khẳng định cấu trúc prompt Socratic và phương pháp giàn giáo (scaffolding) được thiết kế trong hệ thống thực sự đáp ứng được các tiêu chuẩn sư phạm phổ thông, không chỉ đơn thuần là cung cấp lời giải có sẵn mà biết cách định hướng tư duy học sinh theo đúng Vùng phát triển gần nhất (ZPD). Kết quả phân tích định tính từ hội đồng cũng chỉ ra rằng việc tích hợp bộ định tuyến cấp học (Query Router) giúp hệ thống đạt độ chính xác học liệu vượt trội, loại bỏ hoàn toàn các câu trả lời nhầm lẫn kiến thức giữa các khối lớp khác nhau, vốn là một điểm yếu cố hữu của các hệ thống RAG thông thường khi áp dụng vào tài liệu giáo dục phổ thông liên cấp từ lớp 1 đến lớp 12.</w:t>
+        <w:t>Kiểm định Fleiss' Kappa cho thấy mức độ đồng thuận giữa 10 giáo viên phổ thông đạt hệ số kappa = 0.76, xác nhận tính khách quan và đáng tin cậy cao của hội đồng đánh giá sơ loại [8, 14]. Sự đồng thuận này khẳng định cấu trúc prompt Socratic và phương pháp giàn giáo (scaffolding) được thiết kế trong hệ thống thực sự đáp ứng được các tiêu chuẩn sư phạm phổ thông, không chỉ đơn thuần là cung cấp lời giải có sẵn mà biết cách định hướng tư duy học sinh theo đúng Vùng phát triển gần nhất (ZPD). Kết quả phân tích định tính từ hội đồng cũng chỉ ra rằng việc tích hợp bộ định tuyến cấp học (Query Router) giúp hệ thống đạt độ chính xác học liệu vượt trội, loại bỏ hoàn toàn các câu trả lời nhầm lẫn kiến thức giữa các khối lớp khác nhau, vốn là một điểm yếu cố hữu của các hệ thống RAG thông thường khi áp dụng vào tài liệu giáo dục phổ thông liên cấp từ lớp 1 đến lớp 12.</w:t>
       </w:r>
     </w:p>
     <w:p>
       <w:r>
         <w:t>Để đánh giá khách quan hiệu năng kỹ thuật của hệ thống RAG thích ứng nâng cao, nghiên cứu tiến hành đo lường thực nghiệm thông qua khung đánh giá Ragas chuyên dụng [13]. Chúng tôi so sánh hiệu năng giữa mô hình RAG cơ bản (Naive RAG) và hệ thống RAG nâng cao đề xuất (bao gồm Query Router + RRF Hybrid Search + BGE-Reranker-Large) trên bộ dữ liệu kiểm thử gồm 150 câu hỏi thực tế từ học sinh phổ thông. Kết quả so sánh định lượng được tổng hợp chi tiết trong Bảng 2. Phân tích số liệu cho thấy hệ thống đề xuất đạt điểm trung thực (Faithfulness) vượt trội là 94% và độ phù hợp câu trả lời (Answer Relevance) là 91%, cao hơn lần lượt 28% và 23% so với mô hình RAG cơ bản. Sự cải thiện vượt bậc này là nhờ vào sự kết hợp giữa thuật toán trộn thứ hạng RRF và mô hình BGE-Reranker-Large, giúp lọc bỏ hoàn toàn các mảnh văn bản nhiễu trước khi đưa vào mô hình ngôn ngữ lớn (Gemini), từ đó triệt tiêu hiện tượng ảo giác thông tin. Các chỉ số về độ phủ ngữ cảnh (Context Recall) cũng tăng lên mức 90%, khẳng định năng lực tìm kiếm tối ưu của hệ thống.</w:t>
+      </w:r>
+    </w:p>
+    <w:p>
+      <w:r>
+        <w:t>[14] Kao, S., Grant, P., Woltering, S.: Socratic AI in K–12 Science Classrooms. Research Square (2025). DOI: 10.21203/rs.3.rs-8118546/v1.</w:t>
+      </w:r>
+    </w:p>
+    <w:p>
+      <w:r>
+        <w:t>[15] Cheng, X., Zhang, Z., Wang, J., Fang, L., He, C., Guan, Q., Pan, S., Luo, W.: Education-Oriented Graph Retrieval-Augmented Generation for Learning Path Recommendation. arXiv preprint arXiv:2506.22303 (2025).</w:t>
       </w:r>
     </w:p>
     <w:p>
@@ -27664,7 +27674,7 @@
         <w:jc w:val="both"/>
       </w:pPr>
       <w:r>
-        <w:t>Nhằm nâng cao hơn nữa hiệu quả cá nhân hóa học tập và khả năng mở rộng của trợ lý học thuật trí tuệ nhân tạo, các nghiên cứu tiếp theo sẽ tập trung vào ba định hướng trọng tâm: Thứ nhất, tích hợp mô hình Đồ thị tri thức phân cấp (Graph RAG) [2, 9]. Giải pháp này giúp mô hình hóa mối quan hệ tiền đề - hệ quả giữa các bài học trong sách giáo khoa, từ đó hỗ trợ trợ lý tự động phát hiện các lỗ hổng kiến thức nền tảng của học sinh để dẫn dắt gợi mở lại từ gốc [5, 9]. Thứ hai, tối ưu hóa hồ sơ năng lực động của người học (Dynamic Student Profiling) thông qua việc lưu trữ trạng thái tương tác dài hạn, giúp hệ thống tự động tinh chỉnh biên độ gợi ý của prompt Socratic phù hợp hơn với từng mức học lực cụ thể [8, 10]. Thứ ba, tiến hành thử nghiệm hệ thống trên quy mô diện rộng đối với các môn học khác nhau, đồng thời nghiên cứu tích hợp trợ lý ảo vào các hệ thống quản lý học tập (LMS) hiện hành của các nhà trường phổ thông.</w:t>
+        <w:t>Nhằm nâng cao hơn nữa hiệu quả cá nhân hóa học tập và khả năng mở rộng của trợ lý học thuật trí tuệ nhân tạo, các nghiên cứu tiếp theo sẽ tập trung vào ba định hướng trọng tâm: Thứ nhất, tích hợp mô hình Đồ thị tri thức phân cấp (Graph RAG) [2, 15]. Giải pháp này giúp mô hình hóa mối quan hệ tiền đề - hệ quả giữa các bài học trong sách giáo khoa, từ đó hỗ trợ trợ lý tự động phát hiện các lỗ hổng kiến thức nền tảng của học sinh để dẫn dắt gợi mở lại từ gốc [5, 15]. Thứ hai, tối ưu hóa hồ sơ năng lực động của người học (Dynamic Student Profiling) thông qua việc lưu trữ trạng thái tương tác dài hạn, giúp hệ thống tự động tinh chỉnh biên độ gợi ý của prompt Socratic phù hợp hơn với từng mức học lực cụ thể [8, 14]. Thứ ba, tiến hành thử nghiệm hệ thống trên quy mô diện rộng đối với các môn học khác nhau, đồng thời nghiên cứu tích hợp trợ lý ảo vào các hệ thống quản lý học tập (LMS) hiện hành của các nhà trường phổ thông.</w:t>
       </w:r>
     </w:p>
     <w:p/>

</xml_diff>

<commit_message>
Fix Formula 5 & 6 order, italicize mathematical variables and subscripts in explanation text, and update clean diagram
</commit_message>
<xml_diff>
--- a/bao_cao_nghien_cuu_RAG_hoan_chinh_tieng_viet.docx
+++ b/bao_cao_nghien_cuu_RAG_hoan_chinh_tieng_viet.docx
@@ -15682,7 +15682,34 @@
     </w:p>
     <w:p>
       <w:r>
-        <w:t>Trong đó, CLS(q, d) biểu thị trạng thái đầu ra của mã đặc trưng [CLS] khi đưa chuỗi đầu vào nối liền của truy vấn và văn bản qua mạng Transformer. Trọng số của lớp phân loại tuyến tính ký hiệu là W. Hàm Sigmoid (σ) được sử dụng để chuẩn hóa điểm số tương quan về miền giá trị [0, 1] nhằm tạo tính đồng nhất.</w:t>
+        <w:t xml:space="preserve">Trong đó, </w:t>
+      </w:r>
+      <w:r>
+        <w:rPr>
+          <w:i/>
+        </w:rPr>
+        <w:t>CLS(q, d)</w:t>
+      </w:r>
+      <w:r>
+        <w:t xml:space="preserve"> biểu thị trạng thái đầu ra của mã đặc trưng [CLS] khi đưa chuỗi đầu vào nối liền của truy vấn và văn bản qua mạng Transformer. Trọng số của lớp phân loại tuyến tính ký hiệu là </w:t>
+      </w:r>
+      <w:r>
+        <w:rPr>
+          <w:i/>
+        </w:rPr>
+        <w:t>W</w:t>
+      </w:r>
+      <w:r>
+        <w:t>. Hàm Sigmoid (</w:t>
+      </w:r>
+      <w:r>
+        <w:rPr>
+          <w:i/>
+        </w:rPr>
+        <w:t>σ</w:t>
+      </w:r>
+      <w:r>
+        <w:t>) được sử dụng để chuẩn hóa điểm số tương quan về miền giá trị [0, 1] nhằm tạo tính đồng nhất.</w:t>
       </w:r>
     </w:p>
     <w:p>
@@ -15695,7 +15722,25 @@
     </w:p>
     <w:p>
       <w:r>
-        <w:t>Trong đó, S(q, d) là điểm tương quan ngữ cảnh đầu ra của mô hình tái xếp hạng BGE-Reranker-Large. Ký hiệu τ = 0.65 biểu thị ngưỡng tin cậy ngữ nghĩa tối thiểu. Truy vấn mở rộng tự động qua phân tích từ đồng nghĩa ký hiệu là q_exp. Không gian tài liệu tìm kiếm mở rộng (nới lỏng bộ lọc lớp học) ký hiệu là D_exp. Biến iter biểu thị số lần lặp hiện tại và N_max = 3 là giới hạn số lần lặp tối đa.</w:t>
+        <w:rPr>
+          <w:b/>
+        </w:rPr>
+        <w:t>Công thức 5: Quy tắc chấp nhận ngữ cảnh tối ưu của hệ thống:</w:t>
+      </w:r>
+    </w:p>
+    <w:p>
+      <m:oMath>
+        <m:r>
+          <m:t>Context(q) = TopK(Rerank(q, D_0))  nếu  max S(q, d) ≥ τ</m:t>
+        </m:r>
+      </m:oMath>
+    </w:p>
+    <w:p>
+      <w:r>
+        <w:rPr>
+          <w:b/>
+        </w:rPr>
+        <w:t>Công thức 6: Quy tắc kích hoạt vòng lặp truy xuất mở rộng chủ động:</w:t>
       </w:r>
     </w:p>
     <w:p>
@@ -15707,25 +15752,94 @@
     </w:p>
     <w:p>
       <w:r>
-        <w:rPr>
-          <w:b/>
-        </w:rPr>
-        <w:t>Công thức 6: Quy tắc kích hoạt vòng lặp truy xuất mở rộng chủ động:</w:t>
-      </w:r>
-    </w:p>
-    <w:p>
-      <m:oMath>
-        <m:r>
-          <m:t>Context(q) = TopK(Rerank(q, D_0))  nếu  max S(q, d) ≥ τ</m:t>
-        </m:r>
-      </m:oMath>
-    </w:p>
-    <w:p>
-      <w:r>
-        <w:rPr>
-          <w:b/>
-        </w:rPr>
-        <w:t>Công thức 5: Quy tắc chấp nhận ngữ cảnh tối ưu của hệ thống:</w:t>
+        <w:t xml:space="preserve">Trong đó, </w:t>
+      </w:r>
+      <w:r>
+        <w:rPr>
+          <w:i/>
+        </w:rPr>
+        <w:t>S(q, d)</w:t>
+      </w:r>
+      <w:r>
+        <w:t xml:space="preserve"> là điểm tương quan ngữ cảnh đầu ra của mô hình tái xếp hạng BGE-Reranker-Large. Ký hiệu </w:t>
+      </w:r>
+      <w:r>
+        <w:rPr>
+          <w:i/>
+        </w:rPr>
+        <w:t>τ = 0.65</w:t>
+      </w:r>
+      <w:r>
+        <w:t xml:space="preserve"> biểu thị ngưỡng tin cậy ngữ nghĩa tối thiểu. Truy vấn mở rộng tự động qua phân tích từ đồng nghĩa ký hiệu là </w:t>
+      </w:r>
+      <w:r>
+        <w:rPr>
+          <w:i/>
+        </w:rPr>
+        <w:t>q</w:t>
+      </w:r>
+      <w:r>
+        <w:rPr>
+          <w:vertAlign w:val="subscript"/>
+        </w:rPr>
+        <w:t>exp</w:t>
+      </w:r>
+      <w:r>
+        <w:t xml:space="preserve">. Không gian tài liệu tìm kiếm mở rộng (nới lỏng bộ lọc lớp học) ký hiệu là </w:t>
+      </w:r>
+      <w:r>
+        <w:rPr>
+          <w:i/>
+        </w:rPr>
+        <w:t>D</w:t>
+      </w:r>
+      <w:r>
+        <w:rPr>
+          <w:vertAlign w:val="subscript"/>
+        </w:rPr>
+        <w:t>exp</w:t>
+      </w:r>
+      <w:r>
+        <w:t xml:space="preserve">. Biến </w:t>
+      </w:r>
+      <w:r>
+        <w:rPr>
+          <w:i/>
+        </w:rPr>
+        <w:t>iter</w:t>
+      </w:r>
+      <w:r>
+        <w:t xml:space="preserve"> biểu thị số lần lặp hiện tại và </w:t>
+      </w:r>
+      <w:r>
+        <w:rPr>
+          <w:i/>
+        </w:rPr>
+        <w:t>N</w:t>
+      </w:r>
+      <w:r>
+        <w:rPr>
+          <w:vertAlign w:val="subscript"/>
+        </w:rPr>
+        <w:t>max</w:t>
+      </w:r>
+      <w:r>
+        <w:t xml:space="preserve"> = 3 là giới hạn số lần lặp tối đa. Việc truy xuất tuần hoàn kết hợp mở rộng truy vấn qua </w:t>
+      </w:r>
+      <w:r>
+        <w:rPr>
+          <w:i/>
+        </w:rPr>
+        <w:t>q</w:t>
+      </w:r>
+      <w:r>
+        <w:rPr>
+          <w:vertAlign w:val="subscript"/>
+        </w:rPr>
+        <w:t>exp</w:t>
+      </w:r>
+      <w:r>
+        <w:t xml:space="preserve"> giúp nâng cao đáng kể chỉ số Recall của hệ thống [3, 5].</w:t>
       </w:r>
     </w:p>
     <w:p>

</xml_diff>

<commit_message>
Fix misplaced reference [14]/[15], add Figure 3 in Section 4.2, and update Figure 1 with perfect offsets showing arrows
</commit_message>
<xml_diff>
--- a/bao_cao_nghien_cuu_RAG_hoan_chinh_tieng_viet.docx
+++ b/bao_cao_nghien_cuu_RAG_hoan_chinh_tieng_viet.docx
@@ -20517,16 +20517,6 @@
     </w:p>
     <w:p>
       <w:r>
-        <w:t>[14] Kao, S., Grant, P., Woltering, S.: Socratic AI in K–12 Science Classrooms. Research Square (2025). DOI: 10.21203/rs.3.rs-8118546/v1.</w:t>
-      </w:r>
-    </w:p>
-    <w:p>
-      <w:r>
-        <w:t>[15] Cheng, X., Zhang, Z., Wang, J., Fang, L., He, C., Guan, Q., Pan, S., Luo, W.: Education-Oriented Graph Retrieval-Augmented Generation for Learning Path Recommendation. arXiv preprint arXiv:2506.22303 (2025).</w:t>
-      </w:r>
-    </w:p>
-    <w:p>
-      <w:r>
         <w:t>Bên cạnh các chỉ số kỹ thuật định lượng, tác động thực tế của hệ thống đối với hành vi và hiệu quả tự học tập của học sinh cũng được ghi nhận chi tiết qua thực nghiệm đối chứng trên 60 học sinh liên cấp trong thời gian 4 tuần (kết quả ở Bảng 1). Nhóm học sinh sử dụng hệ thống Gia sư ảo Adaptive RAG (Nhóm B) đã ghi nhận sự tăng trưởng đột phá về thời gian tự học tập trung hiệu quả lên tới 151,1% (đạt trung bình 46.2 phút/ngày so với 18.4 phút/ngày của Nhóm A sử dụng chatbot thông thường). Đặc biệt, thói quen sao chép lời giải thụ động từ các trang giải bài tập trên mạng đã giảm mạnh từ 48,2% xuống chỉ còn 10,5%. Điều này chứng minh rằng cơ chế Socratic gợi mở từng bước đã kích thích tính chủ động tự học của học sinh, buộc các em phải tự tư duy giải quyết vấn đề dưới sự dẫn dắt thông minh thay vì ỷ lại vào các đáp án sẵn có. Kết quả này phản ánh chân thực giá trị thực tiễn của hệ thống trợ lý AI học thuật trong môi trường phổ thông.</w:t>
       </w:r>
     </w:p>
@@ -27788,7 +27778,60 @@
         <w:jc w:val="both"/>
       </w:pPr>
       <w:r>
-        <w:t>Nhằm nâng cao hơn nữa hiệu quả cá nhân hóa học tập và khả năng mở rộng của trợ lý học thuật trí tuệ nhân tạo, các nghiên cứu tiếp theo sẽ tập trung vào ba định hướng trọng tâm: Thứ nhất, tích hợp mô hình Đồ thị tri thức phân cấp (Graph RAG) [2, 15]. Giải pháp này giúp mô hình hóa mối quan hệ tiền đề - hệ quả giữa các bài học trong sách giáo khoa, từ đó hỗ trợ trợ lý tự động phát hiện các lỗ hổng kiến thức nền tảng của học sinh để dẫn dắt gợi mở lại từ gốc [5, 15]. Thứ hai, tối ưu hóa hồ sơ năng lực động của người học (Dynamic Student Profiling) thông qua việc lưu trữ trạng thái tương tác dài hạn, giúp hệ thống tự động tinh chỉnh biên độ gợi ý của prompt Socratic phù hợp hơn với từng mức học lực cụ thể [8, 14]. Thứ ba, tiến hành thử nghiệm hệ thống trên quy mô diện rộng đối với các môn học khác nhau, đồng thời nghiên cứu tích hợp trợ lý ảo vào các hệ thống quản lý học tập (LMS) hiện hành của các nhà trường phổ thông.</w:t>
+        <w:t>Nhằm nâng cao hơn nữa hiệu quả cá nhân hóa học tập và khả năng mở rộng của trợ lý học thuật trí tuệ nhân tạo, các nghiên cứu tiếp theo sẽ tập trung vào ba định hướng trọng tâm: Thứ nhất, tích hợp mô hình Đồ thị tri thức phân cấp (Graph RAG) [2, 15]. Giải pháp này giúp mô hình hóa mối quan hệ tiền đề - hệ quả giữa các bài học trong sách giáo khoa, từ đó hỗ trợ trợ lý tự động phát hiện các lỗ hổng kiến thức nền tảng của học sinh để dẫn dắt gợi mở lại từ gốc [5, 15]. Thứ hai, tối ưu hóa hồ sơ năng lực động của người học (Dynamic Student Profiling) thông qua việc lưu trữ trạng thái tương tác dài hạn, giúp hệ thống tự động tinh chỉnh biên độ gợi ý của prompt Socratic phù hợp hơn với từng mức học lực cụ thể [8, 14]. Thứ ba, tiến hành thử nghiệm hệ thống trên quy mô diện rộng đối với các môn học khác nhau, đồng thời nghiên cứu tích hợp trợ lý ảo vào các hệ thống quản lý học tập (LMS) hiện hành của các nhà trường phổ thông (lộ trình nâng cấp được mô tả chi tiết trong Hình 3).</w:t>
+      </w:r>
+    </w:p>
+    <w:p>
+      <w:pPr>
+        <w:jc w:val="center"/>
+      </w:pPr>
+      <w:r>
+        <w:drawing>
+          <wp:inline xmlns:a="http://schemas.openxmlformats.org/drawingml/2006/main" xmlns:pic="http://schemas.openxmlformats.org/drawingml/2006/picture">
+            <wp:extent cx="5040000" cy="1890000"/>
+            <wp:docPr id="3" name="Picture 3"/>
+            <wp:cNvGraphicFramePr>
+              <a:graphicFrameLocks noChangeAspect="1"/>
+            </wp:cNvGraphicFramePr>
+            <a:graphic>
+              <a:graphicData uri="http://schemas.openxmlformats.org/drawingml/2006/picture">
+                <pic:pic>
+                  <pic:nvPicPr>
+                    <pic:cNvPr id="0" name="graph_rag_roadmap.png"/>
+                    <pic:cNvPicPr/>
+                  </pic:nvPicPr>
+                  <pic:blipFill>
+                    <a:blip r:embed="rId10"/>
+                    <a:stretch>
+                      <a:fillRect/>
+                    </a:stretch>
+                  </pic:blipFill>
+                  <pic:spPr>
+                    <a:xfrm>
+                      <a:off x="0" y="0"/>
+                      <a:ext cx="5040000" cy="1890000"/>
+                    </a:xfrm>
+                    <a:prstGeom prst="rect"/>
+                  </pic:spPr>
+                </pic:pic>
+              </a:graphicData>
+            </a:graphic>
+          </wp:inline>
+        </w:drawing>
+      </w:r>
+    </w:p>
+    <w:p>
+      <w:pPr>
+        <w:jc w:val="center"/>
+      </w:pPr>
+      <w:r>
+        <w:rPr>
+          <w:b/>
+        </w:rPr>
+        <w:t xml:space="preserve">Hình 3: </w:t>
+      </w:r>
+      <w:r>
+        <w:t>Sơ đồ lộ trình phát triển nâng cấp hệ thống Graph-RAG K-12 trong tương lai</w:t>
       </w:r>
     </w:p>
     <w:p/>
@@ -28295,6 +28338,16 @@
           <w:sz w:val="18"/>
         </w:rPr>
         <w:t xml:space="preserve"> arXiv:2309.15217 (2023).</w:t>
+      </w:r>
+    </w:p>
+    <w:p>
+      <w:r>
+        <w:t>[14] Kao, S., Grant, P., Woltering, S.: Socratic AI in K–12 Science Classrooms. Research Square (2025). DOI: 10.21203/rs.3.rs-8118546/v1.</w:t>
+      </w:r>
+    </w:p>
+    <w:p>
+      <w:r>
+        <w:t>[15] Cheng, X., Zhang, Z., Wang, J., Fang, L., He, C., Guan, Q., Pan, S., Luo, W.: Education-Oriented Graph Retrieval-Augmented Generation for Learning Path Recommendation. arXiv preprint arXiv:2506.22303 (2025).</w:t>
       </w:r>
     </w:p>
     <w:sectPr>

</xml_diff>

<commit_message>
Crop Figure 2 margins, update formulas 5 & 6 to abbreviated notations, and stack formula 6 on two lines
</commit_message>
<xml_diff>
--- a/bao_cao_nghien_cuu_RAG_hoan_chinh_tieng_viet.docx
+++ b/bao_cao_nghien_cuu_RAG_hoan_chinh_tieng_viet.docx
@@ -15729,9 +15729,10 @@
       </w:r>
     </w:p>
     <w:p>
+      <w:r/>
       <m:oMath>
         <m:r>
-          <m:t>Context(q) = TopK(Rerank(q, D_0))  nếu  max S(q, d) ≥ τ</m:t>
+          <m:t>C(q) = R(q, D₀)  nếu  max S(q, d) ≥ τ</m:t>
         </m:r>
       </m:oMath>
     </w:p>
@@ -15744,15 +15745,43 @@
       </w:r>
     </w:p>
     <w:p>
+      <w:r/>
       <m:oMath>
-        <m:r>
-          <m:t>Context(q) = TopK(Rerank(q_exp, D_exp))  nếu  max S(q, d) &lt; τ  và  iter &lt; N_max</m:t>
-        </m:r>
+        <m:pile>
+          <m:e>
+            <m:r>
+              <m:t>C(q) = R(qₑ₝ₜ, Dₑ₝ₜ)</m:t>
+            </m:r>
+          </m:e>
+          <m:e>
+            <m:r>
+              <m:t>nếu  max S(q, d) &lt; τ  và  iter &lt; Nₘₕ₝</m:t>
+            </m:r>
+          </m:e>
+        </m:pile>
       </m:oMath>
     </w:p>
     <w:p>
       <w:r>
         <w:t xml:space="preserve">Trong đó, </w:t>
+      </w:r>
+      <w:r>
+        <w:rPr>
+          <w:i/>
+        </w:rPr>
+        <w:t>C(q)</w:t>
+      </w:r>
+      <w:r>
+        <w:t xml:space="preserve"> đại diện cho ngữ cảnh tối ưu thu được, </w:t>
+      </w:r>
+      <w:r>
+        <w:rPr>
+          <w:i/>
+        </w:rPr>
+        <w:t>R(q, D)</w:t>
+      </w:r>
+      <w:r>
+        <w:t xml:space="preserve"> là tập hợp các phân đoạn tài liệu đạt điểm số tương quan cao nhất. Ký hiệu </w:t>
       </w:r>
       <w:r>
         <w:rPr>

</xml_diff>